<commit_message>
report missing changes commit
</commit_message>
<xml_diff>
--- a/doc/Relatorio IIA - G1 Diogo Trigueiros Diogo Madeira.docx
+++ b/doc/Relatorio IIA - G1 Diogo Trigueiros Diogo Madeira.docx
@@ -1,6 +1,6 @@
 
 <file path=word/document.xml><?xml version="1.0" encoding="utf-8"?>
-<w:document xmlns:wpc="http://schemas.microsoft.com/office/word/2010/wordprocessingCanvas" xmlns:cx="http://schemas.microsoft.com/office/drawing/2014/chartex" xmlns:cx1="http://schemas.microsoft.com/office/drawing/2015/9/8/chartex" xmlns:mc="http://schemas.openxmlformats.org/markup-compatibility/2006" xmlns:o="urn:schemas-microsoft-com:office:office" xmlns:r="http://schemas.openxmlformats.org/officeDocument/2006/relationships" xmlns:m="http://schemas.openxmlformats.org/officeDocument/2006/math" xmlns:v="urn:schemas-microsoft-com:vml" xmlns:wp14="http://schemas.microsoft.com/office/word/2010/wordprocessingDrawing" xmlns:wp="http://schemas.openxmlformats.org/drawingml/2006/wordprocessingDrawing" xmlns:w10="urn:schemas-microsoft-com:office:word" xmlns:w="http://schemas.openxmlformats.org/wordprocessingml/2006/main" xmlns:w14="http://schemas.microsoft.com/office/word/2010/wordml" xmlns:w15="http://schemas.microsoft.com/office/word/2012/wordml" xmlns:w16se="http://schemas.microsoft.com/office/word/2015/wordml/symex" xmlns:wpg="http://schemas.microsoft.com/office/word/2010/wordprocessingGroup" xmlns:wpi="http://schemas.microsoft.com/office/word/2010/wordprocessingInk" xmlns:wne="http://schemas.microsoft.com/office/word/2006/wordml" xmlns:wps="http://schemas.microsoft.com/office/word/2010/wordprocessingShape" mc:Ignorable="w14 w15 w16se wp14">
+<w:document xmlns:wpc="http://schemas.microsoft.com/office/word/2010/wordprocessingCanvas" xmlns:cx="http://schemas.microsoft.com/office/drawing/2014/chartex" xmlns:cx1="http://schemas.microsoft.com/office/drawing/2015/9/8/chartex" xmlns:cx2="http://schemas.microsoft.com/office/drawing/2015/10/21/chartex" xmlns:cx3="http://schemas.microsoft.com/office/drawing/2016/5/9/chartex" xmlns:cx4="http://schemas.microsoft.com/office/drawing/2016/5/10/chartex" xmlns:cx5="http://schemas.microsoft.com/office/drawing/2016/5/11/chartex" xmlns:cx6="http://schemas.microsoft.com/office/drawing/2016/5/12/chartex" xmlns:cx7="http://schemas.microsoft.com/office/drawing/2016/5/13/chartex" xmlns:cx8="http://schemas.microsoft.com/office/drawing/2016/5/14/chartex" xmlns:mc="http://schemas.openxmlformats.org/markup-compatibility/2006" xmlns:aink="http://schemas.microsoft.com/office/drawing/2016/ink" xmlns:am3d="http://schemas.microsoft.com/office/drawing/2017/model3d" xmlns:o="urn:schemas-microsoft-com:office:office" xmlns:oel="http://schemas.microsoft.com/office/2019/extlst" xmlns:r="http://schemas.openxmlformats.org/officeDocument/2006/relationships" xmlns:m="http://schemas.openxmlformats.org/officeDocument/2006/math" xmlns:v="urn:schemas-microsoft-com:vml" xmlns:wp14="http://schemas.microsoft.com/office/word/2010/wordprocessingDrawing" xmlns:wp="http://schemas.openxmlformats.org/drawingml/2006/wordprocessingDrawing" xmlns:w10="urn:schemas-microsoft-com:office:word" xmlns:w="http://schemas.openxmlformats.org/wordprocessingml/2006/main" xmlns:w14="http://schemas.microsoft.com/office/word/2010/wordml" xmlns:w15="http://schemas.microsoft.com/office/word/2012/wordml" xmlns:w16cex="http://schemas.microsoft.com/office/word/2018/wordml/cex" xmlns:w16cid="http://schemas.microsoft.com/office/word/2016/wordml/cid" xmlns:w16="http://schemas.microsoft.com/office/word/2018/wordml" xmlns:w16du="http://schemas.microsoft.com/office/word/2023/wordml/word16du" xmlns:w16sdtdh="http://schemas.microsoft.com/office/word/2020/wordml/sdtdatahash" xmlns:w16sdtfl="http://schemas.microsoft.com/office/word/2024/wordml/sdtformatlock" xmlns:w16se="http://schemas.microsoft.com/office/word/2015/wordml/symex" xmlns:wpg="http://schemas.microsoft.com/office/word/2010/wordprocessingGroup" xmlns:wpi="http://schemas.microsoft.com/office/word/2010/wordprocessingInk" xmlns:wne="http://schemas.microsoft.com/office/word/2006/wordml" xmlns:wps="http://schemas.microsoft.com/office/word/2010/wordprocessingShape" mc:Ignorable="w14 w15 w16se w16cid w16 w16cex w16sdtdh w16sdtfl w16du wp14">
   <w:body>
     <w:p>
       <w:pPr>
@@ -124,7 +124,19 @@
           <w:lang w:val="pt-PT"/>
         </w:rPr>
         <w:br/>
-        <w:t>Aluno:</w:t>
+        <w:t>Aluno</w:t>
+      </w:r>
+      <w:r>
+        <w:rPr>
+          <w:lang w:val="pt-PT"/>
+        </w:rPr>
+        <w:t>s</w:t>
+      </w:r>
+      <w:r>
+        <w:rPr>
+          <w:lang w:val="pt-PT"/>
+        </w:rPr>
+        <w:t>:</w:t>
       </w:r>
     </w:p>
     <w:p>
@@ -165,6 +177,12 @@
           <w:lang w:val="pt-PT"/>
         </w:rPr>
         <w:t xml:space="preserve"> - </w:t>
+      </w:r>
+      <w:r>
+        <w:rPr>
+          <w:lang w:val="pt-PT"/>
+        </w:rPr>
+        <w:t>220000941</w:t>
       </w:r>
       <w:r>
         <w:rPr>
@@ -217,17 +235,21 @@
       <w:sdtContent>
         <w:p>
           <w:pPr>
-            <w:pStyle w:val="TOCHeading"/>
+            <w:pStyle w:val="Cabealhodondice"/>
+            <w:rPr>
+              <w:lang w:val="pt-PT"/>
+            </w:rPr>
           </w:pPr>
-          <w:proofErr w:type="spellStart"/>
           <w:r>
+            <w:rPr>
+              <w:lang w:val="pt-PT"/>
+            </w:rPr>
             <w:t>Índice</w:t>
           </w:r>
-          <w:proofErr w:type="spellEnd"/>
         </w:p>
         <w:p>
           <w:pPr>
-            <w:pStyle w:val="TOC1"/>
+            <w:pStyle w:val="ndice1"/>
             <w:tabs>
               <w:tab w:val="right" w:leader="dot" w:pos="8630"/>
             </w:tabs>
@@ -248,7 +270,7 @@
           <w:hyperlink w:anchor="_Toc230614774" w:history="1">
             <w:r>
               <w:rPr>
-                <w:rStyle w:val="Hyperlink"/>
+                <w:rStyle w:val="Hiperligao"/>
                 <w:noProof/>
                 <w:lang w:val="pt-PT"/>
               </w:rPr>
@@ -306,7 +328,7 @@
         </w:p>
         <w:p>
           <w:pPr>
-            <w:pStyle w:val="TOC1"/>
+            <w:pStyle w:val="ndice1"/>
             <w:tabs>
               <w:tab w:val="right" w:leader="dot" w:pos="8630"/>
             </w:tabs>
@@ -318,7 +340,7 @@
           <w:hyperlink w:anchor="_Toc230614775" w:history="1">
             <w:r>
               <w:rPr>
-                <w:rStyle w:val="Hyperlink"/>
+                <w:rStyle w:val="Hiperligao"/>
                 <w:noProof/>
                 <w:lang w:val="pt-PT"/>
               </w:rPr>
@@ -376,7 +398,7 @@
         </w:p>
         <w:p>
           <w:pPr>
-            <w:pStyle w:val="TOC1"/>
+            <w:pStyle w:val="ndice1"/>
             <w:tabs>
               <w:tab w:val="right" w:leader="dot" w:pos="8630"/>
             </w:tabs>
@@ -388,7 +410,7 @@
           <w:hyperlink w:anchor="_Toc230614776" w:history="1">
             <w:r>
               <w:rPr>
-                <w:rStyle w:val="Hyperlink"/>
+                <w:rStyle w:val="Hiperligao"/>
                 <w:noProof/>
                 <w:lang w:val="pt-PT"/>
               </w:rPr>
@@ -446,7 +468,7 @@
         </w:p>
         <w:p>
           <w:pPr>
-            <w:pStyle w:val="TOC2"/>
+            <w:pStyle w:val="ndice2"/>
             <w:tabs>
               <w:tab w:val="right" w:leader="dot" w:pos="8630"/>
             </w:tabs>
@@ -458,7 +480,7 @@
           <w:hyperlink w:anchor="_Toc230614777" w:history="1">
             <w:r>
               <w:rPr>
-                <w:rStyle w:val="Hyperlink"/>
+                <w:rStyle w:val="Hiperligao"/>
                 <w:noProof/>
                 <w:lang w:val="pt-PT"/>
               </w:rPr>
@@ -516,7 +538,7 @@
         </w:p>
         <w:p>
           <w:pPr>
-            <w:pStyle w:val="TOC2"/>
+            <w:pStyle w:val="ndice2"/>
             <w:tabs>
               <w:tab w:val="right" w:leader="dot" w:pos="8630"/>
             </w:tabs>
@@ -578,7 +600,7 @@
         </w:p>
         <w:p>
           <w:pPr>
-            <w:pStyle w:val="TOC1"/>
+            <w:pStyle w:val="ndice1"/>
             <w:tabs>
               <w:tab w:val="right" w:leader="dot" w:pos="8630"/>
             </w:tabs>
@@ -590,7 +612,7 @@
           <w:hyperlink w:anchor="_Toc230614779" w:history="1">
             <w:r>
               <w:rPr>
-                <w:rStyle w:val="Hyperlink"/>
+                <w:rStyle w:val="Hiperligao"/>
                 <w:noProof/>
                 <w:lang w:val="pt-PT"/>
               </w:rPr>
@@ -648,7 +670,7 @@
         </w:p>
         <w:p>
           <w:pPr>
-            <w:pStyle w:val="TOC1"/>
+            <w:pStyle w:val="ndice1"/>
             <w:tabs>
               <w:tab w:val="right" w:leader="dot" w:pos="8630"/>
             </w:tabs>
@@ -660,7 +682,7 @@
           <w:hyperlink w:anchor="_Toc230614780" w:history="1">
             <w:r>
               <w:rPr>
-                <w:rStyle w:val="Hyperlink"/>
+                <w:rStyle w:val="Hiperligao"/>
                 <w:noProof/>
                 <w:lang w:val="pt-PT"/>
               </w:rPr>
@@ -740,8 +762,6 @@
         </w:rPr>
         <w:br w:type="page"/>
       </w:r>
-      <w:bookmarkStart w:id="0" w:name="_GoBack"/>
-      <w:bookmarkEnd w:id="0"/>
     </w:p>
     <w:p>
       <w:pPr>
@@ -759,12 +779,12 @@
     </w:p>
     <w:p>
       <w:pPr>
-        <w:pStyle w:val="Heading1"/>
-        <w:rPr>
-          <w:lang w:val="pt-PT"/>
-        </w:rPr>
-      </w:pPr>
-      <w:bookmarkStart w:id="1" w:name="_Toc230614774"/>
+        <w:pStyle w:val="Ttulo1"/>
+        <w:rPr>
+          <w:lang w:val="pt-PT"/>
+        </w:rPr>
+      </w:pPr>
+      <w:bookmarkStart w:id="0" w:name="_Toc230614774"/>
       <w:r>
         <w:rPr>
           <w:lang w:val="pt-PT"/>
@@ -772,7 +792,7 @@
         <w:lastRenderedPageBreak/>
         <w:t>Resumo</w:t>
       </w:r>
-      <w:bookmarkEnd w:id="1"/>
+      <w:bookmarkEnd w:id="0"/>
     </w:p>
     <w:p>
       <w:pPr>
@@ -795,19 +815,19 @@
     </w:p>
     <w:p>
       <w:pPr>
-        <w:pStyle w:val="Heading1"/>
-        <w:rPr>
-          <w:lang w:val="pt-PT"/>
-        </w:rPr>
-      </w:pPr>
-      <w:bookmarkStart w:id="2" w:name="_Toc230614775"/>
+        <w:pStyle w:val="Ttulo1"/>
+        <w:rPr>
+          <w:lang w:val="pt-PT"/>
+        </w:rPr>
+      </w:pPr>
+      <w:bookmarkStart w:id="1" w:name="_Toc230614775"/>
       <w:r>
         <w:rPr>
           <w:lang w:val="pt-PT"/>
         </w:rPr>
         <w:t>Introdução</w:t>
       </w:r>
-      <w:bookmarkEnd w:id="2"/>
+      <w:bookmarkEnd w:id="1"/>
     </w:p>
     <w:p>
       <w:pPr>
@@ -822,15 +842,263 @@
         <w:pStyle w:val="font-claude-response-body"/>
       </w:pPr>
       <w:r>
-        <w:t>O sistema simula um ambiente urbano dinâmico onde desastres ocorrem de forma imprevisível e um veículo de emergência tem de reagir em tempo real. O objetivo é demonstrar co</w:t>
+        <w:t>O sistema simula um ambiente urbano dinâmico onde desastres ocorrem de forma imprevisível e um veículo de emergência tem de reagir em tempo real. O objetivo é demonstrar como diferentes abordagens de IA, desde regras simples até redes neurais.</w:t>
+      </w:r>
+    </w:p>
+    <w:p>
+      <w:pPr>
+        <w:rPr>
+          <w:lang w:val="pt-PT"/>
+        </w:rPr>
+      </w:pPr>
+      <w:r>
+        <w:rPr>
+          <w:lang w:val="pt-PT"/>
+        </w:rPr>
+        <w:t xml:space="preserve"> </w:t>
+      </w:r>
+    </w:p>
+    <w:p>
+      <w:pPr>
+        <w:pStyle w:val="Ttulo1"/>
+        <w:rPr>
+          <w:lang w:val="pt-PT"/>
+        </w:rPr>
+      </w:pPr>
+      <w:bookmarkStart w:id="2" w:name="_Toc230614776"/>
+      <w:r>
+        <w:rPr>
+          <w:lang w:val="pt-PT"/>
+        </w:rPr>
+        <w:t>Materiais e Métodos</w:t>
+      </w:r>
+      <w:bookmarkEnd w:id="2"/>
+    </w:p>
+    <w:p>
+      <w:pPr>
+        <w:rPr>
+          <w:lang w:val="pt-PT"/>
+        </w:rPr>
+      </w:pPr>
+      <w:r>
+        <w:rPr>
+          <w:lang w:val="pt-PT"/>
+        </w:rPr>
+        <w:t xml:space="preserve">A </w:t>
       </w:r>
       <w:r>
-        <w:t>mo diferentes abordagens de IA,</w:t>
+        <w:rPr>
+          <w:rStyle w:val="Forte"/>
+          <w:b w:val="0"/>
+          <w:bCs w:val="0"/>
+          <w:lang w:val="pt-PT"/>
+        </w:rPr>
+        <w:t>l</w:t>
       </w:r>
       <w:r>
-        <w:t xml:space="preserve"> desde regras simples até redes neurais</w:t>
+        <w:rPr>
+          <w:rStyle w:val="Forte"/>
+          <w:b w:val="0"/>
+          <w:bCs w:val="0"/>
+          <w:lang w:val="pt-PT"/>
+        </w:rPr>
+        <w:t>inguagem</w:t>
       </w:r>
       <w:r>
+        <w:rPr>
+          <w:rStyle w:val="Forte"/>
+          <w:lang w:val="pt-PT"/>
+        </w:rPr>
+        <w:t xml:space="preserve"> </w:t>
+      </w:r>
+      <w:r>
+        <w:rPr>
+          <w:rStyle w:val="Forte"/>
+          <w:b w:val="0"/>
+          <w:bCs w:val="0"/>
+          <w:lang w:val="pt-PT"/>
+        </w:rPr>
+        <w:t>e</w:t>
+      </w:r>
+      <w:r>
+        <w:rPr>
+          <w:rStyle w:val="Forte"/>
+          <w:lang w:val="pt-PT"/>
+        </w:rPr>
+        <w:t xml:space="preserve"> </w:t>
+      </w:r>
+      <w:r>
+        <w:rPr>
+          <w:rStyle w:val="Forte"/>
+          <w:b w:val="0"/>
+          <w:bCs w:val="0"/>
+          <w:lang w:val="pt-PT"/>
+        </w:rPr>
+        <w:t>ambiente</w:t>
+      </w:r>
+      <w:r>
+        <w:rPr>
+          <w:lang w:val="pt-PT"/>
+        </w:rPr>
+        <w:t xml:space="preserve"> do</w:t>
+      </w:r>
+      <w:r>
+        <w:rPr>
+          <w:lang w:val="pt-PT"/>
+        </w:rPr>
+        <w:t xml:space="preserve"> projeto foi desenvolvido em Python 3, com recurso a um ambiente virtual para gestão de dependências. </w:t>
+      </w:r>
+    </w:p>
+    <w:p>
+      <w:pPr>
+        <w:rPr>
+          <w:lang w:val="pt-PT"/>
+        </w:rPr>
+      </w:pPr>
+      <w:r>
+        <w:rPr>
+          <w:b/>
+          <w:lang w:val="pt-PT"/>
+        </w:rPr>
+        <w:t>Pygame</w:t>
+      </w:r>
+      <w:r>
+        <w:rPr>
+          <w:b/>
+          <w:lang w:val="pt-PT"/>
+        </w:rPr>
+        <w:t xml:space="preserve">- </w:t>
+      </w:r>
+      <w:r>
+        <w:rPr>
+          <w:lang w:val="pt-PT"/>
+        </w:rPr>
+        <w:t>Visualização gráfica em tempo real da simulação</w:t>
+      </w:r>
+    </w:p>
+    <w:p>
+      <w:pPr>
+        <w:rPr>
+          <w:lang w:val="pt-PT"/>
+        </w:rPr>
+      </w:pPr>
+      <w:r>
+        <w:rPr>
+          <w:b/>
+          <w:lang w:val="pt-PT"/>
+        </w:rPr>
+        <w:t>NumPy</w:t>
+      </w:r>
+      <w:r>
+        <w:rPr>
+          <w:b/>
+          <w:lang w:val="pt-PT"/>
+        </w:rPr>
+        <w:t xml:space="preserve">- </w:t>
+      </w:r>
+      <w:r>
+        <w:rPr>
+          <w:lang w:val="pt-PT"/>
+        </w:rPr>
+        <w:t>Operações numéricas e manipulação de dados</w:t>
+      </w:r>
+    </w:p>
+    <w:p>
+      <w:pPr>
+        <w:rPr>
+          <w:lang w:val="pt-PT"/>
+        </w:rPr>
+      </w:pPr>
+      <w:r>
+        <w:rPr>
+          <w:b/>
+          <w:lang w:val="pt-PT"/>
+        </w:rPr>
+        <w:t>Scikit-learn</w:t>
+      </w:r>
+      <w:r>
+        <w:rPr>
+          <w:lang w:val="pt-PT"/>
+        </w:rPr>
+        <w:t xml:space="preserve">- </w:t>
+      </w:r>
+      <w:r>
+        <w:rPr>
+          <w:lang w:val="pt-PT"/>
+        </w:rPr>
+        <w:t>Modelos de Machine Learning (KMeans, Árvore de Decisão)</w:t>
+      </w:r>
+    </w:p>
+    <w:p>
+      <w:pPr>
+        <w:rPr>
+          <w:lang w:val="pt-PT"/>
+        </w:rPr>
+      </w:pPr>
+      <w:r>
+        <w:rPr>
+          <w:b/>
+          <w:lang w:val="pt-PT"/>
+        </w:rPr>
+        <w:t>PandasGeração</w:t>
+      </w:r>
+      <w:r>
+        <w:rPr>
+          <w:b/>
+          <w:lang w:val="pt-PT"/>
+        </w:rPr>
+        <w:t xml:space="preserve">- </w:t>
+      </w:r>
+      <w:r>
+        <w:rPr>
+          <w:lang w:val="pt-PT"/>
+        </w:rPr>
+        <w:t xml:space="preserve"> e leitura de dados em CSV</w:t>
+      </w:r>
+    </w:p>
+    <w:p>
+      <w:pPr>
+        <w:rPr>
+          <w:lang w:val="pt-PT"/>
+        </w:rPr>
+      </w:pPr>
+      <w:r>
+        <w:rPr>
+          <w:b/>
+          <w:lang w:val="pt-PT"/>
+        </w:rPr>
+        <w:t>PyTorch</w:t>
+      </w:r>
+      <w:r>
+        <w:rPr>
+          <w:b/>
+          <w:lang w:val="pt-PT"/>
+        </w:rPr>
+        <w:t xml:space="preserve">- </w:t>
+      </w:r>
+      <w:r>
+        <w:rPr>
+          <w:lang w:val="pt-PT"/>
+        </w:rPr>
+        <w:t>Definição da rede neural de previsão</w:t>
+      </w:r>
+      <w:r>
+        <w:rPr>
+          <w:lang w:val="pt-PT"/>
+        </w:rPr>
+        <w:t xml:space="preserve"> </w:t>
+      </w:r>
+    </w:p>
+    <w:p>
+      <w:pPr>
+        <w:rPr>
+          <w:lang w:val="pt-PT"/>
+        </w:rPr>
+      </w:pPr>
+      <w:r>
+        <w:rPr>
+          <w:lang w:val="pt-PT"/>
+        </w:rPr>
         <w:t>.</w:t>
       </w:r>
     </w:p>
@@ -840,26 +1108,35 @@
           <w:lang w:val="pt-PT"/>
         </w:rPr>
       </w:pPr>
-      <w:r>
-        <w:rPr>
-          <w:lang w:val="pt-PT"/>
-        </w:rPr>
-        <w:t xml:space="preserve"> </w:t>
-      </w:r>
     </w:p>
     <w:p>
       <w:pPr>
-        <w:pStyle w:val="Heading1"/>
-        <w:rPr>
-          <w:lang w:val="pt-PT"/>
-        </w:rPr>
-      </w:pPr>
-      <w:bookmarkStart w:id="3" w:name="_Toc230614776"/>
+        <w:rPr>
+          <w:lang w:val="pt-PT"/>
+        </w:rPr>
+      </w:pPr>
+    </w:p>
+    <w:p>
+      <w:pPr>
+        <w:rPr>
+          <w:lang w:val="pt-PT"/>
+        </w:rPr>
+      </w:pPr>
+    </w:p>
+    <w:p>
+      <w:pPr>
+        <w:pStyle w:val="Ttulo2"/>
+        <w:rPr>
+          <w:lang w:val="pt-PT"/>
+        </w:rPr>
+      </w:pPr>
+      <w:bookmarkStart w:id="3" w:name="_Toc230614777"/>
       <w:r>
         <w:rPr>
           <w:lang w:val="pt-PT"/>
         </w:rPr>
-        <w:t>Materiais e Métodos</w:t>
+        <w:lastRenderedPageBreak/>
+        <w:t>Estruturação do Projeto</w:t>
       </w:r>
       <w:bookmarkEnd w:id="3"/>
     </w:p>
@@ -873,213 +1150,6 @@
         <w:rPr>
           <w:lang w:val="pt-PT"/>
         </w:rPr>
-        <w:t xml:space="preserve">A </w:t>
-      </w:r>
-      <w:r>
-        <w:rPr>
-          <w:rStyle w:val="Strong"/>
-          <w:lang w:val="pt-PT"/>
-        </w:rPr>
-        <w:t>Linguagem e ambiente</w:t>
-      </w:r>
-      <w:r>
-        <w:rPr>
-          <w:lang w:val="pt-PT"/>
-        </w:rPr>
-        <w:t xml:space="preserve"> do</w:t>
-      </w:r>
-      <w:r>
-        <w:rPr>
-          <w:lang w:val="pt-PT"/>
-        </w:rPr>
-        <w:t xml:space="preserve"> projeto foi desenvolvido em Python 3, com recurso a um ambiente virtual para gestão de dependências.</w:t>
-      </w:r>
-      <w:r>
-        <w:rPr>
-          <w:lang w:val="pt-PT"/>
-        </w:rPr>
-        <w:t xml:space="preserve"> </w:t>
-      </w:r>
-    </w:p>
-    <w:p>
-      <w:pPr>
-        <w:rPr>
-          <w:lang w:val="pt-PT"/>
-        </w:rPr>
-      </w:pPr>
-      <w:r>
-        <w:rPr>
-          <w:b/>
-          <w:lang w:val="pt-PT"/>
-        </w:rPr>
-        <w:t>Pygame</w:t>
-      </w:r>
-      <w:r>
-        <w:rPr>
-          <w:b/>
-          <w:lang w:val="pt-PT"/>
-        </w:rPr>
-        <w:t xml:space="preserve">- </w:t>
-      </w:r>
-      <w:r>
-        <w:rPr>
-          <w:lang w:val="pt-PT"/>
-        </w:rPr>
-        <w:t>Visualização gráfica em tempo real da simulação</w:t>
-      </w:r>
-    </w:p>
-    <w:p>
-      <w:pPr>
-        <w:rPr>
-          <w:lang w:val="pt-PT"/>
-        </w:rPr>
-      </w:pPr>
-      <w:r>
-        <w:rPr>
-          <w:b/>
-          <w:lang w:val="pt-PT"/>
-        </w:rPr>
-        <w:t>NumPy</w:t>
-      </w:r>
-      <w:r>
-        <w:rPr>
-          <w:b/>
-          <w:lang w:val="pt-PT"/>
-        </w:rPr>
-        <w:t xml:space="preserve">- </w:t>
-      </w:r>
-      <w:r>
-        <w:rPr>
-          <w:lang w:val="pt-PT"/>
-        </w:rPr>
-        <w:t>Operações numéricas e manipulação de dados</w:t>
-      </w:r>
-    </w:p>
-    <w:p>
-      <w:pPr>
-        <w:rPr>
-          <w:lang w:val="pt-PT"/>
-        </w:rPr>
-      </w:pPr>
-      <w:r>
-        <w:rPr>
-          <w:b/>
-          <w:lang w:val="pt-PT"/>
-        </w:rPr>
-        <w:t>Scikit-learn</w:t>
-      </w:r>
-      <w:r>
-        <w:rPr>
-          <w:lang w:val="pt-PT"/>
-        </w:rPr>
-        <w:t xml:space="preserve">- </w:t>
-      </w:r>
-      <w:r>
-        <w:rPr>
-          <w:lang w:val="pt-PT"/>
-        </w:rPr>
-        <w:t>Modelos de Machine Learning (KMeans, Árvore de Decisão)</w:t>
-      </w:r>
-    </w:p>
-    <w:p>
-      <w:pPr>
-        <w:rPr>
-          <w:lang w:val="pt-PT"/>
-        </w:rPr>
-      </w:pPr>
-      <w:r>
-        <w:rPr>
-          <w:b/>
-          <w:lang w:val="pt-PT"/>
-        </w:rPr>
-        <w:t>PandasGeração</w:t>
-      </w:r>
-      <w:r>
-        <w:rPr>
-          <w:b/>
-          <w:lang w:val="pt-PT"/>
-        </w:rPr>
-        <w:t xml:space="preserve">- </w:t>
-      </w:r>
-      <w:r>
-        <w:rPr>
-          <w:lang w:val="pt-PT"/>
-        </w:rPr>
-        <w:t xml:space="preserve"> e leitura de dados em CSV</w:t>
-      </w:r>
-    </w:p>
-    <w:p>
-      <w:pPr>
-        <w:rPr>
-          <w:lang w:val="pt-PT"/>
-        </w:rPr>
-      </w:pPr>
-      <w:r>
-        <w:rPr>
-          <w:b/>
-          <w:lang w:val="pt-PT"/>
-        </w:rPr>
-        <w:t>PyTorch</w:t>
-      </w:r>
-      <w:r>
-        <w:rPr>
-          <w:b/>
-          <w:lang w:val="pt-PT"/>
-        </w:rPr>
-        <w:t xml:space="preserve">- </w:t>
-      </w:r>
-      <w:r>
-        <w:rPr>
-          <w:lang w:val="pt-PT"/>
-        </w:rPr>
-        <w:t>Definição da rede neural de previsão</w:t>
-      </w:r>
-      <w:r>
-        <w:rPr>
-          <w:lang w:val="pt-PT"/>
-        </w:rPr>
-        <w:t xml:space="preserve"> </w:t>
-      </w:r>
-    </w:p>
-    <w:p>
-      <w:pPr>
-        <w:rPr>
-          <w:lang w:val="pt-PT"/>
-        </w:rPr>
-      </w:pPr>
-      <w:r>
-        <w:rPr>
-          <w:lang w:val="pt-PT"/>
-        </w:rPr>
-        <w:t>.</w:t>
-      </w:r>
-    </w:p>
-    <w:p>
-      <w:pPr>
-        <w:pStyle w:val="Heading2"/>
-        <w:rPr>
-          <w:lang w:val="pt-PT"/>
-        </w:rPr>
-      </w:pPr>
-      <w:bookmarkStart w:id="4" w:name="_Toc230614777"/>
-      <w:r>
-        <w:rPr>
-          <w:lang w:val="pt-PT"/>
-        </w:rPr>
-        <w:t>Estruturação do Projeto</w:t>
-      </w:r>
-      <w:bookmarkEnd w:id="4"/>
-    </w:p>
-    <w:p>
-      <w:pPr>
-        <w:rPr>
-          <w:lang w:val="pt-PT"/>
-        </w:rPr>
-      </w:pPr>
-      <w:r>
-        <w:rPr>
-          <w:lang w:val="pt-PT"/>
-        </w:rPr>
         <w:t>Organização modular do código com separação clara de responsabilidades.</w:t>
       </w:r>
     </w:p>
@@ -1091,38 +1161,28 @@
           <w:lang w:val="pt-PT"/>
         </w:rPr>
       </w:pPr>
-    </w:p>
-    <w:p>
-      <w:pPr>
-        <w:spacing w:before="480" w:after="2800"/>
-        <w:jc w:val="center"/>
-        <w:rPr>
-          <w:lang w:val="pt-PT"/>
-        </w:rPr>
-      </w:pPr>
       <w:r>
         <w:rPr>
           <w:noProof/>
           <w:lang w:val="pt-PT" w:eastAsia="pt-PT"/>
         </w:rPr>
-        <w:lastRenderedPageBreak/>
         <w:drawing>
-          <wp:anchor distT="0" distB="0" distL="114300" distR="114300" simplePos="0" relativeHeight="251641856" behindDoc="1" locked="0" layoutInCell="1" allowOverlap="1">
+          <wp:anchor distT="0" distB="0" distL="114300" distR="114300" simplePos="0" relativeHeight="251657728" behindDoc="1" locked="0" layoutInCell="1" allowOverlap="1" wp14:anchorId="3126DCDA" wp14:editId="1F197349">
             <wp:simplePos x="0" y="0"/>
             <wp:positionH relativeFrom="column">
-              <wp:posOffset>1485900</wp:posOffset>
+              <wp:posOffset>1668780</wp:posOffset>
             </wp:positionH>
             <wp:positionV relativeFrom="paragraph">
-              <wp:posOffset>-909955</wp:posOffset>
+              <wp:posOffset>160655</wp:posOffset>
             </wp:positionV>
-            <wp:extent cx="2505075" cy="6705600"/>
-            <wp:effectExtent l="0" t="0" r="9525" b="0"/>
+            <wp:extent cx="2133600" cy="5711190"/>
+            <wp:effectExtent l="0" t="0" r="0" b="3810"/>
             <wp:wrapTight wrapText="bothSides">
               <wp:wrapPolygon edited="0">
                 <wp:start x="0" y="0"/>
-                <wp:lineTo x="0" y="21539"/>
-                <wp:lineTo x="21518" y="21539"/>
-                <wp:lineTo x="21518" y="0"/>
+                <wp:lineTo x="0" y="21542"/>
+                <wp:lineTo x="21407" y="21542"/>
+                <wp:lineTo x="21407" y="0"/>
                 <wp:lineTo x="0" y="0"/>
               </wp:wrapPolygon>
             </wp:wrapTight>
@@ -1152,7 +1212,7 @@
                   <pic:spPr>
                     <a:xfrm>
                       <a:off x="0" y="0"/>
-                      <a:ext cx="2505075" cy="6705600"/>
+                      <a:ext cx="2133600" cy="5711190"/>
                     </a:xfrm>
                     <a:prstGeom prst="rect">
                       <a:avLst/>
@@ -1161,6 +1221,12 @@
                 </pic:pic>
               </a:graphicData>
             </a:graphic>
+            <wp14:sizeRelH relativeFrom="margin">
+              <wp14:pctWidth>0</wp14:pctWidth>
+            </wp14:sizeRelH>
+            <wp14:sizeRelV relativeFrom="margin">
+              <wp14:pctHeight>0</wp14:pctHeight>
+            </wp14:sizeRelV>
           </wp:anchor>
         </w:drawing>
       </w:r>
@@ -1173,6 +1239,15 @@
           <w:lang w:val="pt-PT"/>
         </w:rPr>
       </w:pPr>
+    </w:p>
+    <w:p>
+      <w:pPr>
+        <w:spacing w:before="480" w:after="2800"/>
+        <w:jc w:val="center"/>
+        <w:rPr>
+          <w:lang w:val="pt-PT"/>
+        </w:rPr>
+      </w:pPr>
       <w:r>
         <w:rPr>
           <w:lang w:val="pt-PT"/>
@@ -1188,15 +1263,6 @@
           <w:lang w:val="pt-PT"/>
         </w:rPr>
       </w:pPr>
-    </w:p>
-    <w:p>
-      <w:pPr>
-        <w:spacing w:before="480" w:after="2800"/>
-        <w:jc w:val="center"/>
-        <w:rPr>
-          <w:lang w:val="pt-PT"/>
-        </w:rPr>
-      </w:pPr>
       <w:r>
         <w:rPr>
           <w:lang w:val="pt-PT"/>
@@ -1218,12 +1284,12 @@
     </w:p>
     <w:p>
       <w:pPr>
-        <w:pStyle w:val="Heading2"/>
-        <w:rPr>
-          <w:lang w:val="pt-PT"/>
-        </w:rPr>
-      </w:pPr>
-      <w:bookmarkStart w:id="5" w:name="_Toc230614778"/>
+        <w:pStyle w:val="Ttulo2"/>
+        <w:rPr>
+          <w:lang w:val="pt-PT"/>
+        </w:rPr>
+      </w:pPr>
+      <w:bookmarkStart w:id="4" w:name="_Toc230614778"/>
       <w:r>
         <w:rPr>
           <w:noProof/>
@@ -1231,13 +1297,13 @@
         </w:rPr>
         <w:lastRenderedPageBreak/>
         <w:drawing>
-          <wp:anchor distT="0" distB="0" distL="114300" distR="114300" simplePos="0" relativeHeight="251648000" behindDoc="1" locked="0" layoutInCell="1" allowOverlap="1">
+          <wp:anchor distT="0" distB="0" distL="114300" distR="114300" simplePos="0" relativeHeight="251660800" behindDoc="1" locked="0" layoutInCell="1" allowOverlap="1" wp14:anchorId="243F263E" wp14:editId="65B06A7A">
             <wp:simplePos x="0" y="0"/>
             <wp:positionH relativeFrom="column">
-              <wp:posOffset>0</wp:posOffset>
+              <wp:posOffset>-7620</wp:posOffset>
             </wp:positionH>
             <wp:positionV relativeFrom="paragraph">
-              <wp:posOffset>-914400</wp:posOffset>
+              <wp:posOffset>259080</wp:posOffset>
             </wp:positionV>
             <wp:extent cx="5486400" cy="4572000"/>
             <wp:effectExtent l="0" t="0" r="0" b="0"/>
@@ -1288,7 +1354,7 @@
           </wp:anchor>
         </w:drawing>
       </w:r>
-      <w:bookmarkEnd w:id="5"/>
+      <w:bookmarkEnd w:id="4"/>
     </w:p>
     <w:p>
       <w:pPr>
@@ -1347,7 +1413,7 @@
         </w:rPr>
         <w:lastRenderedPageBreak/>
         <w:drawing>
-          <wp:anchor distT="0" distB="0" distL="114300" distR="114300" simplePos="0" relativeHeight="251651072" behindDoc="1" locked="0" layoutInCell="1" allowOverlap="1">
+          <wp:anchor distT="0" distB="0" distL="114300" distR="114300" simplePos="0" relativeHeight="251651072" behindDoc="1" locked="0" layoutInCell="1" allowOverlap="1" wp14:anchorId="26F05030" wp14:editId="6C4107F1">
             <wp:simplePos x="0" y="0"/>
             <wp:positionH relativeFrom="column">
               <wp:posOffset>219075</wp:posOffset>
@@ -1447,7 +1513,7 @@
         </w:rPr>
         <w:lastRenderedPageBreak/>
         <w:drawing>
-          <wp:anchor distT="0" distB="0" distL="114300" distR="114300" simplePos="0" relativeHeight="251654144" behindDoc="1" locked="0" layoutInCell="1" allowOverlap="1">
+          <wp:anchor distT="0" distB="0" distL="114300" distR="114300" simplePos="0" relativeHeight="251654144" behindDoc="1" locked="0" layoutInCell="1" allowOverlap="1" wp14:anchorId="15DAA5D5" wp14:editId="0018AAD5">
             <wp:simplePos x="0" y="0"/>
             <wp:positionH relativeFrom="column">
               <wp:posOffset>-19050</wp:posOffset>
@@ -1548,7 +1614,7 @@
         </w:rPr>
         <w:lastRenderedPageBreak/>
         <w:drawing>
-          <wp:anchor distT="0" distB="0" distL="114300" distR="114300" simplePos="0" relativeHeight="251657216" behindDoc="1" locked="0" layoutInCell="1" allowOverlap="1">
+          <wp:anchor distT="0" distB="0" distL="114300" distR="114300" simplePos="0" relativeHeight="251657216" behindDoc="1" locked="0" layoutInCell="1" allowOverlap="1" wp14:anchorId="4D5E67AC" wp14:editId="39BC1777">
             <wp:simplePos x="0" y="0"/>
             <wp:positionH relativeFrom="column">
               <wp:posOffset>1247775</wp:posOffset>
@@ -1635,7 +1701,7 @@
           <w:lang w:val="pt-PT" w:eastAsia="pt-PT"/>
         </w:rPr>
         <w:drawing>
-          <wp:anchor distT="0" distB="0" distL="114300" distR="114300" simplePos="0" relativeHeight="251661312" behindDoc="1" locked="0" layoutInCell="1" allowOverlap="1">
+          <wp:anchor distT="0" distB="0" distL="114300" distR="114300" simplePos="0" relativeHeight="251661312" behindDoc="1" locked="0" layoutInCell="1" allowOverlap="1" wp14:anchorId="7FDCF982" wp14:editId="5B5CE2CA">
             <wp:simplePos x="0" y="0"/>
             <wp:positionH relativeFrom="column">
               <wp:posOffset>1000125</wp:posOffset>
@@ -1756,7 +1822,7 @@
         </w:rPr>
         <w:lastRenderedPageBreak/>
         <w:drawing>
-          <wp:anchor distT="0" distB="0" distL="114300" distR="114300" simplePos="0" relativeHeight="251664384" behindDoc="1" locked="0" layoutInCell="1" allowOverlap="1">
+          <wp:anchor distT="0" distB="0" distL="114300" distR="114300" simplePos="0" relativeHeight="251664384" behindDoc="1" locked="0" layoutInCell="1" allowOverlap="1" wp14:anchorId="1575553F" wp14:editId="51542103">
             <wp:simplePos x="0" y="0"/>
             <wp:positionH relativeFrom="column">
               <wp:posOffset>714375</wp:posOffset>
@@ -1834,7 +1900,7 @@
           <w:lang w:val="pt-PT" w:eastAsia="pt-PT"/>
         </w:rPr>
         <w:drawing>
-          <wp:anchor distT="0" distB="0" distL="114300" distR="114300" simplePos="0" relativeHeight="251669504" behindDoc="1" locked="0" layoutInCell="1" allowOverlap="1">
+          <wp:anchor distT="0" distB="0" distL="114300" distR="114300" simplePos="0" relativeHeight="251669504" behindDoc="1" locked="0" layoutInCell="1" allowOverlap="1" wp14:anchorId="238342BD" wp14:editId="7DA40D8B">
             <wp:simplePos x="0" y="0"/>
             <wp:positionH relativeFrom="column">
               <wp:posOffset>1038225</wp:posOffset>
@@ -1953,7 +2019,7 @@
         </w:rPr>
         <w:lastRenderedPageBreak/>
         <w:drawing>
-          <wp:anchor distT="0" distB="0" distL="114300" distR="114300" simplePos="0" relativeHeight="251671552" behindDoc="1" locked="0" layoutInCell="1" allowOverlap="1">
+          <wp:anchor distT="0" distB="0" distL="114300" distR="114300" simplePos="0" relativeHeight="251671552" behindDoc="1" locked="0" layoutInCell="1" allowOverlap="1" wp14:anchorId="19A8993D" wp14:editId="740B89DB">
             <wp:simplePos x="0" y="0"/>
             <wp:positionH relativeFrom="column">
               <wp:posOffset>914400</wp:posOffset>
@@ -2096,7 +2162,7 @@
           <w:lang w:val="pt-PT" w:eastAsia="pt-PT"/>
         </w:rPr>
         <w:drawing>
-          <wp:anchor distT="0" distB="0" distL="114300" distR="114300" simplePos="0" relativeHeight="251676672" behindDoc="1" locked="0" layoutInCell="1" allowOverlap="1">
+          <wp:anchor distT="0" distB="0" distL="114300" distR="114300" simplePos="0" relativeHeight="251676672" behindDoc="1" locked="0" layoutInCell="1" allowOverlap="1" wp14:anchorId="79B48872" wp14:editId="1DE38137">
             <wp:simplePos x="0" y="0"/>
             <wp:positionH relativeFrom="column">
               <wp:posOffset>1466850</wp:posOffset>
@@ -2220,13 +2286,13 @@
         </w:rPr>
         <w:lastRenderedPageBreak/>
         <w:drawing>
-          <wp:anchor distT="0" distB="0" distL="114300" distR="114300" simplePos="0" relativeHeight="251681792" behindDoc="1" locked="0" layoutInCell="1" allowOverlap="1">
+          <wp:anchor distT="0" distB="0" distL="114300" distR="114300" simplePos="0" relativeHeight="251681792" behindDoc="1" locked="0" layoutInCell="1" allowOverlap="1" wp14:anchorId="3BE0E1F0" wp14:editId="1FE6FC49">
             <wp:simplePos x="0" y="0"/>
             <wp:positionH relativeFrom="column">
-              <wp:posOffset>1066800</wp:posOffset>
+              <wp:posOffset>929640</wp:posOffset>
             </wp:positionH>
             <wp:positionV relativeFrom="paragraph">
-              <wp:posOffset>-3810</wp:posOffset>
+              <wp:posOffset>582930</wp:posOffset>
             </wp:positionV>
             <wp:extent cx="3609975" cy="2892425"/>
             <wp:effectExtent l="0" t="0" r="9525" b="3175"/>
@@ -2307,7 +2373,7 @@
           <w:lang w:val="pt-PT" w:eastAsia="pt-PT"/>
         </w:rPr>
         <w:drawing>
-          <wp:anchor distT="0" distB="0" distL="114300" distR="114300" simplePos="0" relativeHeight="251684864" behindDoc="1" locked="0" layoutInCell="1" allowOverlap="1">
+          <wp:anchor distT="0" distB="0" distL="114300" distR="114300" simplePos="0" relativeHeight="251684864" behindDoc="1" locked="0" layoutInCell="1" allowOverlap="1" wp14:anchorId="23919350" wp14:editId="22CD209B">
             <wp:simplePos x="0" y="0"/>
             <wp:positionH relativeFrom="column">
               <wp:posOffset>1104900</wp:posOffset>
@@ -2435,7 +2501,7 @@
         </w:rPr>
         <w:lastRenderedPageBreak/>
         <w:drawing>
-          <wp:anchor distT="0" distB="0" distL="114300" distR="114300" simplePos="0" relativeHeight="251687936" behindDoc="1" locked="0" layoutInCell="1" allowOverlap="1">
+          <wp:anchor distT="0" distB="0" distL="114300" distR="114300" simplePos="0" relativeHeight="251687936" behindDoc="1" locked="0" layoutInCell="1" allowOverlap="1" wp14:anchorId="3268AB28" wp14:editId="747AF6FE">
             <wp:simplePos x="0" y="0"/>
             <wp:positionH relativeFrom="column">
               <wp:posOffset>647700</wp:posOffset>
@@ -2538,13 +2604,7 @@
         <w:rPr>
           <w:lang w:val="pt-PT"/>
         </w:rPr>
-        <w:t>m</w:t>
-      </w:r>
-      <w:r>
-        <w:rPr>
-          <w:lang w:val="pt-PT"/>
-        </w:rPr>
-        <w:t>étodo update com a chamada ao astar() e o movimento para o next_step</w:t>
+        <w:t>método update com a chamada ao astar() e o movimento para o next_step</w:t>
       </w:r>
     </w:p>
     <w:p>
@@ -2581,7 +2641,7 @@
         </w:rPr>
         <w:lastRenderedPageBreak/>
         <w:drawing>
-          <wp:anchor distT="0" distB="0" distL="114300" distR="114300" simplePos="0" relativeHeight="251691008" behindDoc="1" locked="0" layoutInCell="1" allowOverlap="1">
+          <wp:anchor distT="0" distB="0" distL="114300" distR="114300" simplePos="0" relativeHeight="251691008" behindDoc="1" locked="0" layoutInCell="1" allowOverlap="1" wp14:anchorId="2C6269D5" wp14:editId="5682D816">
             <wp:simplePos x="0" y="0"/>
             <wp:positionH relativeFrom="column">
               <wp:posOffset>1133475</wp:posOffset>
@@ -2692,18 +2752,53 @@
     </w:p>
     <w:p>
       <w:pPr>
-        <w:pStyle w:val="Heading1"/>
-        <w:rPr>
-          <w:lang w:val="pt-PT"/>
-        </w:rPr>
-      </w:pPr>
-      <w:bookmarkStart w:id="6" w:name="_Toc230614779"/>
+        <w:pStyle w:val="Ttulo1"/>
+        <w:rPr>
+          <w:lang w:val="pt-PT"/>
+        </w:rPr>
+      </w:pPr>
+      <w:bookmarkStart w:id="5" w:name="_Toc230614779"/>
       <w:r>
         <w:rPr>
           <w:lang w:val="pt-PT"/>
         </w:rPr>
         <w:lastRenderedPageBreak/>
         <w:t>Resultados</w:t>
+      </w:r>
+      <w:bookmarkEnd w:id="5"/>
+    </w:p>
+    <w:p>
+      <w:pPr>
+        <w:rPr>
+          <w:lang w:val="pt-PT"/>
+        </w:rPr>
+      </w:pPr>
+      <w:r>
+        <w:rPr>
+          <w:lang w:val="pt-PT"/>
+        </w:rPr>
+        <w:t>O camião de bombeiros respondeu com sucesso a todos os desastres registados, navegando automaticamente via algoritmo A* até cada incêndio e extinguindo-o ao chegar à célula correspondente. A população manteve-se estável nos 60 cidadãos durante toda a simulação, movendo-se aleatoriamente pela grelha sem abandonar a cidade.</w:t>
+      </w:r>
+      <w:r>
+        <w:rPr>
+          <w:lang w:val="pt-PT"/>
+        </w:rPr>
+        <w:t xml:space="preserve"> </w:t>
+      </w:r>
+    </w:p>
+    <w:p>
+      <w:pPr>
+        <w:pStyle w:val="Ttulo1"/>
+        <w:rPr>
+          <w:lang w:val="pt-PT"/>
+        </w:rPr>
+      </w:pPr>
+      <w:bookmarkStart w:id="6" w:name="_Toc230614780"/>
+      <w:r>
+        <w:rPr>
+          <w:lang w:val="pt-PT"/>
+        </w:rPr>
+        <w:t>Conclusão</w:t>
       </w:r>
       <w:bookmarkEnd w:id="6"/>
     </w:p>
@@ -2717,66 +2812,7 @@
         <w:rPr>
           <w:lang w:val="pt-PT"/>
         </w:rPr>
-        <w:t>O camião de bombeiros respondeu com sucesso a todos os desastres registados, navegando automaticamente via algoritmo A* até cada incêndio e extinguindo-o ao chegar à célula correspondente. A população manteve-se estável nos 60 cidadãos durante toda a simulação, movendo-se aleatoriamente pela grelha sem abandonar a cidade.</w:t>
-      </w:r>
-      <w:r>
-        <w:rPr>
-          <w:lang w:val="pt-PT"/>
-        </w:rPr>
-        <w:t xml:space="preserve"> </w:t>
-      </w:r>
-    </w:p>
-    <w:p>
-      <w:pPr>
-        <w:pStyle w:val="Heading1"/>
-        <w:rPr>
-          <w:lang w:val="pt-PT"/>
-        </w:rPr>
-      </w:pPr>
-      <w:bookmarkStart w:id="7" w:name="_Toc230614780"/>
-      <w:r>
-        <w:rPr>
-          <w:lang w:val="pt-PT"/>
-        </w:rPr>
-        <w:t>Conclusão</w:t>
-      </w:r>
-      <w:bookmarkEnd w:id="7"/>
-    </w:p>
-    <w:p>
-      <w:pPr>
-        <w:rPr>
-          <w:lang w:val="pt-PT"/>
-        </w:rPr>
-      </w:pPr>
-      <w:r>
-        <w:rPr>
-          <w:lang w:val="pt-PT"/>
-        </w:rPr>
-        <w:t>O projeto Aegis demonstrou com sucesso a integração de múltiplas técnicas de Inteligência Artificial num sistema de simulação urbana coeso e funcional. O componente mais eficaz foi o algoritmo A*, que garantiu que o camião de bombeiros respondesse de forma autónoma e eficiente a todos os incêndios, calculando sempre o caminho mais curto em tempo real.</w:t>
-      </w:r>
-      <w:r>
-        <w:rPr>
-          <w:lang w:val="pt-PT"/>
-        </w:rPr>
-        <w:t xml:space="preserve"> </w:t>
-      </w:r>
-      <w:r>
-        <w:rPr>
-          <w:lang w:val="pt-PT"/>
-        </w:rPr>
-        <w:t>No entanto, o projeto tem limitações claras que representam oportunidades de desenvolvimento futuro. A existência de apenas um camião de bombeiros torna o sistema vulnerável em situações de crise dupla ou tripla, onde o segundo e terceiro incêndio ficam sem resposta enquanto o primeiro não é extinto.</w:t>
-      </w:r>
-      <w:r>
-        <w:rPr>
-          <w:lang w:val="pt-PT"/>
-        </w:rPr>
-        <w:t xml:space="preserve"> </w:t>
-      </w:r>
-      <w:r>
-        <w:rPr>
-          <w:lang w:val="pt-PT"/>
-        </w:rPr>
-        <w:t>Em suma, o Aegis cumpre os objetivos propostos enquanto projeto académico, demonstrando como algoritmos de IA podem automatizar a tomada de decisão em ambientes urbanos complexos, e serve como base sólida para uma versão mais completa e robusta no futuro.</w:t>
+        <w:t>O projeto Aegis demonstrou com sucesso a integração de múltiplas técnicas de Inteligência Artificial num sistema de simulação urbana coeso e funcional. O componente mais eficaz foi o algoritmo A*, que garantiu que o camião de bombeiros respondesse de forma autónoma e eficiente a todos os incêndios, calculando sempre o caminho mais curto em tempo real. No entanto, o projeto tem limitações claras que representam oportunidades de desenvolvimento futuro. A existência de apenas um camião de bombeiros torna o sistema vulnerável em situações de crise dupla ou tripla, onde o segundo e terceiro incêndio ficam sem resposta enquanto o primeiro não é extinto. Em suma, o Aegis cumpre os objetivos propostos enquanto projeto académico, demonstrando como algoritmos de IA podem automatizar a tomada de decisão em ambientes urbanos complexos, e serve como base sólida para uma versão mais completa e robusta no futuro.</w:t>
       </w:r>
       <w:r>
         <w:rPr>
@@ -2796,7 +2832,7 @@
 </file>
 
 <file path=word/numbering.xml><?xml version="1.0" encoding="utf-8"?>
-<w:numbering xmlns:wpc="http://schemas.microsoft.com/office/word/2010/wordprocessingCanvas" xmlns:cx="http://schemas.microsoft.com/office/drawing/2014/chartex" xmlns:cx1="http://schemas.microsoft.com/office/drawing/2015/9/8/chartex" xmlns:mc="http://schemas.openxmlformats.org/markup-compatibility/2006" xmlns:o="urn:schemas-microsoft-com:office:office" xmlns:r="http://schemas.openxmlformats.org/officeDocument/2006/relationships" xmlns:m="http://schemas.openxmlformats.org/officeDocument/2006/math" xmlns:v="urn:schemas-microsoft-com:vml" xmlns:wp14="http://schemas.microsoft.com/office/word/2010/wordprocessingDrawing" xmlns:wp="http://schemas.openxmlformats.org/drawingml/2006/wordprocessingDrawing" xmlns:w10="urn:schemas-microsoft-com:office:word" xmlns:w="http://schemas.openxmlformats.org/wordprocessingml/2006/main" xmlns:w14="http://schemas.microsoft.com/office/word/2010/wordml" xmlns:w15="http://schemas.microsoft.com/office/word/2012/wordml" xmlns:w16se="http://schemas.microsoft.com/office/word/2015/wordml/symex" xmlns:wpg="http://schemas.microsoft.com/office/word/2010/wordprocessingGroup" xmlns:wpi="http://schemas.microsoft.com/office/word/2010/wordprocessingInk" xmlns:wne="http://schemas.microsoft.com/office/word/2006/wordml" xmlns:wps="http://schemas.microsoft.com/office/word/2010/wordprocessingShape" mc:Ignorable="w14 w15 w16se wp14">
+<w:numbering xmlns:wpc="http://schemas.microsoft.com/office/word/2010/wordprocessingCanvas" xmlns:cx="http://schemas.microsoft.com/office/drawing/2014/chartex" xmlns:cx1="http://schemas.microsoft.com/office/drawing/2015/9/8/chartex" xmlns:cx2="http://schemas.microsoft.com/office/drawing/2015/10/21/chartex" xmlns:cx3="http://schemas.microsoft.com/office/drawing/2016/5/9/chartex" xmlns:cx4="http://schemas.microsoft.com/office/drawing/2016/5/10/chartex" xmlns:cx5="http://schemas.microsoft.com/office/drawing/2016/5/11/chartex" xmlns:cx6="http://schemas.microsoft.com/office/drawing/2016/5/12/chartex" xmlns:cx7="http://schemas.microsoft.com/office/drawing/2016/5/13/chartex" xmlns:cx8="http://schemas.microsoft.com/office/drawing/2016/5/14/chartex" xmlns:mc="http://schemas.openxmlformats.org/markup-compatibility/2006" xmlns:aink="http://schemas.microsoft.com/office/drawing/2016/ink" xmlns:am3d="http://schemas.microsoft.com/office/drawing/2017/model3d" xmlns:o="urn:schemas-microsoft-com:office:office" xmlns:oel="http://schemas.microsoft.com/office/2019/extlst" xmlns:r="http://schemas.openxmlformats.org/officeDocument/2006/relationships" xmlns:m="http://schemas.openxmlformats.org/officeDocument/2006/math" xmlns:v="urn:schemas-microsoft-com:vml" xmlns:wp14="http://schemas.microsoft.com/office/word/2010/wordprocessingDrawing" xmlns:wp="http://schemas.openxmlformats.org/drawingml/2006/wordprocessingDrawing" xmlns:w10="urn:schemas-microsoft-com:office:word" xmlns:w="http://schemas.openxmlformats.org/wordprocessingml/2006/main" xmlns:w14="http://schemas.microsoft.com/office/word/2010/wordml" xmlns:w15="http://schemas.microsoft.com/office/word/2012/wordml" xmlns:w16cex="http://schemas.microsoft.com/office/word/2018/wordml/cex" xmlns:w16cid="http://schemas.microsoft.com/office/word/2016/wordml/cid" xmlns:w16="http://schemas.microsoft.com/office/word/2018/wordml" xmlns:w16du="http://schemas.microsoft.com/office/word/2023/wordml/word16du" xmlns:w16sdtdh="http://schemas.microsoft.com/office/word/2020/wordml/sdtdatahash" xmlns:w16sdtfl="http://schemas.microsoft.com/office/word/2024/wordml/sdtformatlock" xmlns:w16se="http://schemas.microsoft.com/office/word/2015/wordml/symex" xmlns:wpg="http://schemas.microsoft.com/office/word/2010/wordprocessingGroup" xmlns:wpi="http://schemas.microsoft.com/office/word/2010/wordprocessingInk" xmlns:wne="http://schemas.microsoft.com/office/word/2006/wordml" xmlns:wps="http://schemas.microsoft.com/office/word/2010/wordprocessingShape" mc:Ignorable="w14 w15 w16se w16cid w16 w16cex w16sdtdh w16sdtfl w16du wp14">
   <w:abstractNum w:abstractNumId="0" w15:restartNumberingAfterBreak="0">
     <w:nsid w:val="FFFFFF7C"/>
     <w:multiLevelType w:val="singleLevel"/>
@@ -2838,7 +2874,7 @@
     <w:lvl w:ilvl="0">
       <w:start w:val="1"/>
       <w:numFmt w:val="decimal"/>
-      <w:pStyle w:val="ListNumber3"/>
+      <w:pStyle w:val="Listanumerada3"/>
       <w:lvlText w:val="%1."/>
       <w:lvlJc w:val="left"/>
       <w:pPr>
@@ -2856,7 +2892,7 @@
     <w:lvl w:ilvl="0">
       <w:start w:val="1"/>
       <w:numFmt w:val="decimal"/>
-      <w:pStyle w:val="ListNumber2"/>
+      <w:pStyle w:val="Listanumerada2"/>
       <w:lvlText w:val="%1."/>
       <w:lvlJc w:val="left"/>
       <w:pPr>
@@ -2894,7 +2930,7 @@
     <w:lvl w:ilvl="0">
       <w:start w:val="1"/>
       <w:numFmt w:val="bullet"/>
-      <w:pStyle w:val="ListBullet3"/>
+      <w:pStyle w:val="Listacommarcas3"/>
       <w:lvlText w:val=""/>
       <w:lvlJc w:val="left"/>
       <w:pPr>
@@ -2915,7 +2951,7 @@
     <w:lvl w:ilvl="0">
       <w:start w:val="1"/>
       <w:numFmt w:val="bullet"/>
-      <w:pStyle w:val="ListBullet2"/>
+      <w:pStyle w:val="Listacommarcas2"/>
       <w:lvlText w:val=""/>
       <w:lvlJc w:val="left"/>
       <w:pPr>
@@ -2936,7 +2972,7 @@
     <w:lvl w:ilvl="0">
       <w:start w:val="1"/>
       <w:numFmt w:val="decimal"/>
-      <w:pStyle w:val="ListNumber"/>
+      <w:pStyle w:val="Listanumerada"/>
       <w:lvlText w:val="%1."/>
       <w:lvlJc w:val="left"/>
       <w:pPr>
@@ -2954,7 +2990,7 @@
     <w:lvl w:ilvl="0">
       <w:start w:val="1"/>
       <w:numFmt w:val="bullet"/>
-      <w:pStyle w:val="ListBullet"/>
+      <w:pStyle w:val="Listacommarcas"/>
       <w:lvlText w:val=""/>
       <w:lvlJc w:val="left"/>
       <w:pPr>
@@ -2968,38 +3004,38 @@
       </w:rPr>
     </w:lvl>
   </w:abstractNum>
-  <w:num w:numId="1">
+  <w:num w:numId="1" w16cid:durableId="179123606">
     <w:abstractNumId w:val="8"/>
   </w:num>
-  <w:num w:numId="2">
+  <w:num w:numId="2" w16cid:durableId="245263771">
     <w:abstractNumId w:val="6"/>
   </w:num>
-  <w:num w:numId="3">
+  <w:num w:numId="3" w16cid:durableId="1926986179">
     <w:abstractNumId w:val="5"/>
   </w:num>
-  <w:num w:numId="4">
+  <w:num w:numId="4" w16cid:durableId="1160846952">
     <w:abstractNumId w:val="4"/>
   </w:num>
-  <w:num w:numId="5">
+  <w:num w:numId="5" w16cid:durableId="943422129">
     <w:abstractNumId w:val="7"/>
   </w:num>
-  <w:num w:numId="6">
+  <w:num w:numId="6" w16cid:durableId="735206497">
     <w:abstractNumId w:val="3"/>
   </w:num>
-  <w:num w:numId="7">
+  <w:num w:numId="7" w16cid:durableId="1126318184">
     <w:abstractNumId w:val="2"/>
   </w:num>
-  <w:num w:numId="8">
+  <w:num w:numId="8" w16cid:durableId="21367574">
     <w:abstractNumId w:val="1"/>
   </w:num>
-  <w:num w:numId="9">
+  <w:num w:numId="9" w16cid:durableId="1156217156">
     <w:abstractNumId w:val="0"/>
   </w:num>
 </w:numbering>
 </file>
 
 <file path=word/styles.xml><?xml version="1.0" encoding="utf-8"?>
-<w:styles xmlns:mc="http://schemas.openxmlformats.org/markup-compatibility/2006" xmlns:r="http://schemas.openxmlformats.org/officeDocument/2006/relationships" xmlns:w="http://schemas.openxmlformats.org/wordprocessingml/2006/main" xmlns:w14="http://schemas.microsoft.com/office/word/2010/wordml" xmlns:w15="http://schemas.microsoft.com/office/word/2012/wordml" xmlns:w16se="http://schemas.microsoft.com/office/word/2015/wordml/symex" mc:Ignorable="w14 w15 w16se">
+<w:styles xmlns:mc="http://schemas.openxmlformats.org/markup-compatibility/2006" xmlns:r="http://schemas.openxmlformats.org/officeDocument/2006/relationships" xmlns:w="http://schemas.openxmlformats.org/wordprocessingml/2006/main" xmlns:w14="http://schemas.microsoft.com/office/word/2010/wordml" xmlns:w15="http://schemas.microsoft.com/office/word/2012/wordml" xmlns:w16cex="http://schemas.microsoft.com/office/word/2018/wordml/cex" xmlns:w16cid="http://schemas.microsoft.com/office/word/2016/wordml/cid" xmlns:w16="http://schemas.microsoft.com/office/word/2018/wordml" xmlns:w16du="http://schemas.microsoft.com/office/word/2023/wordml/word16du" xmlns:w16sdtdh="http://schemas.microsoft.com/office/word/2020/wordml/sdtdatahash" xmlns:w16sdtfl="http://schemas.microsoft.com/office/word/2024/wordml/sdtformatlock" xmlns:w16se="http://schemas.microsoft.com/office/word/2015/wordml/symex" mc:Ignorable="w14 w15 w16se w16cid w16 w16cex w16sdtdh w16sdtfl w16du">
   <w:docDefaults>
     <w:rPrDefault>
       <w:rPr>
@@ -3015,7 +3051,7 @@
       </w:pPr>
     </w:pPrDefault>
   </w:docDefaults>
-  <w:latentStyles w:defLockedState="0" w:defUIPriority="99" w:defSemiHidden="0" w:defUnhideWhenUsed="0" w:defQFormat="0" w:count="371">
+  <w:latentStyles w:defLockedState="0" w:defUIPriority="99" w:defSemiHidden="0" w:defUnhideWhenUsed="0" w:defQFormat="0" w:count="376">
     <w:lsdException w:name="Normal" w:uiPriority="0" w:qFormat="1"/>
     <w:lsdException w:name="heading 1" w:uiPriority="9" w:qFormat="1"/>
     <w:lsdException w:name="heading 2" w:semiHidden="1" w:uiPriority="9" w:unhideWhenUsed="1" w:qFormat="1"/>
@@ -3378,17 +3414,22 @@
     <w:lsdException w:name="List Table 5 Dark Accent 6" w:uiPriority="50"/>
     <w:lsdException w:name="List Table 6 Colorful Accent 6" w:uiPriority="51"/>
     <w:lsdException w:name="List Table 7 Colorful Accent 6" w:uiPriority="52"/>
+    <w:lsdException w:name="Mention" w:semiHidden="1" w:unhideWhenUsed="1"/>
+    <w:lsdException w:name="Smart Hyperlink" w:semiHidden="1" w:unhideWhenUsed="1"/>
+    <w:lsdException w:name="Hashtag" w:semiHidden="1" w:unhideWhenUsed="1"/>
+    <w:lsdException w:name="Unresolved Mention" w:semiHidden="1" w:unhideWhenUsed="1"/>
+    <w:lsdException w:name="Smart Link" w:semiHidden="1" w:unhideWhenUsed="1"/>
   </w:latentStyles>
   <w:style w:type="paragraph" w:default="1" w:styleId="Normal">
     <w:name w:val="Normal"/>
     <w:qFormat/>
     <w:rsid w:val="00FC693F"/>
   </w:style>
-  <w:style w:type="paragraph" w:styleId="Heading1">
+  <w:style w:type="paragraph" w:styleId="Ttulo1">
     <w:name w:val="heading 1"/>
     <w:basedOn w:val="Normal"/>
     <w:next w:val="Normal"/>
-    <w:link w:val="Heading1Char"/>
+    <w:link w:val="Ttulo1Carter"/>
     <w:uiPriority w:val="9"/>
     <w:qFormat/>
     <w:rsid w:val="00FC693F"/>
@@ -3407,11 +3448,11 @@
       <w:szCs w:val="28"/>
     </w:rPr>
   </w:style>
-  <w:style w:type="paragraph" w:styleId="Heading2">
+  <w:style w:type="paragraph" w:styleId="Ttulo2">
     <w:name w:val="heading 2"/>
     <w:basedOn w:val="Normal"/>
     <w:next w:val="Normal"/>
-    <w:link w:val="Heading2Char"/>
+    <w:link w:val="Ttulo2Carter"/>
     <w:uiPriority w:val="9"/>
     <w:unhideWhenUsed/>
     <w:qFormat/>
@@ -3431,11 +3472,11 @@
       <w:szCs w:val="26"/>
     </w:rPr>
   </w:style>
-  <w:style w:type="paragraph" w:styleId="Heading3">
+  <w:style w:type="paragraph" w:styleId="Ttulo3">
     <w:name w:val="heading 3"/>
     <w:basedOn w:val="Normal"/>
     <w:next w:val="Normal"/>
-    <w:link w:val="Heading3Char"/>
+    <w:link w:val="Ttulo3Carter"/>
     <w:uiPriority w:val="9"/>
     <w:unhideWhenUsed/>
     <w:qFormat/>
@@ -3453,11 +3494,11 @@
       <w:color w:val="4F81BD" w:themeColor="accent1"/>
     </w:rPr>
   </w:style>
-  <w:style w:type="paragraph" w:styleId="Heading4">
+  <w:style w:type="paragraph" w:styleId="Ttulo4">
     <w:name w:val="heading 4"/>
     <w:basedOn w:val="Normal"/>
     <w:next w:val="Normal"/>
-    <w:link w:val="Heading4Char"/>
+    <w:link w:val="Ttulo4Carter"/>
     <w:uiPriority w:val="9"/>
     <w:semiHidden/>
     <w:unhideWhenUsed/>
@@ -3478,11 +3519,11 @@
       <w:color w:val="4F81BD" w:themeColor="accent1"/>
     </w:rPr>
   </w:style>
-  <w:style w:type="paragraph" w:styleId="Heading5">
+  <w:style w:type="paragraph" w:styleId="Ttulo5">
     <w:name w:val="heading 5"/>
     <w:basedOn w:val="Normal"/>
     <w:next w:val="Normal"/>
-    <w:link w:val="Heading5Char"/>
+    <w:link w:val="Ttulo5Carter"/>
     <w:uiPriority w:val="9"/>
     <w:semiHidden/>
     <w:unhideWhenUsed/>
@@ -3499,11 +3540,11 @@
       <w:color w:val="243F60" w:themeColor="accent1" w:themeShade="7F"/>
     </w:rPr>
   </w:style>
-  <w:style w:type="paragraph" w:styleId="Heading6">
+  <w:style w:type="paragraph" w:styleId="Ttulo6">
     <w:name w:val="heading 6"/>
     <w:basedOn w:val="Normal"/>
     <w:next w:val="Normal"/>
-    <w:link w:val="Heading6Char"/>
+    <w:link w:val="Ttulo6Carter"/>
     <w:uiPriority w:val="9"/>
     <w:semiHidden/>
     <w:unhideWhenUsed/>
@@ -3522,11 +3563,11 @@
       <w:color w:val="243F60" w:themeColor="accent1" w:themeShade="7F"/>
     </w:rPr>
   </w:style>
-  <w:style w:type="paragraph" w:styleId="Heading7">
+  <w:style w:type="paragraph" w:styleId="Ttulo7">
     <w:name w:val="heading 7"/>
     <w:basedOn w:val="Normal"/>
     <w:next w:val="Normal"/>
-    <w:link w:val="Heading7Char"/>
+    <w:link w:val="Ttulo7Carter"/>
     <w:uiPriority w:val="9"/>
     <w:semiHidden/>
     <w:unhideWhenUsed/>
@@ -3545,11 +3586,11 @@
       <w:color w:val="404040" w:themeColor="text1" w:themeTint="BF"/>
     </w:rPr>
   </w:style>
-  <w:style w:type="paragraph" w:styleId="Heading8">
+  <w:style w:type="paragraph" w:styleId="Ttulo8">
     <w:name w:val="heading 8"/>
     <w:basedOn w:val="Normal"/>
     <w:next w:val="Normal"/>
-    <w:link w:val="Heading8Char"/>
+    <w:link w:val="Ttulo8Carter"/>
     <w:uiPriority w:val="9"/>
     <w:semiHidden/>
     <w:unhideWhenUsed/>
@@ -3568,11 +3609,11 @@
       <w:szCs w:val="20"/>
     </w:rPr>
   </w:style>
-  <w:style w:type="paragraph" w:styleId="Heading9">
+  <w:style w:type="paragraph" w:styleId="Ttulo9">
     <w:name w:val="heading 9"/>
     <w:basedOn w:val="Normal"/>
     <w:next w:val="Normal"/>
-    <w:link w:val="Heading9Char"/>
+    <w:link w:val="Ttulo9Carter"/>
     <w:uiPriority w:val="9"/>
     <w:semiHidden/>
     <w:unhideWhenUsed/>
@@ -3593,13 +3634,13 @@
       <w:szCs w:val="20"/>
     </w:rPr>
   </w:style>
-  <w:style w:type="character" w:default="1" w:styleId="DefaultParagraphFont">
+  <w:style w:type="character" w:default="1" w:styleId="Tipodeletrapredefinidodopargrafo">
     <w:name w:val="Default Paragraph Font"/>
     <w:uiPriority w:val="1"/>
     <w:semiHidden/>
     <w:unhideWhenUsed/>
   </w:style>
-  <w:style w:type="table" w:default="1" w:styleId="TableNormal">
+  <w:style w:type="table" w:default="1" w:styleId="Tabelanormal">
     <w:name w:val="Normal Table"/>
     <w:uiPriority w:val="99"/>
     <w:semiHidden/>
@@ -3614,16 +3655,16 @@
       </w:tblCellMar>
     </w:tblPr>
   </w:style>
-  <w:style w:type="numbering" w:default="1" w:styleId="NoList">
+  <w:style w:type="numbering" w:default="1" w:styleId="Semlista">
     <w:name w:val="No List"/>
     <w:uiPriority w:val="99"/>
     <w:semiHidden/>
     <w:unhideWhenUsed/>
   </w:style>
-  <w:style w:type="paragraph" w:styleId="Header">
+  <w:style w:type="paragraph" w:styleId="Cabealho">
     <w:name w:val="header"/>
     <w:basedOn w:val="Normal"/>
-    <w:link w:val="HeaderChar"/>
+    <w:link w:val="CabealhoCarter"/>
     <w:uiPriority w:val="99"/>
     <w:unhideWhenUsed/>
     <w:rsid w:val="00E618BF"/>
@@ -3635,17 +3676,17 @@
       <w:spacing w:after="0" w:line="240" w:lineRule="auto"/>
     </w:pPr>
   </w:style>
-  <w:style w:type="character" w:customStyle="1" w:styleId="HeaderChar">
-    <w:name w:val="Header Char"/>
-    <w:basedOn w:val="DefaultParagraphFont"/>
-    <w:link w:val="Header"/>
+  <w:style w:type="character" w:customStyle="1" w:styleId="CabealhoCarter">
+    <w:name w:val="Cabeçalho Caráter"/>
+    <w:basedOn w:val="Tipodeletrapredefinidodopargrafo"/>
+    <w:link w:val="Cabealho"/>
     <w:uiPriority w:val="99"/>
     <w:rsid w:val="00E618BF"/>
   </w:style>
-  <w:style w:type="paragraph" w:styleId="Footer">
+  <w:style w:type="paragraph" w:styleId="Rodap">
     <w:name w:val="footer"/>
     <w:basedOn w:val="Normal"/>
-    <w:link w:val="FooterChar"/>
+    <w:link w:val="RodapCarter"/>
     <w:uiPriority w:val="99"/>
     <w:unhideWhenUsed/>
     <w:rsid w:val="00E618BF"/>
@@ -3657,14 +3698,14 @@
       <w:spacing w:after="0" w:line="240" w:lineRule="auto"/>
     </w:pPr>
   </w:style>
-  <w:style w:type="character" w:customStyle="1" w:styleId="FooterChar">
-    <w:name w:val="Footer Char"/>
-    <w:basedOn w:val="DefaultParagraphFont"/>
-    <w:link w:val="Footer"/>
+  <w:style w:type="character" w:customStyle="1" w:styleId="RodapCarter">
+    <w:name w:val="Rodapé Caráter"/>
+    <w:basedOn w:val="Tipodeletrapredefinidodopargrafo"/>
+    <w:link w:val="Rodap"/>
     <w:uiPriority w:val="99"/>
     <w:rsid w:val="00E618BF"/>
   </w:style>
-  <w:style w:type="paragraph" w:styleId="NoSpacing">
+  <w:style w:type="paragraph" w:styleId="SemEspaamento">
     <w:name w:val="No Spacing"/>
     <w:uiPriority w:val="1"/>
     <w:qFormat/>
@@ -3673,10 +3714,10 @@
       <w:spacing w:after="0" w:line="240" w:lineRule="auto"/>
     </w:pPr>
   </w:style>
-  <w:style w:type="character" w:customStyle="1" w:styleId="Heading1Char">
-    <w:name w:val="Heading 1 Char"/>
-    <w:basedOn w:val="DefaultParagraphFont"/>
-    <w:link w:val="Heading1"/>
+  <w:style w:type="character" w:customStyle="1" w:styleId="Ttulo1Carter">
+    <w:name w:val="Título 1 Caráter"/>
+    <w:basedOn w:val="Tipodeletrapredefinidodopargrafo"/>
+    <w:link w:val="Ttulo1"/>
     <w:uiPriority w:val="9"/>
     <w:rsid w:val="00FC693F"/>
     <w:rPr>
@@ -3688,10 +3729,10 @@
       <w:szCs w:val="28"/>
     </w:rPr>
   </w:style>
-  <w:style w:type="character" w:customStyle="1" w:styleId="Heading2Char">
-    <w:name w:val="Heading 2 Char"/>
-    <w:basedOn w:val="DefaultParagraphFont"/>
-    <w:link w:val="Heading2"/>
+  <w:style w:type="character" w:customStyle="1" w:styleId="Ttulo2Carter">
+    <w:name w:val="Título 2 Caráter"/>
+    <w:basedOn w:val="Tipodeletrapredefinidodopargrafo"/>
+    <w:link w:val="Ttulo2"/>
     <w:uiPriority w:val="9"/>
     <w:rsid w:val="00FC693F"/>
     <w:rPr>
@@ -3703,10 +3744,10 @@
       <w:szCs w:val="26"/>
     </w:rPr>
   </w:style>
-  <w:style w:type="character" w:customStyle="1" w:styleId="Heading3Char">
-    <w:name w:val="Heading 3 Char"/>
-    <w:basedOn w:val="DefaultParagraphFont"/>
-    <w:link w:val="Heading3"/>
+  <w:style w:type="character" w:customStyle="1" w:styleId="Ttulo3Carter">
+    <w:name w:val="Título 3 Caráter"/>
+    <w:basedOn w:val="Tipodeletrapredefinidodopargrafo"/>
+    <w:link w:val="Ttulo3"/>
     <w:uiPriority w:val="9"/>
     <w:rsid w:val="00FC693F"/>
     <w:rPr>
@@ -3716,11 +3757,11 @@
       <w:color w:val="4F81BD" w:themeColor="accent1"/>
     </w:rPr>
   </w:style>
-  <w:style w:type="paragraph" w:styleId="Title">
+  <w:style w:type="paragraph" w:styleId="Ttulo">
     <w:name w:val="Title"/>
     <w:basedOn w:val="Normal"/>
     <w:next w:val="Normal"/>
-    <w:link w:val="TitleChar"/>
+    <w:link w:val="TtuloCarter"/>
     <w:uiPriority w:val="10"/>
     <w:qFormat/>
     <w:rsid w:val="00FC693F"/>
@@ -3740,10 +3781,10 @@
       <w:szCs w:val="52"/>
     </w:rPr>
   </w:style>
-  <w:style w:type="character" w:customStyle="1" w:styleId="TitleChar">
-    <w:name w:val="Title Char"/>
-    <w:basedOn w:val="DefaultParagraphFont"/>
-    <w:link w:val="Title"/>
+  <w:style w:type="character" w:customStyle="1" w:styleId="TtuloCarter">
+    <w:name w:val="Título Caráter"/>
+    <w:basedOn w:val="Tipodeletrapredefinidodopargrafo"/>
+    <w:link w:val="Ttulo"/>
     <w:uiPriority w:val="10"/>
     <w:rsid w:val="00FC693F"/>
     <w:rPr>
@@ -3755,11 +3796,11 @@
       <w:szCs w:val="52"/>
     </w:rPr>
   </w:style>
-  <w:style w:type="paragraph" w:styleId="Subtitle">
+  <w:style w:type="paragraph" w:styleId="Subttulo">
     <w:name w:val="Subtitle"/>
     <w:basedOn w:val="Normal"/>
     <w:next w:val="Normal"/>
-    <w:link w:val="SubtitleChar"/>
+    <w:link w:val="SubttuloCarter"/>
     <w:uiPriority w:val="11"/>
     <w:qFormat/>
     <w:rsid w:val="00FC693F"/>
@@ -3778,10 +3819,10 @@
       <w:szCs w:val="24"/>
     </w:rPr>
   </w:style>
-  <w:style w:type="character" w:customStyle="1" w:styleId="SubtitleChar">
-    <w:name w:val="Subtitle Char"/>
-    <w:basedOn w:val="DefaultParagraphFont"/>
-    <w:link w:val="Subtitle"/>
+  <w:style w:type="character" w:customStyle="1" w:styleId="SubttuloCarter">
+    <w:name w:val="Subtítulo Caráter"/>
+    <w:basedOn w:val="Tipodeletrapredefinidodopargrafo"/>
+    <w:link w:val="Subttulo"/>
     <w:uiPriority w:val="11"/>
     <w:rsid w:val="00FC693F"/>
     <w:rPr>
@@ -3794,7 +3835,7 @@
       <w:szCs w:val="24"/>
     </w:rPr>
   </w:style>
-  <w:style w:type="paragraph" w:styleId="ListParagraph">
+  <w:style w:type="paragraph" w:styleId="PargrafodaLista">
     <w:name w:val="List Paragraph"/>
     <w:basedOn w:val="Normal"/>
     <w:uiPriority w:val="34"/>
@@ -3805,10 +3846,10 @@
       <w:contextualSpacing/>
     </w:pPr>
   </w:style>
-  <w:style w:type="paragraph" w:styleId="BodyText">
+  <w:style w:type="paragraph" w:styleId="Corpodetexto">
     <w:name w:val="Body Text"/>
     <w:basedOn w:val="Normal"/>
-    <w:link w:val="BodyTextChar"/>
+    <w:link w:val="CorpodetextoCarter"/>
     <w:uiPriority w:val="99"/>
     <w:unhideWhenUsed/>
     <w:rsid w:val="00AA1D8D"/>
@@ -3816,17 +3857,17 @@
       <w:spacing w:after="120"/>
     </w:pPr>
   </w:style>
-  <w:style w:type="character" w:customStyle="1" w:styleId="BodyTextChar">
-    <w:name w:val="Body Text Char"/>
-    <w:basedOn w:val="DefaultParagraphFont"/>
-    <w:link w:val="BodyText"/>
+  <w:style w:type="character" w:customStyle="1" w:styleId="CorpodetextoCarter">
+    <w:name w:val="Corpo de texto Caráter"/>
+    <w:basedOn w:val="Tipodeletrapredefinidodopargrafo"/>
+    <w:link w:val="Corpodetexto"/>
     <w:uiPriority w:val="99"/>
     <w:rsid w:val="00AA1D8D"/>
   </w:style>
-  <w:style w:type="paragraph" w:styleId="BodyText2">
+  <w:style w:type="paragraph" w:styleId="Corpodetexto2">
     <w:name w:val="Body Text 2"/>
     <w:basedOn w:val="Normal"/>
-    <w:link w:val="BodyText2Char"/>
+    <w:link w:val="Corpodetexto2Carter"/>
     <w:uiPriority w:val="99"/>
     <w:unhideWhenUsed/>
     <w:rsid w:val="00AA1D8D"/>
@@ -3834,17 +3875,17 @@
       <w:spacing w:after="120" w:line="480" w:lineRule="auto"/>
     </w:pPr>
   </w:style>
-  <w:style w:type="character" w:customStyle="1" w:styleId="BodyText2Char">
-    <w:name w:val="Body Text 2 Char"/>
-    <w:basedOn w:val="DefaultParagraphFont"/>
-    <w:link w:val="BodyText2"/>
+  <w:style w:type="character" w:customStyle="1" w:styleId="Corpodetexto2Carter">
+    <w:name w:val="Corpo de texto 2 Caráter"/>
+    <w:basedOn w:val="Tipodeletrapredefinidodopargrafo"/>
+    <w:link w:val="Corpodetexto2"/>
     <w:uiPriority w:val="99"/>
     <w:rsid w:val="00AA1D8D"/>
   </w:style>
-  <w:style w:type="paragraph" w:styleId="BodyText3">
+  <w:style w:type="paragraph" w:styleId="Corpodetexto3">
     <w:name w:val="Body Text 3"/>
     <w:basedOn w:val="Normal"/>
-    <w:link w:val="BodyText3Char"/>
+    <w:link w:val="Corpodetexto3Carter"/>
     <w:uiPriority w:val="99"/>
     <w:unhideWhenUsed/>
     <w:rsid w:val="00AA1D8D"/>
@@ -3856,10 +3897,10 @@
       <w:szCs w:val="16"/>
     </w:rPr>
   </w:style>
-  <w:style w:type="character" w:customStyle="1" w:styleId="BodyText3Char">
-    <w:name w:val="Body Text 3 Char"/>
-    <w:basedOn w:val="DefaultParagraphFont"/>
-    <w:link w:val="BodyText3"/>
+  <w:style w:type="character" w:customStyle="1" w:styleId="Corpodetexto3Carter">
+    <w:name w:val="Corpo de texto 3 Caráter"/>
+    <w:basedOn w:val="Tipodeletrapredefinidodopargrafo"/>
+    <w:link w:val="Corpodetexto3"/>
     <w:uiPriority w:val="99"/>
     <w:rsid w:val="00AA1D8D"/>
     <w:rPr>
@@ -3867,7 +3908,7 @@
       <w:szCs w:val="16"/>
     </w:rPr>
   </w:style>
-  <w:style w:type="paragraph" w:styleId="List">
+  <w:style w:type="paragraph" w:styleId="Lista">
     <w:name w:val="List"/>
     <w:basedOn w:val="Normal"/>
     <w:uiPriority w:val="99"/>
@@ -3878,7 +3919,7 @@
       <w:contextualSpacing/>
     </w:pPr>
   </w:style>
-  <w:style w:type="paragraph" w:styleId="List2">
+  <w:style w:type="paragraph" w:styleId="Lista2">
     <w:name w:val="List 2"/>
     <w:basedOn w:val="Normal"/>
     <w:uiPriority w:val="99"/>
@@ -3889,7 +3930,7 @@
       <w:contextualSpacing/>
     </w:pPr>
   </w:style>
-  <w:style w:type="paragraph" w:styleId="List3">
+  <w:style w:type="paragraph" w:styleId="Lista3">
     <w:name w:val="List 3"/>
     <w:basedOn w:val="Normal"/>
     <w:uiPriority w:val="99"/>
@@ -3900,7 +3941,7 @@
       <w:contextualSpacing/>
     </w:pPr>
   </w:style>
-  <w:style w:type="paragraph" w:styleId="ListBullet">
+  <w:style w:type="paragraph" w:styleId="Listacommarcas">
     <w:name w:val="List Bullet"/>
     <w:basedOn w:val="Normal"/>
     <w:uiPriority w:val="99"/>
@@ -3913,7 +3954,7 @@
       <w:contextualSpacing/>
     </w:pPr>
   </w:style>
-  <w:style w:type="paragraph" w:styleId="ListBullet2">
+  <w:style w:type="paragraph" w:styleId="Listacommarcas2">
     <w:name w:val="List Bullet 2"/>
     <w:basedOn w:val="Normal"/>
     <w:uiPriority w:val="99"/>
@@ -3926,7 +3967,7 @@
       <w:contextualSpacing/>
     </w:pPr>
   </w:style>
-  <w:style w:type="paragraph" w:styleId="ListBullet3">
+  <w:style w:type="paragraph" w:styleId="Listacommarcas3">
     <w:name w:val="List Bullet 3"/>
     <w:basedOn w:val="Normal"/>
     <w:uiPriority w:val="99"/>
@@ -3939,7 +3980,7 @@
       <w:contextualSpacing/>
     </w:pPr>
   </w:style>
-  <w:style w:type="paragraph" w:styleId="ListNumber">
+  <w:style w:type="paragraph" w:styleId="Listanumerada">
     <w:name w:val="List Number"/>
     <w:basedOn w:val="Normal"/>
     <w:uiPriority w:val="99"/>
@@ -3952,7 +3993,7 @@
       <w:contextualSpacing/>
     </w:pPr>
   </w:style>
-  <w:style w:type="paragraph" w:styleId="ListNumber2">
+  <w:style w:type="paragraph" w:styleId="Listanumerada2">
     <w:name w:val="List Number 2"/>
     <w:basedOn w:val="Normal"/>
     <w:uiPriority w:val="99"/>
@@ -3965,7 +4006,7 @@
       <w:contextualSpacing/>
     </w:pPr>
   </w:style>
-  <w:style w:type="paragraph" w:styleId="ListNumber3">
+  <w:style w:type="paragraph" w:styleId="Listanumerada3">
     <w:name w:val="List Number 3"/>
     <w:basedOn w:val="Normal"/>
     <w:uiPriority w:val="99"/>
@@ -3978,7 +4019,7 @@
       <w:contextualSpacing/>
     </w:pPr>
   </w:style>
-  <w:style w:type="paragraph" w:styleId="ListContinue">
+  <w:style w:type="paragraph" w:styleId="Listadecont">
     <w:name w:val="List Continue"/>
     <w:basedOn w:val="Normal"/>
     <w:uiPriority w:val="99"/>
@@ -3990,7 +4031,7 @@
       <w:contextualSpacing/>
     </w:pPr>
   </w:style>
-  <w:style w:type="paragraph" w:styleId="ListContinue2">
+  <w:style w:type="paragraph" w:styleId="Listadecont2">
     <w:name w:val="List Continue 2"/>
     <w:basedOn w:val="Normal"/>
     <w:uiPriority w:val="99"/>
@@ -4002,7 +4043,7 @@
       <w:contextualSpacing/>
     </w:pPr>
   </w:style>
-  <w:style w:type="paragraph" w:styleId="ListContinue3">
+  <w:style w:type="paragraph" w:styleId="Listadecont3">
     <w:name w:val="List Continue 3"/>
     <w:basedOn w:val="Normal"/>
     <w:uiPriority w:val="99"/>
@@ -4014,9 +4055,9 @@
       <w:contextualSpacing/>
     </w:pPr>
   </w:style>
-  <w:style w:type="paragraph" w:styleId="MacroText">
+  <w:style w:type="paragraph" w:styleId="Textodemacro">
     <w:name w:val="macro"/>
-    <w:link w:val="MacroTextChar"/>
+    <w:link w:val="TextodemacroCarter"/>
     <w:uiPriority w:val="99"/>
     <w:unhideWhenUsed/>
     <w:rsid w:val="0029639D"/>
@@ -4037,10 +4078,10 @@
       <w:szCs w:val="20"/>
     </w:rPr>
   </w:style>
-  <w:style w:type="character" w:customStyle="1" w:styleId="MacroTextChar">
-    <w:name w:val="Macro Text Char"/>
-    <w:basedOn w:val="DefaultParagraphFont"/>
-    <w:link w:val="MacroText"/>
+  <w:style w:type="character" w:customStyle="1" w:styleId="TextodemacroCarter">
+    <w:name w:val="Texto de macro Caráter"/>
+    <w:basedOn w:val="Tipodeletrapredefinidodopargrafo"/>
+    <w:link w:val="Textodemacro"/>
     <w:uiPriority w:val="99"/>
     <w:rsid w:val="0029639D"/>
     <w:rPr>
@@ -4049,11 +4090,11 @@
       <w:szCs w:val="20"/>
     </w:rPr>
   </w:style>
-  <w:style w:type="paragraph" w:styleId="Quote">
+  <w:style w:type="paragraph" w:styleId="Citao">
     <w:name w:val="Quote"/>
     <w:basedOn w:val="Normal"/>
     <w:next w:val="Normal"/>
-    <w:link w:val="QuoteChar"/>
+    <w:link w:val="CitaoCarter"/>
     <w:uiPriority w:val="29"/>
     <w:qFormat/>
     <w:rsid w:val="00FC693F"/>
@@ -4063,10 +4104,10 @@
       <w:color w:val="000000" w:themeColor="text1"/>
     </w:rPr>
   </w:style>
-  <w:style w:type="character" w:customStyle="1" w:styleId="QuoteChar">
-    <w:name w:val="Quote Char"/>
-    <w:basedOn w:val="DefaultParagraphFont"/>
-    <w:link w:val="Quote"/>
+  <w:style w:type="character" w:customStyle="1" w:styleId="CitaoCarter">
+    <w:name w:val="Citação Caráter"/>
+    <w:basedOn w:val="Tipodeletrapredefinidodopargrafo"/>
+    <w:link w:val="Citao"/>
     <w:uiPriority w:val="29"/>
     <w:rsid w:val="00FC693F"/>
     <w:rPr>
@@ -4075,10 +4116,10 @@
       <w:color w:val="000000" w:themeColor="text1"/>
     </w:rPr>
   </w:style>
-  <w:style w:type="character" w:customStyle="1" w:styleId="Heading4Char">
-    <w:name w:val="Heading 4 Char"/>
-    <w:basedOn w:val="DefaultParagraphFont"/>
-    <w:link w:val="Heading4"/>
+  <w:style w:type="character" w:customStyle="1" w:styleId="Ttulo4Carter">
+    <w:name w:val="Título 4 Caráter"/>
+    <w:basedOn w:val="Tipodeletrapredefinidodopargrafo"/>
+    <w:link w:val="Ttulo4"/>
     <w:uiPriority w:val="9"/>
     <w:semiHidden/>
     <w:rsid w:val="00FC693F"/>
@@ -4091,10 +4132,10 @@
       <w:color w:val="4F81BD" w:themeColor="accent1"/>
     </w:rPr>
   </w:style>
-  <w:style w:type="character" w:customStyle="1" w:styleId="Heading5Char">
-    <w:name w:val="Heading 5 Char"/>
-    <w:basedOn w:val="DefaultParagraphFont"/>
-    <w:link w:val="Heading5"/>
+  <w:style w:type="character" w:customStyle="1" w:styleId="Ttulo5Carter">
+    <w:name w:val="Título 5 Caráter"/>
+    <w:basedOn w:val="Tipodeletrapredefinidodopargrafo"/>
+    <w:link w:val="Ttulo5"/>
     <w:uiPriority w:val="9"/>
     <w:semiHidden/>
     <w:rsid w:val="00FC693F"/>
@@ -4103,10 +4144,10 @@
       <w:color w:val="243F60" w:themeColor="accent1" w:themeShade="7F"/>
     </w:rPr>
   </w:style>
-  <w:style w:type="character" w:customStyle="1" w:styleId="Heading6Char">
-    <w:name w:val="Heading 6 Char"/>
-    <w:basedOn w:val="DefaultParagraphFont"/>
-    <w:link w:val="Heading6"/>
+  <w:style w:type="character" w:customStyle="1" w:styleId="Ttulo6Carter">
+    <w:name w:val="Título 6 Caráter"/>
+    <w:basedOn w:val="Tipodeletrapredefinidodopargrafo"/>
+    <w:link w:val="Ttulo6"/>
     <w:uiPriority w:val="9"/>
     <w:semiHidden/>
     <w:rsid w:val="00FC693F"/>
@@ -4117,10 +4158,10 @@
       <w:color w:val="243F60" w:themeColor="accent1" w:themeShade="7F"/>
     </w:rPr>
   </w:style>
-  <w:style w:type="character" w:customStyle="1" w:styleId="Heading7Char">
-    <w:name w:val="Heading 7 Char"/>
-    <w:basedOn w:val="DefaultParagraphFont"/>
-    <w:link w:val="Heading7"/>
+  <w:style w:type="character" w:customStyle="1" w:styleId="Ttulo7Carter">
+    <w:name w:val="Título 7 Caráter"/>
+    <w:basedOn w:val="Tipodeletrapredefinidodopargrafo"/>
+    <w:link w:val="Ttulo7"/>
     <w:uiPriority w:val="9"/>
     <w:semiHidden/>
     <w:rsid w:val="00FC693F"/>
@@ -4131,10 +4172,10 @@
       <w:color w:val="404040" w:themeColor="text1" w:themeTint="BF"/>
     </w:rPr>
   </w:style>
-  <w:style w:type="character" w:customStyle="1" w:styleId="Heading8Char">
-    <w:name w:val="Heading 8 Char"/>
-    <w:basedOn w:val="DefaultParagraphFont"/>
-    <w:link w:val="Heading8"/>
+  <w:style w:type="character" w:customStyle="1" w:styleId="Ttulo8Carter">
+    <w:name w:val="Título 8 Caráter"/>
+    <w:basedOn w:val="Tipodeletrapredefinidodopargrafo"/>
+    <w:link w:val="Ttulo8"/>
     <w:uiPriority w:val="9"/>
     <w:semiHidden/>
     <w:rsid w:val="00FC693F"/>
@@ -4145,10 +4186,10 @@
       <w:szCs w:val="20"/>
     </w:rPr>
   </w:style>
-  <w:style w:type="character" w:customStyle="1" w:styleId="Heading9Char">
-    <w:name w:val="Heading 9 Char"/>
-    <w:basedOn w:val="DefaultParagraphFont"/>
-    <w:link w:val="Heading9"/>
+  <w:style w:type="character" w:customStyle="1" w:styleId="Ttulo9Carter">
+    <w:name w:val="Título 9 Caráter"/>
+    <w:basedOn w:val="Tipodeletrapredefinidodopargrafo"/>
+    <w:link w:val="Ttulo9"/>
     <w:uiPriority w:val="9"/>
     <w:semiHidden/>
     <w:rsid w:val="00FC693F"/>
@@ -4161,7 +4202,7 @@
       <w:szCs w:val="20"/>
     </w:rPr>
   </w:style>
-  <w:style w:type="paragraph" w:styleId="Caption">
+  <w:style w:type="paragraph" w:styleId="Legenda">
     <w:name w:val="caption"/>
     <w:basedOn w:val="Normal"/>
     <w:next w:val="Normal"/>
@@ -4181,9 +4222,9 @@
       <w:szCs w:val="18"/>
     </w:rPr>
   </w:style>
-  <w:style w:type="character" w:styleId="Strong">
+  <w:style w:type="character" w:styleId="Forte">
     <w:name w:val="Strong"/>
-    <w:basedOn w:val="DefaultParagraphFont"/>
+    <w:basedOn w:val="Tipodeletrapredefinidodopargrafo"/>
     <w:uiPriority w:val="22"/>
     <w:qFormat/>
     <w:rsid w:val="00FC693F"/>
@@ -4192,9 +4233,9 @@
       <w:bCs/>
     </w:rPr>
   </w:style>
-  <w:style w:type="character" w:styleId="Emphasis">
+  <w:style w:type="character" w:styleId="nfase">
     <w:name w:val="Emphasis"/>
-    <w:basedOn w:val="DefaultParagraphFont"/>
+    <w:basedOn w:val="Tipodeletrapredefinidodopargrafo"/>
     <w:uiPriority w:val="20"/>
     <w:qFormat/>
     <w:rsid w:val="00FC693F"/>
@@ -4203,11 +4244,11 @@
       <w:iCs/>
     </w:rPr>
   </w:style>
-  <w:style w:type="paragraph" w:styleId="IntenseQuote">
+  <w:style w:type="paragraph" w:styleId="CitaoIntensa">
     <w:name w:val="Intense Quote"/>
     <w:basedOn w:val="Normal"/>
     <w:next w:val="Normal"/>
-    <w:link w:val="IntenseQuoteChar"/>
+    <w:link w:val="CitaoIntensaCarter"/>
     <w:uiPriority w:val="30"/>
     <w:qFormat/>
     <w:rsid w:val="00FC693F"/>
@@ -4226,10 +4267,10 @@
       <w:color w:val="4F81BD" w:themeColor="accent1"/>
     </w:rPr>
   </w:style>
-  <w:style w:type="character" w:customStyle="1" w:styleId="IntenseQuoteChar">
-    <w:name w:val="Intense Quote Char"/>
-    <w:basedOn w:val="DefaultParagraphFont"/>
-    <w:link w:val="IntenseQuote"/>
+  <w:style w:type="character" w:customStyle="1" w:styleId="CitaoIntensaCarter">
+    <w:name w:val="Citação Intensa Caráter"/>
+    <w:basedOn w:val="Tipodeletrapredefinidodopargrafo"/>
+    <w:link w:val="CitaoIntensa"/>
     <w:uiPriority w:val="30"/>
     <w:rsid w:val="00FC693F"/>
     <w:rPr>
@@ -4240,9 +4281,9 @@
       <w:color w:val="4F81BD" w:themeColor="accent1"/>
     </w:rPr>
   </w:style>
-  <w:style w:type="character" w:styleId="SubtleEmphasis">
+  <w:style w:type="character" w:styleId="nfaseDiscreta">
     <w:name w:val="Subtle Emphasis"/>
-    <w:basedOn w:val="DefaultParagraphFont"/>
+    <w:basedOn w:val="Tipodeletrapredefinidodopargrafo"/>
     <w:uiPriority w:val="19"/>
     <w:qFormat/>
     <w:rsid w:val="00FC693F"/>
@@ -4252,9 +4293,9 @@
       <w:color w:val="808080" w:themeColor="text1" w:themeTint="7F"/>
     </w:rPr>
   </w:style>
-  <w:style w:type="character" w:styleId="IntenseEmphasis">
+  <w:style w:type="character" w:styleId="nfaseIntensa">
     <w:name w:val="Intense Emphasis"/>
-    <w:basedOn w:val="DefaultParagraphFont"/>
+    <w:basedOn w:val="Tipodeletrapredefinidodopargrafo"/>
     <w:uiPriority w:val="21"/>
     <w:qFormat/>
     <w:rsid w:val="00FC693F"/>
@@ -4266,9 +4307,9 @@
       <w:color w:val="4F81BD" w:themeColor="accent1"/>
     </w:rPr>
   </w:style>
-  <w:style w:type="character" w:styleId="SubtleReference">
+  <w:style w:type="character" w:styleId="RefernciaDiscreta">
     <w:name w:val="Subtle Reference"/>
-    <w:basedOn w:val="DefaultParagraphFont"/>
+    <w:basedOn w:val="Tipodeletrapredefinidodopargrafo"/>
     <w:uiPriority w:val="31"/>
     <w:qFormat/>
     <w:rsid w:val="00FC693F"/>
@@ -4278,9 +4319,9 @@
       <w:u w:val="single"/>
     </w:rPr>
   </w:style>
-  <w:style w:type="character" w:styleId="IntenseReference">
+  <w:style w:type="character" w:styleId="RefernciaIntensa">
     <w:name w:val="Intense Reference"/>
-    <w:basedOn w:val="DefaultParagraphFont"/>
+    <w:basedOn w:val="Tipodeletrapredefinidodopargrafo"/>
     <w:uiPriority w:val="32"/>
     <w:qFormat/>
     <w:rsid w:val="00FC693F"/>
@@ -4293,9 +4334,9 @@
       <w:u w:val="single"/>
     </w:rPr>
   </w:style>
-  <w:style w:type="character" w:styleId="BookTitle">
+  <w:style w:type="character" w:styleId="TtulodoLivro">
     <w:name w:val="Book Title"/>
-    <w:basedOn w:val="DefaultParagraphFont"/>
+    <w:basedOn w:val="Tipodeletrapredefinidodopargrafo"/>
     <w:uiPriority w:val="33"/>
     <w:qFormat/>
     <w:rsid w:val="00FC693F"/>
@@ -4306,9 +4347,9 @@
       <w:spacing w:val="5"/>
     </w:rPr>
   </w:style>
-  <w:style w:type="paragraph" w:styleId="TOCHeading">
+  <w:style w:type="paragraph" w:styleId="Cabealhodondice">
     <w:name w:val="TOC Heading"/>
-    <w:basedOn w:val="Heading1"/>
+    <w:basedOn w:val="Ttulo1"/>
     <w:next w:val="Normal"/>
     <w:uiPriority w:val="39"/>
     <w:unhideWhenUsed/>
@@ -4318,9 +4359,9 @@
       <w:outlineLvl w:val="9"/>
     </w:pPr>
   </w:style>
-  <w:style w:type="table" w:styleId="TableGrid">
+  <w:style w:type="table" w:styleId="TabelacomGrelha">
     <w:name w:val="Table Grid"/>
-    <w:basedOn w:val="TableNormal"/>
+    <w:basedOn w:val="Tabelanormal"/>
     <w:uiPriority w:val="59"/>
     <w:rsid w:val="00FC693F"/>
     <w:pPr>
@@ -4337,9 +4378,9 @@
       </w:tblBorders>
     </w:tblPr>
   </w:style>
-  <w:style w:type="table" w:styleId="LightShading">
+  <w:style w:type="table" w:styleId="SombreadoClaro">
     <w:name w:val="Light Shading"/>
-    <w:basedOn w:val="TableNormal"/>
+    <w:basedOn w:val="Tabelanormal"/>
     <w:uiPriority w:val="60"/>
     <w:rsid w:val="00FC693F"/>
     <w:pPr>
@@ -4433,9 +4474,9 @@
       </w:tcPr>
     </w:tblStylePr>
   </w:style>
-  <w:style w:type="table" w:styleId="LightShading-Accent1">
+  <w:style w:type="table" w:styleId="SombreadoClaro-Cor1">
     <w:name w:val="Light Shading Accent 1"/>
-    <w:basedOn w:val="TableNormal"/>
+    <w:basedOn w:val="Tabelanormal"/>
     <w:uiPriority w:val="60"/>
     <w:rsid w:val="00FC693F"/>
     <w:pPr>
@@ -4529,9 +4570,9 @@
       </w:tcPr>
     </w:tblStylePr>
   </w:style>
-  <w:style w:type="table" w:styleId="LightShading-Accent2">
+  <w:style w:type="table" w:styleId="SombreadoClaro-Cor2">
     <w:name w:val="Light Shading Accent 2"/>
-    <w:basedOn w:val="TableNormal"/>
+    <w:basedOn w:val="Tabelanormal"/>
     <w:uiPriority w:val="60"/>
     <w:rsid w:val="00FC693F"/>
     <w:pPr>
@@ -4625,9 +4666,9 @@
       </w:tcPr>
     </w:tblStylePr>
   </w:style>
-  <w:style w:type="table" w:styleId="LightShading-Accent3">
+  <w:style w:type="table" w:styleId="SombreadoClaro-Cor3">
     <w:name w:val="Light Shading Accent 3"/>
-    <w:basedOn w:val="TableNormal"/>
+    <w:basedOn w:val="Tabelanormal"/>
     <w:uiPriority w:val="60"/>
     <w:rsid w:val="00FC693F"/>
     <w:pPr>
@@ -4721,9 +4762,9 @@
       </w:tcPr>
     </w:tblStylePr>
   </w:style>
-  <w:style w:type="table" w:styleId="LightShading-Accent4">
+  <w:style w:type="table" w:styleId="SombreadoClaro-Cor4">
     <w:name w:val="Light Shading Accent 4"/>
-    <w:basedOn w:val="TableNormal"/>
+    <w:basedOn w:val="Tabelanormal"/>
     <w:uiPriority w:val="60"/>
     <w:rsid w:val="00FC693F"/>
     <w:pPr>
@@ -4817,9 +4858,9 @@
       </w:tcPr>
     </w:tblStylePr>
   </w:style>
-  <w:style w:type="table" w:styleId="LightShading-Accent5">
+  <w:style w:type="table" w:styleId="SombreadoClaro-Cor5">
     <w:name w:val="Light Shading Accent 5"/>
-    <w:basedOn w:val="TableNormal"/>
+    <w:basedOn w:val="Tabelanormal"/>
     <w:uiPriority w:val="60"/>
     <w:rsid w:val="00FC693F"/>
     <w:pPr>
@@ -4913,9 +4954,9 @@
       </w:tcPr>
     </w:tblStylePr>
   </w:style>
-  <w:style w:type="table" w:styleId="LightShading-Accent6">
+  <w:style w:type="table" w:styleId="SombreadoClaro-Cor6">
     <w:name w:val="Light Shading Accent 6"/>
-    <w:basedOn w:val="TableNormal"/>
+    <w:basedOn w:val="Tabelanormal"/>
     <w:uiPriority w:val="60"/>
     <w:rsid w:val="00FC693F"/>
     <w:pPr>
@@ -5009,9 +5050,9 @@
       </w:tcPr>
     </w:tblStylePr>
   </w:style>
-  <w:style w:type="table" w:styleId="LightList">
+  <w:style w:type="table" w:styleId="ListaClara">
     <w:name w:val="Light List"/>
-    <w:basedOn w:val="TableNormal"/>
+    <w:basedOn w:val="Tabelanormal"/>
     <w:uiPriority w:val="61"/>
     <w:rsid w:val="00FC693F"/>
     <w:pPr>
@@ -5094,9 +5135,9 @@
       </w:tcPr>
     </w:tblStylePr>
   </w:style>
-  <w:style w:type="table" w:styleId="LightList-Accent1">
+  <w:style w:type="table" w:styleId="ListaClara-Cor1">
     <w:name w:val="Light List Accent 1"/>
-    <w:basedOn w:val="TableNormal"/>
+    <w:basedOn w:val="Tabelanormal"/>
     <w:uiPriority w:val="61"/>
     <w:rsid w:val="00FC693F"/>
     <w:pPr>
@@ -5179,9 +5220,9 @@
       </w:tcPr>
     </w:tblStylePr>
   </w:style>
-  <w:style w:type="table" w:styleId="LightList-Accent2">
+  <w:style w:type="table" w:styleId="ListaClara-Cor2">
     <w:name w:val="Light List Accent 2"/>
-    <w:basedOn w:val="TableNormal"/>
+    <w:basedOn w:val="Tabelanormal"/>
     <w:uiPriority w:val="61"/>
     <w:rsid w:val="00CB0664"/>
     <w:pPr>
@@ -5264,9 +5305,9 @@
       </w:tcPr>
     </w:tblStylePr>
   </w:style>
-  <w:style w:type="table" w:styleId="LightList-Accent3">
+  <w:style w:type="table" w:styleId="ListaClara-Cor3">
     <w:name w:val="Light List Accent 3"/>
-    <w:basedOn w:val="TableNormal"/>
+    <w:basedOn w:val="Tabelanormal"/>
     <w:uiPriority w:val="61"/>
     <w:rsid w:val="00CB0664"/>
     <w:pPr>
@@ -5349,9 +5390,9 @@
       </w:tcPr>
     </w:tblStylePr>
   </w:style>
-  <w:style w:type="table" w:styleId="LightList-Accent4">
+  <w:style w:type="table" w:styleId="ListaClara-Cor4">
     <w:name w:val="Light List Accent 4"/>
-    <w:basedOn w:val="TableNormal"/>
+    <w:basedOn w:val="Tabelanormal"/>
     <w:uiPriority w:val="61"/>
     <w:rsid w:val="00CB0664"/>
     <w:pPr>
@@ -5434,9 +5475,9 @@
       </w:tcPr>
     </w:tblStylePr>
   </w:style>
-  <w:style w:type="table" w:styleId="LightList-Accent5">
+  <w:style w:type="table" w:styleId="ListaClara-Cor5">
     <w:name w:val="Light List Accent 5"/>
-    <w:basedOn w:val="TableNormal"/>
+    <w:basedOn w:val="Tabelanormal"/>
     <w:uiPriority w:val="61"/>
     <w:rsid w:val="00CB0664"/>
     <w:pPr>
@@ -5519,9 +5560,9 @@
       </w:tcPr>
     </w:tblStylePr>
   </w:style>
-  <w:style w:type="table" w:styleId="LightList-Accent6">
+  <w:style w:type="table" w:styleId="ListaClara-Cor6">
     <w:name w:val="Light List Accent 6"/>
-    <w:basedOn w:val="TableNormal"/>
+    <w:basedOn w:val="Tabelanormal"/>
     <w:uiPriority w:val="61"/>
     <w:rsid w:val="00CB0664"/>
     <w:pPr>
@@ -5604,9 +5645,9 @@
       </w:tcPr>
     </w:tblStylePr>
   </w:style>
-  <w:style w:type="table" w:styleId="LightGrid">
+  <w:style w:type="table" w:styleId="GrelhaClara">
     <w:name w:val="Light Grid"/>
-    <w:basedOn w:val="TableNormal"/>
+    <w:basedOn w:val="Tabelanormal"/>
     <w:uiPriority w:val="62"/>
     <w:rsid w:val="00CB0664"/>
     <w:pPr>
@@ -5727,9 +5768,9 @@
       </w:tcPr>
     </w:tblStylePr>
   </w:style>
-  <w:style w:type="table" w:styleId="LightGrid-Accent1">
+  <w:style w:type="table" w:styleId="GrelhaClara-Cor1">
     <w:name w:val="Light Grid Accent 1"/>
-    <w:basedOn w:val="TableNormal"/>
+    <w:basedOn w:val="Tabelanormal"/>
     <w:uiPriority w:val="62"/>
     <w:rsid w:val="00CB0664"/>
     <w:pPr>
@@ -5850,9 +5891,9 @@
       </w:tcPr>
     </w:tblStylePr>
   </w:style>
-  <w:style w:type="table" w:styleId="LightGrid-Accent2">
+  <w:style w:type="table" w:styleId="GrelhaClara-Cor2">
     <w:name w:val="Light Grid Accent 2"/>
-    <w:basedOn w:val="TableNormal"/>
+    <w:basedOn w:val="Tabelanormal"/>
     <w:uiPriority w:val="62"/>
     <w:rsid w:val="00CB0664"/>
     <w:pPr>
@@ -5973,9 +6014,9 @@
       </w:tcPr>
     </w:tblStylePr>
   </w:style>
-  <w:style w:type="table" w:styleId="LightGrid-Accent3">
+  <w:style w:type="table" w:styleId="GrelhaClara-Cor3">
     <w:name w:val="Light Grid Accent 3"/>
-    <w:basedOn w:val="TableNormal"/>
+    <w:basedOn w:val="Tabelanormal"/>
     <w:uiPriority w:val="62"/>
     <w:rsid w:val="00CB0664"/>
     <w:pPr>
@@ -6096,9 +6137,9 @@
       </w:tcPr>
     </w:tblStylePr>
   </w:style>
-  <w:style w:type="table" w:styleId="LightGrid-Accent4">
+  <w:style w:type="table" w:styleId="GrelhaClara-Cor4">
     <w:name w:val="Light Grid Accent 4"/>
-    <w:basedOn w:val="TableNormal"/>
+    <w:basedOn w:val="Tabelanormal"/>
     <w:uiPriority w:val="62"/>
     <w:rsid w:val="00CB0664"/>
     <w:pPr>
@@ -6219,9 +6260,9 @@
       </w:tcPr>
     </w:tblStylePr>
   </w:style>
-  <w:style w:type="table" w:styleId="LightGrid-Accent5">
+  <w:style w:type="table" w:styleId="GrelhaClara-Cor5">
     <w:name w:val="Light Grid Accent 5"/>
-    <w:basedOn w:val="TableNormal"/>
+    <w:basedOn w:val="Tabelanormal"/>
     <w:uiPriority w:val="62"/>
     <w:rsid w:val="00CB0664"/>
     <w:pPr>
@@ -6342,9 +6383,9 @@
       </w:tcPr>
     </w:tblStylePr>
   </w:style>
-  <w:style w:type="table" w:styleId="LightGrid-Accent6">
+  <w:style w:type="table" w:styleId="GrelhaClara-Cor6">
     <w:name w:val="Light Grid Accent 6"/>
-    <w:basedOn w:val="TableNormal"/>
+    <w:basedOn w:val="Tabelanormal"/>
     <w:uiPriority w:val="62"/>
     <w:rsid w:val="00CB0664"/>
     <w:pPr>
@@ -6465,9 +6506,9 @@
       </w:tcPr>
     </w:tblStylePr>
   </w:style>
-  <w:style w:type="table" w:styleId="MediumShading1">
+  <w:style w:type="table" w:styleId="SombreadoMdio1">
     <w:name w:val="Medium Shading 1"/>
-    <w:basedOn w:val="TableNormal"/>
+    <w:basedOn w:val="Tabelanormal"/>
     <w:uiPriority w:val="63"/>
     <w:rsid w:val="00CB0664"/>
     <w:pPr>
@@ -6564,9 +6605,9 @@
       </w:tcPr>
     </w:tblStylePr>
   </w:style>
-  <w:style w:type="table" w:styleId="MediumShading1-Accent1">
+  <w:style w:type="table" w:styleId="SombreadoMdio1-Cor1">
     <w:name w:val="Medium Shading 1 Accent 1"/>
-    <w:basedOn w:val="TableNormal"/>
+    <w:basedOn w:val="Tabelanormal"/>
     <w:uiPriority w:val="63"/>
     <w:rsid w:val="00CB0664"/>
     <w:pPr>
@@ -6663,9 +6704,9 @@
       </w:tcPr>
     </w:tblStylePr>
   </w:style>
-  <w:style w:type="table" w:styleId="MediumShading1-Accent2">
+  <w:style w:type="table" w:styleId="SombreadoMdio1-Cor2">
     <w:name w:val="Medium Shading 1 Accent 2"/>
-    <w:basedOn w:val="TableNormal"/>
+    <w:basedOn w:val="Tabelanormal"/>
     <w:uiPriority w:val="63"/>
     <w:rsid w:val="00CB0664"/>
     <w:pPr>
@@ -6762,9 +6803,9 @@
       </w:tcPr>
     </w:tblStylePr>
   </w:style>
-  <w:style w:type="table" w:styleId="MediumShading1-Accent3">
+  <w:style w:type="table" w:styleId="SombreadoMdio1-Cor3">
     <w:name w:val="Medium Shading 1 Accent 3"/>
-    <w:basedOn w:val="TableNormal"/>
+    <w:basedOn w:val="Tabelanormal"/>
     <w:uiPriority w:val="63"/>
     <w:rsid w:val="00CB0664"/>
     <w:pPr>
@@ -6861,9 +6902,9 @@
       </w:tcPr>
     </w:tblStylePr>
   </w:style>
-  <w:style w:type="table" w:styleId="MediumShading1-Accent4">
+  <w:style w:type="table" w:styleId="SombreadoMdio1-Cor4">
     <w:name w:val="Medium Shading 1 Accent 4"/>
-    <w:basedOn w:val="TableNormal"/>
+    <w:basedOn w:val="Tabelanormal"/>
     <w:uiPriority w:val="63"/>
     <w:rsid w:val="00CB0664"/>
     <w:pPr>
@@ -6960,9 +7001,9 @@
       </w:tcPr>
     </w:tblStylePr>
   </w:style>
-  <w:style w:type="table" w:styleId="MediumShading1-Accent5">
+  <w:style w:type="table" w:styleId="SombreadoMdio1-Cor5">
     <w:name w:val="Medium Shading 1 Accent 5"/>
-    <w:basedOn w:val="TableNormal"/>
+    <w:basedOn w:val="Tabelanormal"/>
     <w:uiPriority w:val="63"/>
     <w:rsid w:val="00CB0664"/>
     <w:pPr>
@@ -7059,9 +7100,9 @@
       </w:tcPr>
     </w:tblStylePr>
   </w:style>
-  <w:style w:type="table" w:styleId="MediumShading1-Accent6">
+  <w:style w:type="table" w:styleId="SombreadoMdio1-Cor6">
     <w:name w:val="Medium Shading 1 Accent 6"/>
-    <w:basedOn w:val="TableNormal"/>
+    <w:basedOn w:val="Tabelanormal"/>
     <w:uiPriority w:val="63"/>
     <w:rsid w:val="00CB0664"/>
     <w:pPr>
@@ -7158,9 +7199,9 @@
       </w:tcPr>
     </w:tblStylePr>
   </w:style>
-  <w:style w:type="table" w:styleId="MediumShading2">
+  <w:style w:type="table" w:styleId="SombreadoMdio2">
     <w:name w:val="Medium Shading 2"/>
-    <w:basedOn w:val="TableNormal"/>
+    <w:basedOn w:val="Tabelanormal"/>
     <w:uiPriority w:val="64"/>
     <w:rsid w:val="00CB0664"/>
     <w:pPr>
@@ -7300,9 +7341,9 @@
       </w:tcPr>
     </w:tblStylePr>
   </w:style>
-  <w:style w:type="table" w:styleId="MediumShading2-Accent1">
+  <w:style w:type="table" w:styleId="SombreadoMdio2-Cor1">
     <w:name w:val="Medium Shading 2 Accent 1"/>
-    <w:basedOn w:val="TableNormal"/>
+    <w:basedOn w:val="Tabelanormal"/>
     <w:uiPriority w:val="64"/>
     <w:rsid w:val="00CB0664"/>
     <w:pPr>
@@ -7442,9 +7483,9 @@
       </w:tcPr>
     </w:tblStylePr>
   </w:style>
-  <w:style w:type="table" w:styleId="MediumShading2-Accent2">
+  <w:style w:type="table" w:styleId="SombreadoMdio2-Cor2">
     <w:name w:val="Medium Shading 2 Accent 2"/>
-    <w:basedOn w:val="TableNormal"/>
+    <w:basedOn w:val="Tabelanormal"/>
     <w:uiPriority w:val="64"/>
     <w:rsid w:val="00CB0664"/>
     <w:pPr>
@@ -7584,9 +7625,9 @@
       </w:tcPr>
     </w:tblStylePr>
   </w:style>
-  <w:style w:type="table" w:styleId="MediumShading2-Accent3">
+  <w:style w:type="table" w:styleId="SombreadoMdio2-Cor3">
     <w:name w:val="Medium Shading 2 Accent 3"/>
-    <w:basedOn w:val="TableNormal"/>
+    <w:basedOn w:val="Tabelanormal"/>
     <w:uiPriority w:val="64"/>
     <w:rsid w:val="00CB0664"/>
     <w:pPr>
@@ -7726,9 +7767,9 @@
       </w:tcPr>
     </w:tblStylePr>
   </w:style>
-  <w:style w:type="table" w:styleId="MediumShading2-Accent4">
+  <w:style w:type="table" w:styleId="SombreadoMdio2-Cor4">
     <w:name w:val="Medium Shading 2 Accent 4"/>
-    <w:basedOn w:val="TableNormal"/>
+    <w:basedOn w:val="Tabelanormal"/>
     <w:uiPriority w:val="64"/>
     <w:rsid w:val="00CB0664"/>
     <w:pPr>
@@ -7868,9 +7909,9 @@
       </w:tcPr>
     </w:tblStylePr>
   </w:style>
-  <w:style w:type="table" w:styleId="MediumShading2-Accent5">
+  <w:style w:type="table" w:styleId="SombreadoMdio2-Cor5">
     <w:name w:val="Medium Shading 2 Accent 5"/>
-    <w:basedOn w:val="TableNormal"/>
+    <w:basedOn w:val="Tabelanormal"/>
     <w:uiPriority w:val="64"/>
     <w:rsid w:val="00CB0664"/>
     <w:pPr>
@@ -8010,9 +8051,9 @@
       </w:tcPr>
     </w:tblStylePr>
   </w:style>
-  <w:style w:type="table" w:styleId="MediumShading2-Accent6">
+  <w:style w:type="table" w:styleId="SombreadoMdio2-Cor6">
     <w:name w:val="Medium Shading 2 Accent 6"/>
-    <w:basedOn w:val="TableNormal"/>
+    <w:basedOn w:val="Tabelanormal"/>
     <w:uiPriority w:val="64"/>
     <w:rsid w:val="00CB0664"/>
     <w:pPr>
@@ -8152,9 +8193,9 @@
       </w:tcPr>
     </w:tblStylePr>
   </w:style>
-  <w:style w:type="table" w:styleId="MediumList1">
+  <w:style w:type="table" w:styleId="ListaMdia1">
     <w:name w:val="Medium List 1"/>
-    <w:basedOn w:val="TableNormal"/>
+    <w:basedOn w:val="Tabelanormal"/>
     <w:uiPriority w:val="65"/>
     <w:rsid w:val="00CB0664"/>
     <w:pPr>
@@ -8229,9 +8270,9 @@
       </w:tcPr>
     </w:tblStylePr>
   </w:style>
-  <w:style w:type="table" w:styleId="MediumList1-Accent1">
+  <w:style w:type="table" w:styleId="ListaMdia1-Cor1">
     <w:name w:val="Medium List 1 Accent 1"/>
-    <w:basedOn w:val="TableNormal"/>
+    <w:basedOn w:val="Tabelanormal"/>
     <w:uiPriority w:val="65"/>
     <w:rsid w:val="00CB0664"/>
     <w:pPr>
@@ -8306,9 +8347,9 @@
       </w:tcPr>
     </w:tblStylePr>
   </w:style>
-  <w:style w:type="table" w:styleId="MediumList1-Accent2">
+  <w:style w:type="table" w:styleId="ListaMdia1-Cor2">
     <w:name w:val="Medium List 1 Accent 2"/>
-    <w:basedOn w:val="TableNormal"/>
+    <w:basedOn w:val="Tabelanormal"/>
     <w:uiPriority w:val="65"/>
     <w:rsid w:val="00CB0664"/>
     <w:pPr>
@@ -8383,9 +8424,9 @@
       </w:tcPr>
     </w:tblStylePr>
   </w:style>
-  <w:style w:type="table" w:styleId="MediumList1-Accent3">
+  <w:style w:type="table" w:styleId="ListaMdia1-Cor3">
     <w:name w:val="Medium List 1 Accent 3"/>
-    <w:basedOn w:val="TableNormal"/>
+    <w:basedOn w:val="Tabelanormal"/>
     <w:uiPriority w:val="65"/>
     <w:rsid w:val="00CB0664"/>
     <w:pPr>
@@ -8460,9 +8501,9 @@
       </w:tcPr>
     </w:tblStylePr>
   </w:style>
-  <w:style w:type="table" w:styleId="MediumList1-Accent4">
+  <w:style w:type="table" w:styleId="ListaMdia1-Cor4">
     <w:name w:val="Medium List 1 Accent 4"/>
-    <w:basedOn w:val="TableNormal"/>
+    <w:basedOn w:val="Tabelanormal"/>
     <w:uiPriority w:val="65"/>
     <w:rsid w:val="00CB0664"/>
     <w:pPr>
@@ -8537,9 +8578,9 @@
       </w:tcPr>
     </w:tblStylePr>
   </w:style>
-  <w:style w:type="table" w:styleId="MediumList1-Accent5">
+  <w:style w:type="table" w:styleId="ListaMdia1-Cor5">
     <w:name w:val="Medium List 1 Accent 5"/>
-    <w:basedOn w:val="TableNormal"/>
+    <w:basedOn w:val="Tabelanormal"/>
     <w:uiPriority w:val="65"/>
     <w:rsid w:val="00CB0664"/>
     <w:pPr>
@@ -8614,9 +8655,9 @@
       </w:tcPr>
     </w:tblStylePr>
   </w:style>
-  <w:style w:type="table" w:styleId="MediumList1-Accent6">
+  <w:style w:type="table" w:styleId="ListaMdia1-Cor6">
     <w:name w:val="Medium List 1 Accent 6"/>
-    <w:basedOn w:val="TableNormal"/>
+    <w:basedOn w:val="Tabelanormal"/>
     <w:uiPriority w:val="65"/>
     <w:rsid w:val="00CB0664"/>
     <w:pPr>
@@ -8691,9 +8732,9 @@
       </w:tcPr>
     </w:tblStylePr>
   </w:style>
-  <w:style w:type="table" w:styleId="MediumList2">
+  <w:style w:type="table" w:styleId="ListaMdia2">
     <w:name w:val="Medium List 2"/>
-    <w:basedOn w:val="TableNormal"/>
+    <w:basedOn w:val="Tabelanormal"/>
     <w:uiPriority w:val="66"/>
     <w:rsid w:val="00CB0664"/>
     <w:pPr>
@@ -8812,9 +8853,9 @@
       </w:tcPr>
     </w:tblStylePr>
   </w:style>
-  <w:style w:type="table" w:styleId="MediumList2-Accent1">
+  <w:style w:type="table" w:styleId="ListaMdia2-Cor1">
     <w:name w:val="Medium List 2 Accent 1"/>
-    <w:basedOn w:val="TableNormal"/>
+    <w:basedOn w:val="Tabelanormal"/>
     <w:uiPriority w:val="66"/>
     <w:rsid w:val="00CB0664"/>
     <w:pPr>
@@ -8933,9 +8974,9 @@
       </w:tcPr>
     </w:tblStylePr>
   </w:style>
-  <w:style w:type="table" w:styleId="MediumList2-Accent2">
+  <w:style w:type="table" w:styleId="ListaMdia2-Cor2">
     <w:name w:val="Medium List 2 Accent 2"/>
-    <w:basedOn w:val="TableNormal"/>
+    <w:basedOn w:val="Tabelanormal"/>
     <w:uiPriority w:val="66"/>
     <w:rsid w:val="00CB0664"/>
     <w:pPr>
@@ -9054,9 +9095,9 @@
       </w:tcPr>
     </w:tblStylePr>
   </w:style>
-  <w:style w:type="table" w:styleId="MediumList2-Accent3">
+  <w:style w:type="table" w:styleId="ListaMdia2-Cor3">
     <w:name w:val="Medium List 2 Accent 3"/>
-    <w:basedOn w:val="TableNormal"/>
+    <w:basedOn w:val="Tabelanormal"/>
     <w:uiPriority w:val="66"/>
     <w:rsid w:val="00CB0664"/>
     <w:pPr>
@@ -9175,9 +9216,9 @@
       </w:tcPr>
     </w:tblStylePr>
   </w:style>
-  <w:style w:type="table" w:styleId="MediumList2-Accent4">
+  <w:style w:type="table" w:styleId="ListaMdia2-Cor4">
     <w:name w:val="Medium List 2 Accent 4"/>
-    <w:basedOn w:val="TableNormal"/>
+    <w:basedOn w:val="Tabelanormal"/>
     <w:uiPriority w:val="66"/>
     <w:rsid w:val="00CB0664"/>
     <w:pPr>
@@ -9296,9 +9337,9 @@
       </w:tcPr>
     </w:tblStylePr>
   </w:style>
-  <w:style w:type="table" w:styleId="MediumList2-Accent5">
+  <w:style w:type="table" w:styleId="ListaMdia2-Cor5">
     <w:name w:val="Medium List 2 Accent 5"/>
-    <w:basedOn w:val="TableNormal"/>
+    <w:basedOn w:val="Tabelanormal"/>
     <w:uiPriority w:val="66"/>
     <w:rsid w:val="00CB0664"/>
     <w:pPr>
@@ -9417,9 +9458,9 @@
       </w:tcPr>
     </w:tblStylePr>
   </w:style>
-  <w:style w:type="table" w:styleId="MediumList2-Accent6">
+  <w:style w:type="table" w:styleId="ListaMdia2-Cor6">
     <w:name w:val="Medium List 2 Accent 6"/>
-    <w:basedOn w:val="TableNormal"/>
+    <w:basedOn w:val="Tabelanormal"/>
     <w:uiPriority w:val="66"/>
     <w:rsid w:val="00CB0664"/>
     <w:pPr>
@@ -9538,9 +9579,9 @@
       </w:tcPr>
     </w:tblStylePr>
   </w:style>
-  <w:style w:type="table" w:styleId="MediumGrid1">
+  <w:style w:type="table" w:styleId="GrelhaMdia1">
     <w:name w:val="Medium Grid 1"/>
-    <w:basedOn w:val="TableNormal"/>
+    <w:basedOn w:val="Tabelanormal"/>
     <w:uiPriority w:val="67"/>
     <w:rsid w:val="00CB0664"/>
     <w:pPr>
@@ -9604,9 +9645,9 @@
       </w:tcPr>
     </w:tblStylePr>
   </w:style>
-  <w:style w:type="table" w:styleId="MediumGrid1-Accent1">
+  <w:style w:type="table" w:styleId="GrelhaMdia1-Cor1">
     <w:name w:val="Medium Grid 1 Accent 1"/>
-    <w:basedOn w:val="TableNormal"/>
+    <w:basedOn w:val="Tabelanormal"/>
     <w:uiPriority w:val="67"/>
     <w:rsid w:val="00CB0664"/>
     <w:pPr>
@@ -9670,9 +9711,9 @@
       </w:tcPr>
     </w:tblStylePr>
   </w:style>
-  <w:style w:type="table" w:styleId="MediumGrid1-Accent2">
+  <w:style w:type="table" w:styleId="GrelhaMdia1-Cor2">
     <w:name w:val="Medium Grid 1 Accent 2"/>
-    <w:basedOn w:val="TableNormal"/>
+    <w:basedOn w:val="Tabelanormal"/>
     <w:uiPriority w:val="67"/>
     <w:rsid w:val="00CB0664"/>
     <w:pPr>
@@ -9736,9 +9777,9 @@
       </w:tcPr>
     </w:tblStylePr>
   </w:style>
-  <w:style w:type="table" w:styleId="MediumGrid1-Accent3">
+  <w:style w:type="table" w:styleId="GrelhaMdia1-Cor3">
     <w:name w:val="Medium Grid 1 Accent 3"/>
-    <w:basedOn w:val="TableNormal"/>
+    <w:basedOn w:val="Tabelanormal"/>
     <w:uiPriority w:val="67"/>
     <w:rsid w:val="00CB0664"/>
     <w:pPr>
@@ -9802,9 +9843,9 @@
       </w:tcPr>
     </w:tblStylePr>
   </w:style>
-  <w:style w:type="table" w:styleId="MediumGrid1-Accent4">
+  <w:style w:type="table" w:styleId="GrelhaMdia1-Cor4">
     <w:name w:val="Medium Grid 1 Accent 4"/>
-    <w:basedOn w:val="TableNormal"/>
+    <w:basedOn w:val="Tabelanormal"/>
     <w:uiPriority w:val="67"/>
     <w:rsid w:val="00CB0664"/>
     <w:pPr>
@@ -9868,9 +9909,9 @@
       </w:tcPr>
     </w:tblStylePr>
   </w:style>
-  <w:style w:type="table" w:styleId="MediumGrid1-Accent5">
+  <w:style w:type="table" w:styleId="GrelhaMdia1-Cor5">
     <w:name w:val="Medium Grid 1 Accent 5"/>
-    <w:basedOn w:val="TableNormal"/>
+    <w:basedOn w:val="Tabelanormal"/>
     <w:uiPriority w:val="67"/>
     <w:rsid w:val="00CB0664"/>
     <w:pPr>
@@ -9934,9 +9975,9 @@
       </w:tcPr>
     </w:tblStylePr>
   </w:style>
-  <w:style w:type="table" w:styleId="MediumGrid1-Accent6">
+  <w:style w:type="table" w:styleId="GrelhaMdia1-Cor6">
     <w:name w:val="Medium Grid 1 Accent 6"/>
-    <w:basedOn w:val="TableNormal"/>
+    <w:basedOn w:val="Tabelanormal"/>
     <w:uiPriority w:val="67"/>
     <w:rsid w:val="00CB0664"/>
     <w:pPr>
@@ -10000,9 +10041,9 @@
       </w:tcPr>
     </w:tblStylePr>
   </w:style>
-  <w:style w:type="table" w:styleId="MediumGrid2">
+  <w:style w:type="table" w:styleId="GrelhaMdia2">
     <w:name w:val="Medium Grid 2"/>
-    <w:basedOn w:val="TableNormal"/>
+    <w:basedOn w:val="Tabelanormal"/>
     <w:uiPriority w:val="68"/>
     <w:rsid w:val="00CB0664"/>
     <w:pPr>
@@ -10118,9 +10159,9 @@
       </w:tcPr>
     </w:tblStylePr>
   </w:style>
-  <w:style w:type="table" w:styleId="MediumGrid2-Accent1">
+  <w:style w:type="table" w:styleId="GrelhaMdia2-Cor1">
     <w:name w:val="Medium Grid 2 Accent 1"/>
-    <w:basedOn w:val="TableNormal"/>
+    <w:basedOn w:val="Tabelanormal"/>
     <w:uiPriority w:val="68"/>
     <w:rsid w:val="00CB0664"/>
     <w:pPr>
@@ -10236,9 +10277,9 @@
       </w:tcPr>
     </w:tblStylePr>
   </w:style>
-  <w:style w:type="table" w:styleId="MediumGrid2-Accent2">
+  <w:style w:type="table" w:styleId="GrelhaMdia2-Cor2">
     <w:name w:val="Medium Grid 2 Accent 2"/>
-    <w:basedOn w:val="TableNormal"/>
+    <w:basedOn w:val="Tabelanormal"/>
     <w:uiPriority w:val="68"/>
     <w:rsid w:val="00CB0664"/>
     <w:pPr>
@@ -10354,9 +10395,9 @@
       </w:tcPr>
     </w:tblStylePr>
   </w:style>
-  <w:style w:type="table" w:styleId="MediumGrid2-Accent3">
+  <w:style w:type="table" w:styleId="GrelhaMdia2-Cor3">
     <w:name w:val="Medium Grid 2 Accent 3"/>
-    <w:basedOn w:val="TableNormal"/>
+    <w:basedOn w:val="Tabelanormal"/>
     <w:uiPriority w:val="68"/>
     <w:rsid w:val="00CB0664"/>
     <w:pPr>
@@ -10472,9 +10513,9 @@
       </w:tcPr>
     </w:tblStylePr>
   </w:style>
-  <w:style w:type="table" w:styleId="MediumGrid2-Accent4">
+  <w:style w:type="table" w:styleId="GrelhaMdia2-Cor4">
     <w:name w:val="Medium Grid 2 Accent 4"/>
-    <w:basedOn w:val="TableNormal"/>
+    <w:basedOn w:val="Tabelanormal"/>
     <w:uiPriority w:val="68"/>
     <w:rsid w:val="00CB0664"/>
     <w:pPr>
@@ -10590,9 +10631,9 @@
       </w:tcPr>
     </w:tblStylePr>
   </w:style>
-  <w:style w:type="table" w:styleId="MediumGrid2-Accent5">
+  <w:style w:type="table" w:styleId="GrelhaMdia2-Cor5">
     <w:name w:val="Medium Grid 2 Accent 5"/>
-    <w:basedOn w:val="TableNormal"/>
+    <w:basedOn w:val="Tabelanormal"/>
     <w:uiPriority w:val="68"/>
     <w:rsid w:val="00CB0664"/>
     <w:pPr>
@@ -10708,9 +10749,9 @@
       </w:tcPr>
     </w:tblStylePr>
   </w:style>
-  <w:style w:type="table" w:styleId="MediumGrid2-Accent6">
+  <w:style w:type="table" w:styleId="GrelhaMdia2-Cor6">
     <w:name w:val="Medium Grid 2 Accent 6"/>
-    <w:basedOn w:val="TableNormal"/>
+    <w:basedOn w:val="Tabelanormal"/>
     <w:uiPriority w:val="68"/>
     <w:rsid w:val="00CB0664"/>
     <w:pPr>
@@ -10826,9 +10867,9 @@
       </w:tcPr>
     </w:tblStylePr>
   </w:style>
-  <w:style w:type="table" w:styleId="MediumGrid3">
+  <w:style w:type="table" w:styleId="GrelhaMdia3">
     <w:name w:val="Medium Grid 3"/>
-    <w:basedOn w:val="TableNormal"/>
+    <w:basedOn w:val="Tabelanormal"/>
     <w:uiPriority w:val="69"/>
     <w:rsid w:val="00CB0664"/>
     <w:pPr>
@@ -10960,9 +11001,9 @@
       </w:tcPr>
     </w:tblStylePr>
   </w:style>
-  <w:style w:type="table" w:styleId="MediumGrid3-Accent1">
+  <w:style w:type="table" w:styleId="GrelhaMdia3-Cor1">
     <w:name w:val="Medium Grid 3 Accent 1"/>
-    <w:basedOn w:val="TableNormal"/>
+    <w:basedOn w:val="Tabelanormal"/>
     <w:uiPriority w:val="69"/>
     <w:rsid w:val="00CB0664"/>
     <w:pPr>
@@ -11094,9 +11135,9 @@
       </w:tcPr>
     </w:tblStylePr>
   </w:style>
-  <w:style w:type="table" w:styleId="MediumGrid3-Accent2">
+  <w:style w:type="table" w:styleId="GrelhaMdia3-Cor2">
     <w:name w:val="Medium Grid 3 Accent 2"/>
-    <w:basedOn w:val="TableNormal"/>
+    <w:basedOn w:val="Tabelanormal"/>
     <w:uiPriority w:val="69"/>
     <w:rsid w:val="00CB0664"/>
     <w:pPr>
@@ -11228,9 +11269,9 @@
       </w:tcPr>
     </w:tblStylePr>
   </w:style>
-  <w:style w:type="table" w:styleId="MediumGrid3-Accent3">
+  <w:style w:type="table" w:styleId="GrelhaMdia3-Cor3">
     <w:name w:val="Medium Grid 3 Accent 3"/>
-    <w:basedOn w:val="TableNormal"/>
+    <w:basedOn w:val="Tabelanormal"/>
     <w:uiPriority w:val="69"/>
     <w:rsid w:val="00CB0664"/>
     <w:pPr>
@@ -11362,9 +11403,9 @@
       </w:tcPr>
     </w:tblStylePr>
   </w:style>
-  <w:style w:type="table" w:styleId="MediumGrid3-Accent4">
+  <w:style w:type="table" w:styleId="GrelhaMdia3-Cor4">
     <w:name w:val="Medium Grid 3 Accent 4"/>
-    <w:basedOn w:val="TableNormal"/>
+    <w:basedOn w:val="Tabelanormal"/>
     <w:uiPriority w:val="69"/>
     <w:rsid w:val="00CB0664"/>
     <w:pPr>
@@ -11496,9 +11537,9 @@
       </w:tcPr>
     </w:tblStylePr>
   </w:style>
-  <w:style w:type="table" w:styleId="MediumGrid3-Accent5">
+  <w:style w:type="table" w:styleId="GrelhaMdia3-Cor5">
     <w:name w:val="Medium Grid 3 Accent 5"/>
-    <w:basedOn w:val="TableNormal"/>
+    <w:basedOn w:val="Tabelanormal"/>
     <w:uiPriority w:val="69"/>
     <w:rsid w:val="00CB0664"/>
     <w:pPr>
@@ -11630,9 +11671,9 @@
       </w:tcPr>
     </w:tblStylePr>
   </w:style>
-  <w:style w:type="table" w:styleId="MediumGrid3-Accent6">
+  <w:style w:type="table" w:styleId="GrelhaMdia3-Cor6">
     <w:name w:val="Medium Grid 3 Accent 6"/>
-    <w:basedOn w:val="TableNormal"/>
+    <w:basedOn w:val="Tabelanormal"/>
     <w:uiPriority w:val="69"/>
     <w:rsid w:val="00CB0664"/>
     <w:pPr>
@@ -11764,9 +11805,9 @@
       </w:tcPr>
     </w:tblStylePr>
   </w:style>
-  <w:style w:type="table" w:styleId="DarkList">
+  <w:style w:type="table" w:styleId="ListaEscura">
     <w:name w:val="Dark List"/>
-    <w:basedOn w:val="TableNormal"/>
+    <w:basedOn w:val="Tabelanormal"/>
     <w:uiPriority w:val="70"/>
     <w:rsid w:val="00CB0664"/>
     <w:pPr>
@@ -11871,9 +11912,9 @@
       </w:tcPr>
     </w:tblStylePr>
   </w:style>
-  <w:style w:type="table" w:styleId="DarkList-Accent1">
+  <w:style w:type="table" w:styleId="ListaEscura-Cor1">
     <w:name w:val="Dark List Accent 1"/>
-    <w:basedOn w:val="TableNormal"/>
+    <w:basedOn w:val="Tabelanormal"/>
     <w:uiPriority w:val="70"/>
     <w:rsid w:val="00CB0664"/>
     <w:pPr>
@@ -11978,9 +12019,9 @@
       </w:tcPr>
     </w:tblStylePr>
   </w:style>
-  <w:style w:type="table" w:styleId="DarkList-Accent2">
+  <w:style w:type="table" w:styleId="ListaEscura-Cor2">
     <w:name w:val="Dark List Accent 2"/>
-    <w:basedOn w:val="TableNormal"/>
+    <w:basedOn w:val="Tabelanormal"/>
     <w:uiPriority w:val="70"/>
     <w:rsid w:val="00CB0664"/>
     <w:pPr>
@@ -12085,9 +12126,9 @@
       </w:tcPr>
     </w:tblStylePr>
   </w:style>
-  <w:style w:type="table" w:styleId="DarkList-Accent3">
+  <w:style w:type="table" w:styleId="ListaEscura-Cor3">
     <w:name w:val="Dark List Accent 3"/>
-    <w:basedOn w:val="TableNormal"/>
+    <w:basedOn w:val="Tabelanormal"/>
     <w:uiPriority w:val="70"/>
     <w:rsid w:val="00CB0664"/>
     <w:pPr>
@@ -12192,9 +12233,9 @@
       </w:tcPr>
     </w:tblStylePr>
   </w:style>
-  <w:style w:type="table" w:styleId="DarkList-Accent4">
+  <w:style w:type="table" w:styleId="ListaEscura-Cor4">
     <w:name w:val="Dark List Accent 4"/>
-    <w:basedOn w:val="TableNormal"/>
+    <w:basedOn w:val="Tabelanormal"/>
     <w:uiPriority w:val="70"/>
     <w:rsid w:val="00CB0664"/>
     <w:pPr>
@@ -12299,9 +12340,9 @@
       </w:tcPr>
     </w:tblStylePr>
   </w:style>
-  <w:style w:type="table" w:styleId="DarkList-Accent5">
+  <w:style w:type="table" w:styleId="ListaEscura-Cor5">
     <w:name w:val="Dark List Accent 5"/>
-    <w:basedOn w:val="TableNormal"/>
+    <w:basedOn w:val="Tabelanormal"/>
     <w:uiPriority w:val="70"/>
     <w:rsid w:val="00CB0664"/>
     <w:pPr>
@@ -12406,9 +12447,9 @@
       </w:tcPr>
     </w:tblStylePr>
   </w:style>
-  <w:style w:type="table" w:styleId="DarkList-Accent6">
+  <w:style w:type="table" w:styleId="ListaEscura-Cor6">
     <w:name w:val="Dark List Accent 6"/>
-    <w:basedOn w:val="TableNormal"/>
+    <w:basedOn w:val="Tabelanormal"/>
     <w:uiPriority w:val="70"/>
     <w:rsid w:val="00CB0664"/>
     <w:pPr>
@@ -12513,9 +12554,9 @@
       </w:tcPr>
     </w:tblStylePr>
   </w:style>
-  <w:style w:type="table" w:styleId="ColorfulShading">
+  <w:style w:type="table" w:styleId="SombreadoColorido">
     <w:name w:val="Colorful Shading"/>
-    <w:basedOn w:val="TableNormal"/>
+    <w:basedOn w:val="Tabelanormal"/>
     <w:uiPriority w:val="71"/>
     <w:rsid w:val="00CB0664"/>
     <w:pPr>
@@ -12628,9 +12669,9 @@
       </w:rPr>
     </w:tblStylePr>
   </w:style>
-  <w:style w:type="table" w:styleId="ColorfulShading-Accent1">
+  <w:style w:type="table" w:styleId="SombreadoColorido-Cor1">
     <w:name w:val="Colorful Shading Accent 1"/>
-    <w:basedOn w:val="TableNormal"/>
+    <w:basedOn w:val="Tabelanormal"/>
     <w:uiPriority w:val="71"/>
     <w:rsid w:val="00CB0664"/>
     <w:pPr>
@@ -12743,9 +12784,9 @@
       </w:rPr>
     </w:tblStylePr>
   </w:style>
-  <w:style w:type="table" w:styleId="ColorfulShading-Accent2">
+  <w:style w:type="table" w:styleId="SombreadoColorido-Cor2">
     <w:name w:val="Colorful Shading Accent 2"/>
-    <w:basedOn w:val="TableNormal"/>
+    <w:basedOn w:val="Tabelanormal"/>
     <w:uiPriority w:val="71"/>
     <w:rsid w:val="00CB0664"/>
     <w:pPr>
@@ -12858,9 +12899,9 @@
       </w:rPr>
     </w:tblStylePr>
   </w:style>
-  <w:style w:type="table" w:styleId="ColorfulShading-Accent3">
+  <w:style w:type="table" w:styleId="SombreadoColorido-Cor3">
     <w:name w:val="Colorful Shading Accent 3"/>
-    <w:basedOn w:val="TableNormal"/>
+    <w:basedOn w:val="Tabelanormal"/>
     <w:uiPriority w:val="71"/>
     <w:rsid w:val="00CB0664"/>
     <w:pPr>
@@ -12963,9 +13004,9 @@
       </w:tcPr>
     </w:tblStylePr>
   </w:style>
-  <w:style w:type="table" w:styleId="ColorfulShading-Accent4">
+  <w:style w:type="table" w:styleId="SombreadoColorido-Cor4">
     <w:name w:val="Colorful Shading Accent 4"/>
-    <w:basedOn w:val="TableNormal"/>
+    <w:basedOn w:val="Tabelanormal"/>
     <w:uiPriority w:val="71"/>
     <w:rsid w:val="00CB0664"/>
     <w:pPr>
@@ -13078,9 +13119,9 @@
       </w:rPr>
     </w:tblStylePr>
   </w:style>
-  <w:style w:type="table" w:styleId="ColorfulShading-Accent5">
+  <w:style w:type="table" w:styleId="SombreadoColorido-Cor5">
     <w:name w:val="Colorful Shading Accent 5"/>
-    <w:basedOn w:val="TableNormal"/>
+    <w:basedOn w:val="Tabelanormal"/>
     <w:uiPriority w:val="71"/>
     <w:rsid w:val="00CB0664"/>
     <w:pPr>
@@ -13193,9 +13234,9 @@
       </w:rPr>
     </w:tblStylePr>
   </w:style>
-  <w:style w:type="table" w:styleId="ColorfulShading-Accent6">
+  <w:style w:type="table" w:styleId="SombreadoColorido-Cor6">
     <w:name w:val="Colorful Shading Accent 6"/>
-    <w:basedOn w:val="TableNormal"/>
+    <w:basedOn w:val="Tabelanormal"/>
     <w:uiPriority w:val="71"/>
     <w:rsid w:val="00CB0664"/>
     <w:pPr>
@@ -13308,9 +13349,9 @@
       </w:rPr>
     </w:tblStylePr>
   </w:style>
-  <w:style w:type="table" w:styleId="ColorfulList">
+  <w:style w:type="table" w:styleId="ListaColorida">
     <w:name w:val="Colorful List"/>
-    <w:basedOn w:val="TableNormal"/>
+    <w:basedOn w:val="Tabelanormal"/>
     <w:uiPriority w:val="72"/>
     <w:rsid w:val="00CB0664"/>
     <w:pPr>
@@ -13387,9 +13428,9 @@
       </w:tcPr>
     </w:tblStylePr>
   </w:style>
-  <w:style w:type="table" w:styleId="ColorfulList-Accent1">
+  <w:style w:type="table" w:styleId="ListaColorida-Cor1">
     <w:name w:val="Colorful List Accent 1"/>
-    <w:basedOn w:val="TableNormal"/>
+    <w:basedOn w:val="Tabelanormal"/>
     <w:uiPriority w:val="72"/>
     <w:rsid w:val="00CB0664"/>
     <w:pPr>
@@ -13466,9 +13507,9 @@
       </w:tcPr>
     </w:tblStylePr>
   </w:style>
-  <w:style w:type="table" w:styleId="ColorfulList-Accent2">
+  <w:style w:type="table" w:styleId="ListaColorida-Cor2">
     <w:name w:val="Colorful List Accent 2"/>
-    <w:basedOn w:val="TableNormal"/>
+    <w:basedOn w:val="Tabelanormal"/>
     <w:uiPriority w:val="72"/>
     <w:rsid w:val="00CB0664"/>
     <w:pPr>
@@ -13545,9 +13586,9 @@
       </w:tcPr>
     </w:tblStylePr>
   </w:style>
-  <w:style w:type="table" w:styleId="ColorfulList-Accent3">
+  <w:style w:type="table" w:styleId="ListaColorida-Cor3">
     <w:name w:val="Colorful List Accent 3"/>
-    <w:basedOn w:val="TableNormal"/>
+    <w:basedOn w:val="Tabelanormal"/>
     <w:uiPriority w:val="72"/>
     <w:rsid w:val="00CB0664"/>
     <w:pPr>
@@ -13624,9 +13665,9 @@
       </w:tcPr>
     </w:tblStylePr>
   </w:style>
-  <w:style w:type="table" w:styleId="ColorfulList-Accent4">
+  <w:style w:type="table" w:styleId="ListaColorida-Cor4">
     <w:name w:val="Colorful List Accent 4"/>
-    <w:basedOn w:val="TableNormal"/>
+    <w:basedOn w:val="Tabelanormal"/>
     <w:uiPriority w:val="72"/>
     <w:rsid w:val="00CB0664"/>
     <w:pPr>
@@ -13703,9 +13744,9 @@
       </w:tcPr>
     </w:tblStylePr>
   </w:style>
-  <w:style w:type="table" w:styleId="ColorfulList-Accent5">
+  <w:style w:type="table" w:styleId="ListaColorida-Cor5">
     <w:name w:val="Colorful List Accent 5"/>
-    <w:basedOn w:val="TableNormal"/>
+    <w:basedOn w:val="Tabelanormal"/>
     <w:uiPriority w:val="72"/>
     <w:rsid w:val="00CB0664"/>
     <w:pPr>
@@ -13782,9 +13823,9 @@
       </w:tcPr>
     </w:tblStylePr>
   </w:style>
-  <w:style w:type="table" w:styleId="ColorfulList-Accent6">
+  <w:style w:type="table" w:styleId="ListaColorida-Cor6">
     <w:name w:val="Colorful List Accent 6"/>
-    <w:basedOn w:val="TableNormal"/>
+    <w:basedOn w:val="Tabelanormal"/>
     <w:uiPriority w:val="72"/>
     <w:rsid w:val="00CB0664"/>
     <w:pPr>
@@ -13861,9 +13902,9 @@
       </w:tcPr>
     </w:tblStylePr>
   </w:style>
-  <w:style w:type="table" w:styleId="ColorfulGrid">
+  <w:style w:type="table" w:styleId="GrelhaColorida">
     <w:name w:val="Colorful Grid"/>
-    <w:basedOn w:val="TableNormal"/>
+    <w:basedOn w:val="Tabelanormal"/>
     <w:uiPriority w:val="73"/>
     <w:rsid w:val="00CB0664"/>
     <w:pPr>
@@ -13934,9 +13975,9 @@
       </w:tcPr>
     </w:tblStylePr>
   </w:style>
-  <w:style w:type="table" w:styleId="ColorfulGrid-Accent1">
+  <w:style w:type="table" w:styleId="GrelhaColorida-Cor1">
     <w:name w:val="Colorful Grid Accent 1"/>
-    <w:basedOn w:val="TableNormal"/>
+    <w:basedOn w:val="Tabelanormal"/>
     <w:uiPriority w:val="73"/>
     <w:rsid w:val="00CB0664"/>
     <w:pPr>
@@ -14007,9 +14048,9 @@
       </w:tcPr>
     </w:tblStylePr>
   </w:style>
-  <w:style w:type="table" w:styleId="ColorfulGrid-Accent2">
+  <w:style w:type="table" w:styleId="GrelhaColorida-Cor2">
     <w:name w:val="Colorful Grid Accent 2"/>
-    <w:basedOn w:val="TableNormal"/>
+    <w:basedOn w:val="Tabelanormal"/>
     <w:uiPriority w:val="73"/>
     <w:rsid w:val="00CB0664"/>
     <w:pPr>
@@ -14080,9 +14121,9 @@
       </w:tcPr>
     </w:tblStylePr>
   </w:style>
-  <w:style w:type="table" w:styleId="ColorfulGrid-Accent3">
+  <w:style w:type="table" w:styleId="GrelhaColorida-Cor3">
     <w:name w:val="Colorful Grid Accent 3"/>
-    <w:basedOn w:val="TableNormal"/>
+    <w:basedOn w:val="Tabelanormal"/>
     <w:uiPriority w:val="73"/>
     <w:rsid w:val="00CB0664"/>
     <w:pPr>
@@ -14153,9 +14194,9 @@
       </w:tcPr>
     </w:tblStylePr>
   </w:style>
-  <w:style w:type="table" w:styleId="ColorfulGrid-Accent4">
+  <w:style w:type="table" w:styleId="GrelhaColorida-Cor4">
     <w:name w:val="Colorful Grid Accent 4"/>
-    <w:basedOn w:val="TableNormal"/>
+    <w:basedOn w:val="Tabelanormal"/>
     <w:uiPriority w:val="73"/>
     <w:rsid w:val="00CB0664"/>
     <w:pPr>
@@ -14226,9 +14267,9 @@
       </w:tcPr>
     </w:tblStylePr>
   </w:style>
-  <w:style w:type="table" w:styleId="ColorfulGrid-Accent5">
+  <w:style w:type="table" w:styleId="GrelhaColorida-Cor5">
     <w:name w:val="Colorful Grid Accent 5"/>
-    <w:basedOn w:val="TableNormal"/>
+    <w:basedOn w:val="Tabelanormal"/>
     <w:uiPriority w:val="73"/>
     <w:rsid w:val="00CB0664"/>
     <w:pPr>
@@ -14299,9 +14340,9 @@
       </w:tcPr>
     </w:tblStylePr>
   </w:style>
-  <w:style w:type="table" w:styleId="ColorfulGrid-Accent6">
+  <w:style w:type="table" w:styleId="GrelhaColorida-Cor6">
     <w:name w:val="Colorful Grid Accent 6"/>
-    <w:basedOn w:val="TableNormal"/>
+    <w:basedOn w:val="Tabelanormal"/>
     <w:uiPriority w:val="73"/>
     <w:rsid w:val="00CB0664"/>
     <w:pPr>
@@ -14372,7 +14413,7 @@
       </w:tcPr>
     </w:tblStylePr>
   </w:style>
-  <w:style w:type="paragraph" w:styleId="TOC1">
+  <w:style w:type="paragraph" w:styleId="ndice1">
     <w:name w:val="toc 1"/>
     <w:basedOn w:val="Normal"/>
     <w:next w:val="Normal"/>
@@ -14384,7 +14425,7 @@
       <w:spacing w:after="100"/>
     </w:pPr>
   </w:style>
-  <w:style w:type="paragraph" w:styleId="TOC2">
+  <w:style w:type="paragraph" w:styleId="ndice2">
     <w:name w:val="toc 2"/>
     <w:basedOn w:val="Normal"/>
     <w:next w:val="Normal"/>
@@ -14397,9 +14438,9 @@
       <w:ind w:left="220"/>
     </w:pPr>
   </w:style>
-  <w:style w:type="character" w:styleId="Hyperlink">
+  <w:style w:type="character" w:styleId="Hiperligao">
     <w:name w:val="Hyperlink"/>
-    <w:basedOn w:val="DefaultParagraphFont"/>
+    <w:basedOn w:val="Tipodeletrapredefinidodopargrafo"/>
     <w:uiPriority w:val="99"/>
     <w:unhideWhenUsed/>
     <w:rsid w:val="00807C79"/>
@@ -14408,7 +14449,7 @@
       <w:u w:val="single"/>
     </w:rPr>
   </w:style>
-  <w:style w:type="paragraph" w:styleId="TOC3">
+  <w:style w:type="paragraph" w:styleId="ndice3">
     <w:name w:val="toc 3"/>
     <w:basedOn w:val="Normal"/>
     <w:next w:val="Normal"/>
@@ -14439,557 +14480,6 @@
     </w:rPr>
   </w:style>
 </w:styles>
-</file>
-
-<file path=word/glossary/document.xml><?xml version="1.0" encoding="utf-8"?>
-<w:glossaryDocument xmlns:wpc="http://schemas.microsoft.com/office/word/2010/wordprocessingCanvas" xmlns:cx="http://schemas.microsoft.com/office/drawing/2014/chartex" xmlns:cx1="http://schemas.microsoft.com/office/drawing/2015/9/8/chartex" xmlns:mc="http://schemas.openxmlformats.org/markup-compatibility/2006" xmlns:o="urn:schemas-microsoft-com:office:office" xmlns:r="http://schemas.openxmlformats.org/officeDocument/2006/relationships" xmlns:m="http://schemas.openxmlformats.org/officeDocument/2006/math" xmlns:v="urn:schemas-microsoft-com:vml" xmlns:wp14="http://schemas.microsoft.com/office/word/2010/wordprocessingDrawing" xmlns:wp="http://schemas.openxmlformats.org/drawingml/2006/wordprocessingDrawing" xmlns:w10="urn:schemas-microsoft-com:office:word" xmlns:w="http://schemas.openxmlformats.org/wordprocessingml/2006/main" xmlns:w14="http://schemas.microsoft.com/office/word/2010/wordml" xmlns:w15="http://schemas.microsoft.com/office/word/2012/wordml" xmlns:w16se="http://schemas.microsoft.com/office/word/2015/wordml/symex" xmlns:wpg="http://schemas.microsoft.com/office/word/2010/wordprocessingGroup" xmlns:wpi="http://schemas.microsoft.com/office/word/2010/wordprocessingInk" xmlns:wne="http://schemas.microsoft.com/office/word/2006/wordml" xmlns:wps="http://schemas.microsoft.com/office/word/2010/wordprocessingShape" mc:Ignorable="w14 w15 w16se wp14"/>
-</file>
-
-<file path=word/glossary/fontTable.xml><?xml version="1.0" encoding="utf-8"?>
-<w:fonts xmlns:mc="http://schemas.openxmlformats.org/markup-compatibility/2006" xmlns:r="http://schemas.openxmlformats.org/officeDocument/2006/relationships" xmlns:w="http://schemas.openxmlformats.org/wordprocessingml/2006/main" xmlns:w14="http://schemas.microsoft.com/office/word/2010/wordml" xmlns:w15="http://schemas.microsoft.com/office/word/2012/wordml" xmlns:w16se="http://schemas.microsoft.com/office/word/2015/wordml/symex" mc:Ignorable="w14 w15 w16se">
-  <w:font w:name="Symbol">
-    <w:panose1 w:val="05050102010706020507"/>
-    <w:charset w:val="02"/>
-    <w:family w:val="roman"/>
-    <w:pitch w:val="variable"/>
-    <w:sig w:usb0="00000000" w:usb1="10000000" w:usb2="00000000" w:usb3="00000000" w:csb0="80000000" w:csb1="00000000"/>
-  </w:font>
-  <w:font w:name="Times New Roman">
-    <w:panose1 w:val="02020603050405020304"/>
-    <w:charset w:val="00"/>
-    <w:family w:val="roman"/>
-    <w:pitch w:val="variable"/>
-    <w:sig w:usb0="E0002AFF" w:usb1="C0007843" w:usb2="00000009" w:usb3="00000000" w:csb0="000001FF" w:csb1="00000000"/>
-  </w:font>
-  <w:font w:name="Cambria">
-    <w:panose1 w:val="02040503050406030204"/>
-    <w:charset w:val="00"/>
-    <w:family w:val="roman"/>
-    <w:pitch w:val="variable"/>
-    <w:sig w:usb0="A00002EF" w:usb1="4000004B" w:usb2="00000000" w:usb3="00000000" w:csb0="0000009F" w:csb1="00000000"/>
-  </w:font>
-  <w:font w:name="MS Mincho">
-    <w:altName w:val="Yu Gothic UI"/>
-    <w:panose1 w:val="02020609040205080304"/>
-    <w:charset w:val="80"/>
-    <w:family w:val="roman"/>
-    <w:notTrueType/>
-    <w:pitch w:val="fixed"/>
-    <w:sig w:usb0="00000001" w:usb1="08070000" w:usb2="00000010" w:usb3="00000000" w:csb0="00020000" w:csb1="00000000"/>
-  </w:font>
-  <w:font w:name="Calibri">
-    <w:panose1 w:val="020F0502020204030204"/>
-    <w:charset w:val="00"/>
-    <w:family w:val="swiss"/>
-    <w:pitch w:val="variable"/>
-    <w:sig w:usb0="E00002FF" w:usb1="4000ACFF" w:usb2="00000001" w:usb3="00000000" w:csb0="0000019F" w:csb1="00000000"/>
-  </w:font>
-  <w:font w:name="MS Gothic">
-    <w:altName w:val="ＭＳ ゴシック"/>
-    <w:panose1 w:val="020B0609070205080204"/>
-    <w:charset w:val="80"/>
-    <w:family w:val="modern"/>
-    <w:pitch w:val="fixed"/>
-    <w:sig w:usb0="E00002FF" w:usb1="6AC7FDFB" w:usb2="08000012" w:usb3="00000000" w:csb0="0002009F" w:csb1="00000000"/>
-  </w:font>
-  <w:font w:name="Courier">
-    <w:panose1 w:val="02070409020205020404"/>
-    <w:charset w:val="00"/>
-    <w:family w:val="auto"/>
-    <w:pitch w:val="variable"/>
-    <w:sig w:usb0="00000003" w:usb1="00000000" w:usb2="00000000" w:usb3="00000000" w:csb0="00000001" w:csb1="00000000"/>
-  </w:font>
-  <w:font w:name="Calibri Light">
-    <w:panose1 w:val="020F0302020204030204"/>
-    <w:charset w:val="00"/>
-    <w:family w:val="swiss"/>
-    <w:pitch w:val="variable"/>
-    <w:sig w:usb0="A00002EF" w:usb1="4000207B" w:usb2="00000000" w:usb3="00000000" w:csb0="0000009F" w:csb1="00000000"/>
-  </w:font>
-</w:fonts>
-</file>
-
-<file path=word/glossary/settings.xml><?xml version="1.0" encoding="utf-8"?>
-<w:settings xmlns:mc="http://schemas.openxmlformats.org/markup-compatibility/2006" xmlns:o="urn:schemas-microsoft-com:office:office" xmlns:r="http://schemas.openxmlformats.org/officeDocument/2006/relationships" xmlns:m="http://schemas.openxmlformats.org/officeDocument/2006/math" xmlns:v="urn:schemas-microsoft-com:vml" xmlns:w10="urn:schemas-microsoft-com:office:word" xmlns:w="http://schemas.openxmlformats.org/wordprocessingml/2006/main" xmlns:w14="http://schemas.microsoft.com/office/word/2010/wordml" xmlns:w15="http://schemas.microsoft.com/office/word/2012/wordml" xmlns:w16se="http://schemas.microsoft.com/office/word/2015/wordml/symex" xmlns:sl="http://schemas.openxmlformats.org/schemaLibrary/2006/main" mc:Ignorable="w14 w15 w16se">
-  <w:view w:val="normal"/>
-  <w:defaultTabStop w:val="708"/>
-  <w:hyphenationZone w:val="425"/>
-  <w:characterSpacingControl w:val="doNotCompress"/>
-  <w:compat>
-    <w:useFELayout/>
-    <w:compatSetting w:name="compatibilityMode" w:uri="http://schemas.microsoft.com/office/word" w:val="15"/>
-    <w:compatSetting w:name="overrideTableStyleFontSizeAndJustification" w:uri="http://schemas.microsoft.com/office/word" w:val="1"/>
-    <w:compatSetting w:name="enableOpenTypeFeatures" w:uri="http://schemas.microsoft.com/office/word" w:val="1"/>
-    <w:compatSetting w:name="doNotFlipMirrorIndents" w:uri="http://schemas.microsoft.com/office/word" w:val="1"/>
-    <w:compatSetting w:name="differentiateMultirowTableHeaders" w:uri="http://schemas.microsoft.com/office/word" w:val="1"/>
-  </w:compat>
-  <w:rsids>
-    <w:rsidRoot w:val="00650F46"/>
-    <w:rsid w:val="00144FCF"/>
-    <w:rsid w:val="00650F46"/>
-  </w:rsids>
-  <m:mathPr>
-    <m:mathFont m:val="Cambria Math"/>
-    <m:brkBin m:val="before"/>
-    <m:brkBinSub m:val="--"/>
-    <m:smallFrac m:val="0"/>
-    <m:dispDef/>
-    <m:lMargin m:val="0"/>
-    <m:rMargin m:val="0"/>
-    <m:defJc m:val="centerGroup"/>
-    <m:wrapIndent m:val="1440"/>
-    <m:intLim m:val="subSup"/>
-    <m:naryLim m:val="undOvr"/>
-  </m:mathPr>
-  <w:themeFontLang w:val="pt-PT"/>
-  <w:clrSchemeMapping w:bg1="light1" w:t1="dark1" w:bg2="light2" w:t2="dark2" w:accent1="accent1" w:accent2="accent2" w:accent3="accent3" w:accent4="accent4" w:accent5="accent5" w:accent6="accent6" w:hyperlink="hyperlink" w:followedHyperlink="followedHyperlink"/>
-  <w:decimalSymbol w:val=","/>
-  <w:listSeparator w:val=";"/>
-  <w15:chartTrackingRefBased/>
-</w:settings>
-</file>
-
-<file path=word/glossary/styles.xml><?xml version="1.0" encoding="utf-8"?>
-<w:styles xmlns:mc="http://schemas.openxmlformats.org/markup-compatibility/2006" xmlns:r="http://schemas.openxmlformats.org/officeDocument/2006/relationships" xmlns:w="http://schemas.openxmlformats.org/wordprocessingml/2006/main" xmlns:w14="http://schemas.microsoft.com/office/word/2010/wordml" xmlns:w15="http://schemas.microsoft.com/office/word/2012/wordml" xmlns:w16se="http://schemas.microsoft.com/office/word/2015/wordml/symex" mc:Ignorable="w14 w15 w16se">
-  <w:docDefaults>
-    <w:rPrDefault>
-      <w:rPr>
-        <w:rFonts w:asciiTheme="minorHAnsi" w:eastAsiaTheme="minorEastAsia" w:hAnsiTheme="minorHAnsi" w:cstheme="minorBidi"/>
-        <w:sz w:val="22"/>
-        <w:szCs w:val="22"/>
-        <w:lang w:val="pt-PT" w:eastAsia="pt-PT" w:bidi="ar-SA"/>
-      </w:rPr>
-    </w:rPrDefault>
-    <w:pPrDefault>
-      <w:pPr>
-        <w:spacing w:after="160" w:line="259" w:lineRule="auto"/>
-      </w:pPr>
-    </w:pPrDefault>
-  </w:docDefaults>
-  <w:latentStyles w:defLockedState="0" w:defUIPriority="99" w:defSemiHidden="0" w:defUnhideWhenUsed="0" w:defQFormat="0" w:count="371">
-    <w:lsdException w:name="Normal" w:uiPriority="0" w:qFormat="1"/>
-    <w:lsdException w:name="heading 1" w:uiPriority="9" w:qFormat="1"/>
-    <w:lsdException w:name="heading 2" w:semiHidden="1" w:uiPriority="9" w:unhideWhenUsed="1" w:qFormat="1"/>
-    <w:lsdException w:name="heading 3" w:semiHidden="1" w:uiPriority="9" w:unhideWhenUsed="1" w:qFormat="1"/>
-    <w:lsdException w:name="heading 4" w:semiHidden="1" w:uiPriority="9" w:unhideWhenUsed="1" w:qFormat="1"/>
-    <w:lsdException w:name="heading 5" w:semiHidden="1" w:uiPriority="9" w:unhideWhenUsed="1" w:qFormat="1"/>
-    <w:lsdException w:name="heading 6" w:semiHidden="1" w:uiPriority="9" w:unhideWhenUsed="1" w:qFormat="1"/>
-    <w:lsdException w:name="heading 7" w:semiHidden="1" w:uiPriority="9" w:unhideWhenUsed="1" w:qFormat="1"/>
-    <w:lsdException w:name="heading 8" w:semiHidden="1" w:uiPriority="9" w:unhideWhenUsed="1" w:qFormat="1"/>
-    <w:lsdException w:name="heading 9" w:semiHidden="1" w:uiPriority="9" w:unhideWhenUsed="1" w:qFormat="1"/>
-    <w:lsdException w:name="index 1" w:semiHidden="1" w:unhideWhenUsed="1"/>
-    <w:lsdException w:name="index 2" w:semiHidden="1" w:unhideWhenUsed="1"/>
-    <w:lsdException w:name="index 3" w:semiHidden="1" w:unhideWhenUsed="1"/>
-    <w:lsdException w:name="index 4" w:semiHidden="1" w:unhideWhenUsed="1"/>
-    <w:lsdException w:name="index 5" w:semiHidden="1" w:unhideWhenUsed="1"/>
-    <w:lsdException w:name="index 6" w:semiHidden="1" w:unhideWhenUsed="1"/>
-    <w:lsdException w:name="index 7" w:semiHidden="1" w:unhideWhenUsed="1"/>
-    <w:lsdException w:name="index 8" w:semiHidden="1" w:unhideWhenUsed="1"/>
-    <w:lsdException w:name="index 9" w:semiHidden="1" w:unhideWhenUsed="1"/>
-    <w:lsdException w:name="toc 1" w:semiHidden="1" w:uiPriority="39" w:unhideWhenUsed="1"/>
-    <w:lsdException w:name="toc 2" w:semiHidden="1" w:uiPriority="39" w:unhideWhenUsed="1"/>
-    <w:lsdException w:name="toc 3" w:semiHidden="1" w:uiPriority="39" w:unhideWhenUsed="1"/>
-    <w:lsdException w:name="toc 4" w:semiHidden="1" w:uiPriority="39" w:unhideWhenUsed="1"/>
-    <w:lsdException w:name="toc 5" w:semiHidden="1" w:uiPriority="39" w:unhideWhenUsed="1"/>
-    <w:lsdException w:name="toc 6" w:semiHidden="1" w:uiPriority="39" w:unhideWhenUsed="1"/>
-    <w:lsdException w:name="toc 7" w:semiHidden="1" w:uiPriority="39" w:unhideWhenUsed="1"/>
-    <w:lsdException w:name="toc 8" w:semiHidden="1" w:uiPriority="39" w:unhideWhenUsed="1"/>
-    <w:lsdException w:name="toc 9" w:semiHidden="1" w:uiPriority="39" w:unhideWhenUsed="1"/>
-    <w:lsdException w:name="Normal Indent" w:semiHidden="1" w:unhideWhenUsed="1"/>
-    <w:lsdException w:name="footnote text" w:semiHidden="1" w:unhideWhenUsed="1"/>
-    <w:lsdException w:name="annotation text" w:semiHidden="1" w:unhideWhenUsed="1"/>
-    <w:lsdException w:name="header" w:semiHidden="1" w:unhideWhenUsed="1"/>
-    <w:lsdException w:name="footer" w:semiHidden="1" w:unhideWhenUsed="1"/>
-    <w:lsdException w:name="index heading" w:semiHidden="1" w:unhideWhenUsed="1"/>
-    <w:lsdException w:name="caption" w:semiHidden="1" w:uiPriority="35" w:unhideWhenUsed="1" w:qFormat="1"/>
-    <w:lsdException w:name="table of figures" w:semiHidden="1" w:unhideWhenUsed="1"/>
-    <w:lsdException w:name="envelope address" w:semiHidden="1" w:unhideWhenUsed="1"/>
-    <w:lsdException w:name="envelope return" w:semiHidden="1" w:unhideWhenUsed="1"/>
-    <w:lsdException w:name="footnote reference" w:semiHidden="1" w:unhideWhenUsed="1"/>
-    <w:lsdException w:name="annotation reference" w:semiHidden="1" w:unhideWhenUsed="1"/>
-    <w:lsdException w:name="line number" w:semiHidden="1" w:unhideWhenUsed="1"/>
-    <w:lsdException w:name="page number" w:semiHidden="1" w:unhideWhenUsed="1"/>
-    <w:lsdException w:name="endnote reference" w:semiHidden="1" w:unhideWhenUsed="1"/>
-    <w:lsdException w:name="endnote text" w:semiHidden="1" w:unhideWhenUsed="1"/>
-    <w:lsdException w:name="table of authorities" w:semiHidden="1" w:unhideWhenUsed="1"/>
-    <w:lsdException w:name="macro" w:semiHidden="1" w:unhideWhenUsed="1"/>
-    <w:lsdException w:name="toa heading" w:semiHidden="1" w:unhideWhenUsed="1"/>
-    <w:lsdException w:name="List" w:semiHidden="1" w:unhideWhenUsed="1"/>
-    <w:lsdException w:name="List Bullet" w:semiHidden="1" w:unhideWhenUsed="1"/>
-    <w:lsdException w:name="List Number" w:semiHidden="1" w:unhideWhenUsed="1"/>
-    <w:lsdException w:name="List 2" w:semiHidden="1" w:unhideWhenUsed="1"/>
-    <w:lsdException w:name="List 3" w:semiHidden="1" w:unhideWhenUsed="1"/>
-    <w:lsdException w:name="List 4" w:semiHidden="1" w:unhideWhenUsed="1"/>
-    <w:lsdException w:name="List 5" w:semiHidden="1" w:unhideWhenUsed="1"/>
-    <w:lsdException w:name="List Bullet 2" w:semiHidden="1" w:unhideWhenUsed="1"/>
-    <w:lsdException w:name="List Bullet 3" w:semiHidden="1" w:unhideWhenUsed="1"/>
-    <w:lsdException w:name="List Bullet 4" w:semiHidden="1" w:unhideWhenUsed="1"/>
-    <w:lsdException w:name="List Bullet 5" w:semiHidden="1" w:unhideWhenUsed="1"/>
-    <w:lsdException w:name="List Number 2" w:semiHidden="1" w:unhideWhenUsed="1"/>
-    <w:lsdException w:name="List Number 3" w:semiHidden="1" w:unhideWhenUsed="1"/>
-    <w:lsdException w:name="List Number 4" w:semiHidden="1" w:unhideWhenUsed="1"/>
-    <w:lsdException w:name="List Number 5" w:semiHidden="1" w:unhideWhenUsed="1"/>
-    <w:lsdException w:name="Title" w:uiPriority="10" w:qFormat="1"/>
-    <w:lsdException w:name="Closing" w:semiHidden="1" w:unhideWhenUsed="1"/>
-    <w:lsdException w:name="Signature" w:semiHidden="1" w:unhideWhenUsed="1"/>
-    <w:lsdException w:name="Default Paragraph Font" w:semiHidden="1" w:uiPriority="1" w:unhideWhenUsed="1"/>
-    <w:lsdException w:name="Body Text" w:semiHidden="1" w:unhideWhenUsed="1"/>
-    <w:lsdException w:name="Body Text Indent" w:semiHidden="1" w:unhideWhenUsed="1"/>
-    <w:lsdException w:name="List Continue" w:semiHidden="1" w:unhideWhenUsed="1"/>
-    <w:lsdException w:name="List Continue 2" w:semiHidden="1" w:unhideWhenUsed="1"/>
-    <w:lsdException w:name="List Continue 3" w:semiHidden="1" w:unhideWhenUsed="1"/>
-    <w:lsdException w:name="List Continue 4" w:semiHidden="1" w:unhideWhenUsed="1"/>
-    <w:lsdException w:name="List Continue 5" w:semiHidden="1" w:unhideWhenUsed="1"/>
-    <w:lsdException w:name="Message Header" w:semiHidden="1" w:unhideWhenUsed="1"/>
-    <w:lsdException w:name="Subtitle" w:uiPriority="11" w:qFormat="1"/>
-    <w:lsdException w:name="Salutation" w:semiHidden="1" w:unhideWhenUsed="1"/>
-    <w:lsdException w:name="Date" w:semiHidden="1" w:unhideWhenUsed="1"/>
-    <w:lsdException w:name="Body Text First Indent" w:semiHidden="1" w:unhideWhenUsed="1"/>
-    <w:lsdException w:name="Body Text First Indent 2" w:semiHidden="1" w:unhideWhenUsed="1"/>
-    <w:lsdException w:name="Note Heading" w:semiHidden="1" w:unhideWhenUsed="1"/>
-    <w:lsdException w:name="Body Text 2" w:semiHidden="1" w:unhideWhenUsed="1"/>
-    <w:lsdException w:name="Body Text 3" w:semiHidden="1" w:unhideWhenUsed="1"/>
-    <w:lsdException w:name="Body Text Indent 2" w:semiHidden="1" w:unhideWhenUsed="1"/>
-    <w:lsdException w:name="Body Text Indent 3" w:semiHidden="1" w:unhideWhenUsed="1"/>
-    <w:lsdException w:name="Block Text" w:semiHidden="1" w:unhideWhenUsed="1"/>
-    <w:lsdException w:name="Hyperlink" w:semiHidden="1" w:unhideWhenUsed="1"/>
-    <w:lsdException w:name="FollowedHyperlink" w:semiHidden="1" w:unhideWhenUsed="1"/>
-    <w:lsdException w:name="Strong" w:uiPriority="22" w:qFormat="1"/>
-    <w:lsdException w:name="Emphasis" w:uiPriority="20" w:qFormat="1"/>
-    <w:lsdException w:name="Document Map" w:semiHidden="1" w:unhideWhenUsed="1"/>
-    <w:lsdException w:name="Plain Text" w:semiHidden="1" w:unhideWhenUsed="1"/>
-    <w:lsdException w:name="E-mail Signature" w:semiHidden="1" w:unhideWhenUsed="1"/>
-    <w:lsdException w:name="HTML Top of Form" w:semiHidden="1" w:unhideWhenUsed="1"/>
-    <w:lsdException w:name="HTML Bottom of Form" w:semiHidden="1" w:unhideWhenUsed="1"/>
-    <w:lsdException w:name="Normal (Web)" w:semiHidden="1" w:unhideWhenUsed="1"/>
-    <w:lsdException w:name="HTML Acronym" w:semiHidden="1" w:unhideWhenUsed="1"/>
-    <w:lsdException w:name="HTML Address" w:semiHidden="1" w:unhideWhenUsed="1"/>
-    <w:lsdException w:name="HTML Cite" w:semiHidden="1" w:unhideWhenUsed="1"/>
-    <w:lsdException w:name="HTML Code" w:semiHidden="1" w:unhideWhenUsed="1"/>
-    <w:lsdException w:name="HTML Definition" w:semiHidden="1" w:unhideWhenUsed="1"/>
-    <w:lsdException w:name="HTML Keyboard" w:semiHidden="1" w:unhideWhenUsed="1"/>
-    <w:lsdException w:name="HTML Preformatted" w:semiHidden="1" w:unhideWhenUsed="1"/>
-    <w:lsdException w:name="HTML Sample" w:semiHidden="1" w:unhideWhenUsed="1"/>
-    <w:lsdException w:name="HTML Typewriter" w:semiHidden="1" w:unhideWhenUsed="1"/>
-    <w:lsdException w:name="HTML Variable" w:semiHidden="1" w:unhideWhenUsed="1"/>
-    <w:lsdException w:name="Normal Table" w:semiHidden="1" w:unhideWhenUsed="1"/>
-    <w:lsdException w:name="annotation subject" w:semiHidden="1" w:unhideWhenUsed="1"/>
-    <w:lsdException w:name="No List" w:semiHidden="1" w:unhideWhenUsed="1"/>
-    <w:lsdException w:name="Outline List 1" w:semiHidden="1" w:unhideWhenUsed="1"/>
-    <w:lsdException w:name="Outline List 2" w:semiHidden="1" w:unhideWhenUsed="1"/>
-    <w:lsdException w:name="Outline List 3" w:semiHidden="1" w:unhideWhenUsed="1"/>
-    <w:lsdException w:name="Table Simple 1" w:semiHidden="1" w:unhideWhenUsed="1"/>
-    <w:lsdException w:name="Table Simple 2" w:semiHidden="1" w:unhideWhenUsed="1"/>
-    <w:lsdException w:name="Table Simple 3" w:semiHidden="1" w:unhideWhenUsed="1"/>
-    <w:lsdException w:name="Table Classic 1" w:semiHidden="1" w:unhideWhenUsed="1"/>
-    <w:lsdException w:name="Table Classic 2" w:semiHidden="1" w:unhideWhenUsed="1"/>
-    <w:lsdException w:name="Table Classic 3" w:semiHidden="1" w:unhideWhenUsed="1"/>
-    <w:lsdException w:name="Table Classic 4" w:semiHidden="1" w:unhideWhenUsed="1"/>
-    <w:lsdException w:name="Table Colorful 1" w:semiHidden="1" w:unhideWhenUsed="1"/>
-    <w:lsdException w:name="Table Colorful 2" w:semiHidden="1" w:unhideWhenUsed="1"/>
-    <w:lsdException w:name="Table Colorful 3" w:semiHidden="1" w:unhideWhenUsed="1"/>
-    <w:lsdException w:name="Table Columns 1" w:semiHidden="1" w:unhideWhenUsed="1"/>
-    <w:lsdException w:name="Table Columns 2" w:semiHidden="1" w:unhideWhenUsed="1"/>
-    <w:lsdException w:name="Table Columns 3" w:semiHidden="1" w:unhideWhenUsed="1"/>
-    <w:lsdException w:name="Table Columns 4" w:semiHidden="1" w:unhideWhenUsed="1"/>
-    <w:lsdException w:name="Table Columns 5" w:semiHidden="1" w:unhideWhenUsed="1"/>
-    <w:lsdException w:name="Table Grid 1" w:semiHidden="1" w:unhideWhenUsed="1"/>
-    <w:lsdException w:name="Table Grid 2" w:semiHidden="1" w:unhideWhenUsed="1"/>
-    <w:lsdException w:name="Table Grid 3" w:semiHidden="1" w:unhideWhenUsed="1"/>
-    <w:lsdException w:name="Table Grid 4" w:semiHidden="1" w:unhideWhenUsed="1"/>
-    <w:lsdException w:name="Table Grid 5" w:semiHidden="1" w:unhideWhenUsed="1"/>
-    <w:lsdException w:name="Table Grid 6" w:semiHidden="1" w:unhideWhenUsed="1"/>
-    <w:lsdException w:name="Table Grid 7" w:semiHidden="1" w:unhideWhenUsed="1"/>
-    <w:lsdException w:name="Table Grid 8" w:semiHidden="1" w:unhideWhenUsed="1"/>
-    <w:lsdException w:name="Table List 1" w:semiHidden="1" w:unhideWhenUsed="1"/>
-    <w:lsdException w:name="Table List 2" w:semiHidden="1" w:unhideWhenUsed="1"/>
-    <w:lsdException w:name="Table List 3" w:semiHidden="1" w:unhideWhenUsed="1"/>
-    <w:lsdException w:name="Table List 4" w:semiHidden="1" w:unhideWhenUsed="1"/>
-    <w:lsdException w:name="Table List 5" w:semiHidden="1" w:unhideWhenUsed="1"/>
-    <w:lsdException w:name="Table List 6" w:semiHidden="1" w:unhideWhenUsed="1"/>
-    <w:lsdException w:name="Table List 7" w:semiHidden="1" w:unhideWhenUsed="1"/>
-    <w:lsdException w:name="Table List 8" w:semiHidden="1" w:unhideWhenUsed="1"/>
-    <w:lsdException w:name="Table 3D effects 1" w:semiHidden="1" w:unhideWhenUsed="1"/>
-    <w:lsdException w:name="Table 3D effects 2" w:semiHidden="1" w:unhideWhenUsed="1"/>
-    <w:lsdException w:name="Table 3D effects 3" w:semiHidden="1" w:unhideWhenUsed="1"/>
-    <w:lsdException w:name="Table Contemporary" w:semiHidden="1" w:unhideWhenUsed="1"/>
-    <w:lsdException w:name="Table Elegant" w:semiHidden="1" w:unhideWhenUsed="1"/>
-    <w:lsdException w:name="Table Professional" w:semiHidden="1" w:unhideWhenUsed="1"/>
-    <w:lsdException w:name="Table Subtle 1" w:semiHidden="1" w:unhideWhenUsed="1"/>
-    <w:lsdException w:name="Table Subtle 2" w:semiHidden="1" w:unhideWhenUsed="1"/>
-    <w:lsdException w:name="Table Web 1" w:semiHidden="1" w:unhideWhenUsed="1"/>
-    <w:lsdException w:name="Table Web 2" w:semiHidden="1" w:unhideWhenUsed="1"/>
-    <w:lsdException w:name="Table Web 3" w:semiHidden="1" w:unhideWhenUsed="1"/>
-    <w:lsdException w:name="Balloon Text" w:semiHidden="1" w:unhideWhenUsed="1"/>
-    <w:lsdException w:name="Table Grid" w:uiPriority="39"/>
-    <w:lsdException w:name="Table Theme" w:semiHidden="1" w:unhideWhenUsed="1"/>
-    <w:lsdException w:name="Placeholder Text" w:semiHidden="1"/>
-    <w:lsdException w:name="No Spacing" w:uiPriority="1" w:qFormat="1"/>
-    <w:lsdException w:name="Light Shading" w:uiPriority="60"/>
-    <w:lsdException w:name="Light List" w:uiPriority="61"/>
-    <w:lsdException w:name="Light Grid" w:uiPriority="62"/>
-    <w:lsdException w:name="Medium Shading 1" w:uiPriority="63"/>
-    <w:lsdException w:name="Medium Shading 2" w:uiPriority="64"/>
-    <w:lsdException w:name="Medium List 1" w:uiPriority="65"/>
-    <w:lsdException w:name="Medium List 2" w:uiPriority="66"/>
-    <w:lsdException w:name="Medium Grid 1" w:uiPriority="67"/>
-    <w:lsdException w:name="Medium Grid 2" w:uiPriority="68"/>
-    <w:lsdException w:name="Medium Grid 3" w:uiPriority="69"/>
-    <w:lsdException w:name="Dark List" w:uiPriority="70"/>
-    <w:lsdException w:name="Colorful Shading" w:uiPriority="71"/>
-    <w:lsdException w:name="Colorful List" w:uiPriority="72"/>
-    <w:lsdException w:name="Colorful Grid" w:uiPriority="73"/>
-    <w:lsdException w:name="Light Shading Accent 1" w:uiPriority="60"/>
-    <w:lsdException w:name="Light List Accent 1" w:uiPriority="61"/>
-    <w:lsdException w:name="Light Grid Accent 1" w:uiPriority="62"/>
-    <w:lsdException w:name="Medium Shading 1 Accent 1" w:uiPriority="63"/>
-    <w:lsdException w:name="Medium Shading 2 Accent 1" w:uiPriority="64"/>
-    <w:lsdException w:name="Medium List 1 Accent 1" w:uiPriority="65"/>
-    <w:lsdException w:name="Revision" w:semiHidden="1"/>
-    <w:lsdException w:name="List Paragraph" w:uiPriority="34" w:qFormat="1"/>
-    <w:lsdException w:name="Quote" w:uiPriority="29" w:qFormat="1"/>
-    <w:lsdException w:name="Intense Quote" w:uiPriority="30" w:qFormat="1"/>
-    <w:lsdException w:name="Medium List 2 Accent 1" w:uiPriority="66"/>
-    <w:lsdException w:name="Medium Grid 1 Accent 1" w:uiPriority="67"/>
-    <w:lsdException w:name="Medium Grid 2 Accent 1" w:uiPriority="68"/>
-    <w:lsdException w:name="Medium Grid 3 Accent 1" w:uiPriority="69"/>
-    <w:lsdException w:name="Dark List Accent 1" w:uiPriority="70"/>
-    <w:lsdException w:name="Colorful Shading Accent 1" w:uiPriority="71"/>
-    <w:lsdException w:name="Colorful List Accent 1" w:uiPriority="72"/>
-    <w:lsdException w:name="Colorful Grid Accent 1" w:uiPriority="73"/>
-    <w:lsdException w:name="Light Shading Accent 2" w:uiPriority="60"/>
-    <w:lsdException w:name="Light List Accent 2" w:uiPriority="61"/>
-    <w:lsdException w:name="Light Grid Accent 2" w:uiPriority="62"/>
-    <w:lsdException w:name="Medium Shading 1 Accent 2" w:uiPriority="63"/>
-    <w:lsdException w:name="Medium Shading 2 Accent 2" w:uiPriority="64"/>
-    <w:lsdException w:name="Medium List 1 Accent 2" w:uiPriority="65"/>
-    <w:lsdException w:name="Medium List 2 Accent 2" w:uiPriority="66"/>
-    <w:lsdException w:name="Medium Grid 1 Accent 2" w:uiPriority="67"/>
-    <w:lsdException w:name="Medium Grid 2 Accent 2" w:uiPriority="68"/>
-    <w:lsdException w:name="Medium Grid 3 Accent 2" w:uiPriority="69"/>
-    <w:lsdException w:name="Dark List Accent 2" w:uiPriority="70"/>
-    <w:lsdException w:name="Colorful Shading Accent 2" w:uiPriority="71"/>
-    <w:lsdException w:name="Colorful List Accent 2" w:uiPriority="72"/>
-    <w:lsdException w:name="Colorful Grid Accent 2" w:uiPriority="73"/>
-    <w:lsdException w:name="Light Shading Accent 3" w:uiPriority="60"/>
-    <w:lsdException w:name="Light List Accent 3" w:uiPriority="61"/>
-    <w:lsdException w:name="Light Grid Accent 3" w:uiPriority="62"/>
-    <w:lsdException w:name="Medium Shading 1 Accent 3" w:uiPriority="63"/>
-    <w:lsdException w:name="Medium Shading 2 Accent 3" w:uiPriority="64"/>
-    <w:lsdException w:name="Medium List 1 Accent 3" w:uiPriority="65"/>
-    <w:lsdException w:name="Medium List 2 Accent 3" w:uiPriority="66"/>
-    <w:lsdException w:name="Medium Grid 1 Accent 3" w:uiPriority="67"/>
-    <w:lsdException w:name="Medium Grid 2 Accent 3" w:uiPriority="68"/>
-    <w:lsdException w:name="Medium Grid 3 Accent 3" w:uiPriority="69"/>
-    <w:lsdException w:name="Dark List Accent 3" w:uiPriority="70"/>
-    <w:lsdException w:name="Colorful Shading Accent 3" w:uiPriority="71"/>
-    <w:lsdException w:name="Colorful List Accent 3" w:uiPriority="72"/>
-    <w:lsdException w:name="Colorful Grid Accent 3" w:uiPriority="73"/>
-    <w:lsdException w:name="Light Shading Accent 4" w:uiPriority="60"/>
-    <w:lsdException w:name="Light List Accent 4" w:uiPriority="61"/>
-    <w:lsdException w:name="Light Grid Accent 4" w:uiPriority="62"/>
-    <w:lsdException w:name="Medium Shading 1 Accent 4" w:uiPriority="63"/>
-    <w:lsdException w:name="Medium Shading 2 Accent 4" w:uiPriority="64"/>
-    <w:lsdException w:name="Medium List 1 Accent 4" w:uiPriority="65"/>
-    <w:lsdException w:name="Medium List 2 Accent 4" w:uiPriority="66"/>
-    <w:lsdException w:name="Medium Grid 1 Accent 4" w:uiPriority="67"/>
-    <w:lsdException w:name="Medium Grid 2 Accent 4" w:uiPriority="68"/>
-    <w:lsdException w:name="Medium Grid 3 Accent 4" w:uiPriority="69"/>
-    <w:lsdException w:name="Dark List Accent 4" w:uiPriority="70"/>
-    <w:lsdException w:name="Colorful Shading Accent 4" w:uiPriority="71"/>
-    <w:lsdException w:name="Colorful List Accent 4" w:uiPriority="72"/>
-    <w:lsdException w:name="Colorful Grid Accent 4" w:uiPriority="73"/>
-    <w:lsdException w:name="Light Shading Accent 5" w:uiPriority="60"/>
-    <w:lsdException w:name="Light List Accent 5" w:uiPriority="61"/>
-    <w:lsdException w:name="Light Grid Accent 5" w:uiPriority="62"/>
-    <w:lsdException w:name="Medium Shading 1 Accent 5" w:uiPriority="63"/>
-    <w:lsdException w:name="Medium Shading 2 Accent 5" w:uiPriority="64"/>
-    <w:lsdException w:name="Medium List 1 Accent 5" w:uiPriority="65"/>
-    <w:lsdException w:name="Medium List 2 Accent 5" w:uiPriority="66"/>
-    <w:lsdException w:name="Medium Grid 1 Accent 5" w:uiPriority="67"/>
-    <w:lsdException w:name="Medium Grid 2 Accent 5" w:uiPriority="68"/>
-    <w:lsdException w:name="Medium Grid 3 Accent 5" w:uiPriority="69"/>
-    <w:lsdException w:name="Dark List Accent 5" w:uiPriority="70"/>
-    <w:lsdException w:name="Colorful Shading Accent 5" w:uiPriority="71"/>
-    <w:lsdException w:name="Colorful List Accent 5" w:uiPriority="72"/>
-    <w:lsdException w:name="Colorful Grid Accent 5" w:uiPriority="73"/>
-    <w:lsdException w:name="Light Shading Accent 6" w:uiPriority="60"/>
-    <w:lsdException w:name="Light List Accent 6" w:uiPriority="61"/>
-    <w:lsdException w:name="Light Grid Accent 6" w:uiPriority="62"/>
-    <w:lsdException w:name="Medium Shading 1 Accent 6" w:uiPriority="63"/>
-    <w:lsdException w:name="Medium Shading 2 Accent 6" w:uiPriority="64"/>
-    <w:lsdException w:name="Medium List 1 Accent 6" w:uiPriority="65"/>
-    <w:lsdException w:name="Medium List 2 Accent 6" w:uiPriority="66"/>
-    <w:lsdException w:name="Medium Grid 1 Accent 6" w:uiPriority="67"/>
-    <w:lsdException w:name="Medium Grid 2 Accent 6" w:uiPriority="68"/>
-    <w:lsdException w:name="Medium Grid 3 Accent 6" w:uiPriority="69"/>
-    <w:lsdException w:name="Dark List Accent 6" w:uiPriority="70"/>
-    <w:lsdException w:name="Colorful Shading Accent 6" w:uiPriority="71"/>
-    <w:lsdException w:name="Colorful List Accent 6" w:uiPriority="72"/>
-    <w:lsdException w:name="Colorful Grid Accent 6" w:uiPriority="73"/>
-    <w:lsdException w:name="Subtle Emphasis" w:uiPriority="19" w:qFormat="1"/>
-    <w:lsdException w:name="Intense Emphasis" w:uiPriority="21" w:qFormat="1"/>
-    <w:lsdException w:name="Subtle Reference" w:uiPriority="31" w:qFormat="1"/>
-    <w:lsdException w:name="Intense Reference" w:uiPriority="32" w:qFormat="1"/>
-    <w:lsdException w:name="Book Title" w:uiPriority="33" w:qFormat="1"/>
-    <w:lsdException w:name="Bibliography" w:semiHidden="1" w:uiPriority="37" w:unhideWhenUsed="1"/>
-    <w:lsdException w:name="TOC Heading" w:semiHidden="1" w:uiPriority="39" w:unhideWhenUsed="1" w:qFormat="1"/>
-    <w:lsdException w:name="Plain Table 1" w:uiPriority="41"/>
-    <w:lsdException w:name="Plain Table 2" w:uiPriority="42"/>
-    <w:lsdException w:name="Plain Table 3" w:uiPriority="43"/>
-    <w:lsdException w:name="Plain Table 4" w:uiPriority="44"/>
-    <w:lsdException w:name="Plain Table 5" w:uiPriority="45"/>
-    <w:lsdException w:name="Grid Table Light" w:uiPriority="40"/>
-    <w:lsdException w:name="Grid Table 1 Light" w:uiPriority="46"/>
-    <w:lsdException w:name="Grid Table 2" w:uiPriority="47"/>
-    <w:lsdException w:name="Grid Table 3" w:uiPriority="48"/>
-    <w:lsdException w:name="Grid Table 4" w:uiPriority="49"/>
-    <w:lsdException w:name="Grid Table 5 Dark" w:uiPriority="50"/>
-    <w:lsdException w:name="Grid Table 6 Colorful" w:uiPriority="51"/>
-    <w:lsdException w:name="Grid Table 7 Colorful" w:uiPriority="52"/>
-    <w:lsdException w:name="Grid Table 1 Light Accent 1" w:uiPriority="46"/>
-    <w:lsdException w:name="Grid Table 2 Accent 1" w:uiPriority="47"/>
-    <w:lsdException w:name="Grid Table 3 Accent 1" w:uiPriority="48"/>
-    <w:lsdException w:name="Grid Table 4 Accent 1" w:uiPriority="49"/>
-    <w:lsdException w:name="Grid Table 5 Dark Accent 1" w:uiPriority="50"/>
-    <w:lsdException w:name="Grid Table 6 Colorful Accent 1" w:uiPriority="51"/>
-    <w:lsdException w:name="Grid Table 7 Colorful Accent 1" w:uiPriority="52"/>
-    <w:lsdException w:name="Grid Table 1 Light Accent 2" w:uiPriority="46"/>
-    <w:lsdException w:name="Grid Table 2 Accent 2" w:uiPriority="47"/>
-    <w:lsdException w:name="Grid Table 3 Accent 2" w:uiPriority="48"/>
-    <w:lsdException w:name="Grid Table 4 Accent 2" w:uiPriority="49"/>
-    <w:lsdException w:name="Grid Table 5 Dark Accent 2" w:uiPriority="50"/>
-    <w:lsdException w:name="Grid Table 6 Colorful Accent 2" w:uiPriority="51"/>
-    <w:lsdException w:name="Grid Table 7 Colorful Accent 2" w:uiPriority="52"/>
-    <w:lsdException w:name="Grid Table 1 Light Accent 3" w:uiPriority="46"/>
-    <w:lsdException w:name="Grid Table 2 Accent 3" w:uiPriority="47"/>
-    <w:lsdException w:name="Grid Table 3 Accent 3" w:uiPriority="48"/>
-    <w:lsdException w:name="Grid Table 4 Accent 3" w:uiPriority="49"/>
-    <w:lsdException w:name="Grid Table 5 Dark Accent 3" w:uiPriority="50"/>
-    <w:lsdException w:name="Grid Table 6 Colorful Accent 3" w:uiPriority="51"/>
-    <w:lsdException w:name="Grid Table 7 Colorful Accent 3" w:uiPriority="52"/>
-    <w:lsdException w:name="Grid Table 1 Light Accent 4" w:uiPriority="46"/>
-    <w:lsdException w:name="Grid Table 2 Accent 4" w:uiPriority="47"/>
-    <w:lsdException w:name="Grid Table 3 Accent 4" w:uiPriority="48"/>
-    <w:lsdException w:name="Grid Table 4 Accent 4" w:uiPriority="49"/>
-    <w:lsdException w:name="Grid Table 5 Dark Accent 4" w:uiPriority="50"/>
-    <w:lsdException w:name="Grid Table 6 Colorful Accent 4" w:uiPriority="51"/>
-    <w:lsdException w:name="Grid Table 7 Colorful Accent 4" w:uiPriority="52"/>
-    <w:lsdException w:name="Grid Table 1 Light Accent 5" w:uiPriority="46"/>
-    <w:lsdException w:name="Grid Table 2 Accent 5" w:uiPriority="47"/>
-    <w:lsdException w:name="Grid Table 3 Accent 5" w:uiPriority="48"/>
-    <w:lsdException w:name="Grid Table 4 Accent 5" w:uiPriority="49"/>
-    <w:lsdException w:name="Grid Table 5 Dark Accent 5" w:uiPriority="50"/>
-    <w:lsdException w:name="Grid Table 6 Colorful Accent 5" w:uiPriority="51"/>
-    <w:lsdException w:name="Grid Table 7 Colorful Accent 5" w:uiPriority="52"/>
-    <w:lsdException w:name="Grid Table 1 Light Accent 6" w:uiPriority="46"/>
-    <w:lsdException w:name="Grid Table 2 Accent 6" w:uiPriority="47"/>
-    <w:lsdException w:name="Grid Table 3 Accent 6" w:uiPriority="48"/>
-    <w:lsdException w:name="Grid Table 4 Accent 6" w:uiPriority="49"/>
-    <w:lsdException w:name="Grid Table 5 Dark Accent 6" w:uiPriority="50"/>
-    <w:lsdException w:name="Grid Table 6 Colorful Accent 6" w:uiPriority="51"/>
-    <w:lsdException w:name="Grid Table 7 Colorful Accent 6" w:uiPriority="52"/>
-    <w:lsdException w:name="List Table 1 Light" w:uiPriority="46"/>
-    <w:lsdException w:name="List Table 2" w:uiPriority="47"/>
-    <w:lsdException w:name="List Table 3" w:uiPriority="48"/>
-    <w:lsdException w:name="List Table 4" w:uiPriority="49"/>
-    <w:lsdException w:name="List Table 5 Dark" w:uiPriority="50"/>
-    <w:lsdException w:name="List Table 6 Colorful" w:uiPriority="51"/>
-    <w:lsdException w:name="List Table 7 Colorful" w:uiPriority="52"/>
-    <w:lsdException w:name="List Table 1 Light Accent 1" w:uiPriority="46"/>
-    <w:lsdException w:name="List Table 2 Accent 1" w:uiPriority="47"/>
-    <w:lsdException w:name="List Table 3 Accent 1" w:uiPriority="48"/>
-    <w:lsdException w:name="List Table 4 Accent 1" w:uiPriority="49"/>
-    <w:lsdException w:name="List Table 5 Dark Accent 1" w:uiPriority="50"/>
-    <w:lsdException w:name="List Table 6 Colorful Accent 1" w:uiPriority="51"/>
-    <w:lsdException w:name="List Table 7 Colorful Accent 1" w:uiPriority="52"/>
-    <w:lsdException w:name="List Table 1 Light Accent 2" w:uiPriority="46"/>
-    <w:lsdException w:name="List Table 2 Accent 2" w:uiPriority="47"/>
-    <w:lsdException w:name="List Table 3 Accent 2" w:uiPriority="48"/>
-    <w:lsdException w:name="List Table 4 Accent 2" w:uiPriority="49"/>
-    <w:lsdException w:name="List Table 5 Dark Accent 2" w:uiPriority="50"/>
-    <w:lsdException w:name="List Table 6 Colorful Accent 2" w:uiPriority="51"/>
-    <w:lsdException w:name="List Table 7 Colorful Accent 2" w:uiPriority="52"/>
-    <w:lsdException w:name="List Table 1 Light Accent 3" w:uiPriority="46"/>
-    <w:lsdException w:name="List Table 2 Accent 3" w:uiPriority="47"/>
-    <w:lsdException w:name="List Table 3 Accent 3" w:uiPriority="48"/>
-    <w:lsdException w:name="List Table 4 Accent 3" w:uiPriority="49"/>
-    <w:lsdException w:name="List Table 5 Dark Accent 3" w:uiPriority="50"/>
-    <w:lsdException w:name="List Table 6 Colorful Accent 3" w:uiPriority="51"/>
-    <w:lsdException w:name="List Table 7 Colorful Accent 3" w:uiPriority="52"/>
-    <w:lsdException w:name="List Table 1 Light Accent 4" w:uiPriority="46"/>
-    <w:lsdException w:name="List Table 2 Accent 4" w:uiPriority="47"/>
-    <w:lsdException w:name="List Table 3 Accent 4" w:uiPriority="48"/>
-    <w:lsdException w:name="List Table 4 Accent 4" w:uiPriority="49"/>
-    <w:lsdException w:name="List Table 5 Dark Accent 4" w:uiPriority="50"/>
-    <w:lsdException w:name="List Table 6 Colorful Accent 4" w:uiPriority="51"/>
-    <w:lsdException w:name="List Table 7 Colorful Accent 4" w:uiPriority="52"/>
-    <w:lsdException w:name="List Table 1 Light Accent 5" w:uiPriority="46"/>
-    <w:lsdException w:name="List Table 2 Accent 5" w:uiPriority="47"/>
-    <w:lsdException w:name="List Table 3 Accent 5" w:uiPriority="48"/>
-    <w:lsdException w:name="List Table 4 Accent 5" w:uiPriority="49"/>
-    <w:lsdException w:name="List Table 5 Dark Accent 5" w:uiPriority="50"/>
-    <w:lsdException w:name="List Table 6 Colorful Accent 5" w:uiPriority="51"/>
-    <w:lsdException w:name="List Table 7 Colorful Accent 5" w:uiPriority="52"/>
-    <w:lsdException w:name="List Table 1 Light Accent 6" w:uiPriority="46"/>
-    <w:lsdException w:name="List Table 2 Accent 6" w:uiPriority="47"/>
-    <w:lsdException w:name="List Table 3 Accent 6" w:uiPriority="48"/>
-    <w:lsdException w:name="List Table 4 Accent 6" w:uiPriority="49"/>
-    <w:lsdException w:name="List Table 5 Dark Accent 6" w:uiPriority="50"/>
-    <w:lsdException w:name="List Table 6 Colorful Accent 6" w:uiPriority="51"/>
-    <w:lsdException w:name="List Table 7 Colorful Accent 6" w:uiPriority="52"/>
-  </w:latentStyles>
-  <w:style w:type="paragraph" w:default="1" w:styleId="Normal">
-    <w:name w:val="Normal"/>
-    <w:qFormat/>
-  </w:style>
-  <w:style w:type="character" w:default="1" w:styleId="DefaultParagraphFont">
-    <w:name w:val="Default Paragraph Font"/>
-    <w:uiPriority w:val="1"/>
-    <w:semiHidden/>
-    <w:unhideWhenUsed/>
-  </w:style>
-  <w:style w:type="table" w:default="1" w:styleId="TableNormal">
-    <w:name w:val="Normal Table"/>
-    <w:uiPriority w:val="99"/>
-    <w:semiHidden/>
-    <w:unhideWhenUsed/>
-    <w:tblPr>
-      <w:tblInd w:w="0" w:type="dxa"/>
-      <w:tblCellMar>
-        <w:top w:w="0" w:type="dxa"/>
-        <w:left w:w="108" w:type="dxa"/>
-        <w:bottom w:w="0" w:type="dxa"/>
-        <w:right w:w="108" w:type="dxa"/>
-      </w:tblCellMar>
-    </w:tblPr>
-  </w:style>
-  <w:style w:type="numbering" w:default="1" w:styleId="NoList">
-    <w:name w:val="No List"/>
-    <w:uiPriority w:val="99"/>
-    <w:semiHidden/>
-    <w:unhideWhenUsed/>
-  </w:style>
-  <w:style w:type="paragraph" w:customStyle="1" w:styleId="4B6D34130724468C8BD7AFA40DCF4048">
-    <w:name w:val="4B6D34130724468C8BD7AFA40DCF4048"/>
-    <w:rsid w:val="00650F46"/>
-  </w:style>
-  <w:style w:type="paragraph" w:customStyle="1" w:styleId="7D942A132EB34787A3F7A7DF3B3CBFAB">
-    <w:name w:val="7D942A132EB34787A3F7A7DF3B3CBFAB"/>
-    <w:rsid w:val="00650F46"/>
-  </w:style>
-  <w:style w:type="paragraph" w:customStyle="1" w:styleId="FF201E5FCDD5490A8EC9B43D1994F417">
-    <w:name w:val="FF201E5FCDD5490A8EC9B43D1994F417"/>
-    <w:rsid w:val="00650F46"/>
-  </w:style>
-</w:styles>
-</file>
-
-<file path=word/glossary/webSettings.xml><?xml version="1.0" encoding="utf-8"?>
-<w:webSettings xmlns:mc="http://schemas.openxmlformats.org/markup-compatibility/2006" xmlns:r="http://schemas.openxmlformats.org/officeDocument/2006/relationships" xmlns:w="http://schemas.openxmlformats.org/wordprocessingml/2006/main" xmlns:w14="http://schemas.microsoft.com/office/word/2010/wordml" xmlns:w15="http://schemas.microsoft.com/office/word/2012/wordml" xmlns:w16se="http://schemas.microsoft.com/office/word/2015/wordml/symex" mc:Ignorable="w14 w15 w16se">
-  <w:optimizeForBrowser/>
-  <w:allowPNG/>
-</w:webSettings>
 </file>
 
 <file path=word/theme/theme1.xml><?xml version="1.0" encoding="utf-8"?>

</xml_diff>